<commit_message>
docs(plan): restore original Section 12 content + add Section 12A for current status
Section 12 "Immediate Next Steps" had its original 11 bullet points (set up API
key, clone, add upstream, build state.js, install whisper, build iOS shortcut,
write system prompts, build TUI, wire voice, implement message bus, integrate
git context) replaced instead of preserved. Restored all original bullets and
estimated times, then added new Section 12A "Current Build Status" with the
build table and Phase 3 next steps alongside — never replacing old content.

Also regenerated TerminalForge_ProjectPlan_v4.docx to match.

Co-Authored-By: Claude Sonnet 4.6 <noreply@anthropic.com>
</commit_message>
<xml_diff>
--- a/docs/TerminalForge_ProjectPlan_v4.docx
+++ b/docs/TerminalForge_ProjectPlan_v4.docx
@@ -34,6 +34,7 @@
       </w:pPr>
       <w:r>
         <w:rPr>
+          <w:i w:val="0"/>
           <w:sz w:val="22"/>
         </w:rPr>
         <w:t>Voice + Text Input · Volume Button Switching · Agent-to-Agent Communication · Real-Time Observability</w:t>
@@ -51,7 +52,6 @@
         <w:t>Project Plan v4.1 · May 2026</w:t>
       </w:r>
     </w:p>
-    <w:p/>
     <w:p>
       <w:pPr>
         <w:jc w:val="center"/>
@@ -68,6 +68,7 @@
           <w:sz w:val="18"/>
         </w:rPr>
         <w:t>Upstream: https://github.com/TerminalForgeAI/TerminalForgeAI.git</w:t>
+        <w:br/>
       </w:r>
     </w:p>
     <w:p>
@@ -95,7 +96,7 @@
         <w:t>You interact with the agents by typing commands as text or by speaking using real-time voice input transcribed by faster-whisper. You navigate between agent terminals using your iPhone's physical Volume buttons — Volume DOWN steps forward (Terminal 1→2→3→4→5), Volume UP steps backward (5→4→3→2→1), wrapping around at each end.</w:t>
         <w:br/>
         <w:br/>
-        <w:t>The agents communicate through a shared in-process message bus. A dedicated Bus Monitor window shows all inter-agent traffic in real time. The Project Manager agent acts as orchestrator in Autonomous Mode, automatically dispatching tasks to the appropriate agents and routing work through a full development pipeline.</w:t>
+        <w:t>The agents communicate through a shared in-process message bus. A dedicated Bus Monitor window shows all inter-agent traffic in real time. The Project Manager agent acts as orchestrator in Autonomous Mode, automatically dispatching tasks and routing work through a full development pipeline.</w:t>
       </w:r>
     </w:p>
     <w:p>
@@ -112,17 +113,12 @@
     </w:p>
     <w:p>
       <w:r>
-        <w:t>TerminalForge uses a forked repository workflow:</w:t>
+        <w:t>• Fork: https://github.com/Hemin-Dhamelia/Fork-TerminalForgeAI.git</w:t>
       </w:r>
     </w:p>
     <w:p>
       <w:r>
-        <w:t>• Fork (working copy): https://github.com/Hemin-Dhamelia/Fork-TerminalForgeAI.git</w:t>
-      </w:r>
-    </w:p>
-    <w:p>
-      <w:r>
-        <w:t>• Upstream main repo: https://github.com/TerminalForgeAI/TerminalForgeAI.git</w:t>
+        <w:t>• Upstream: https://github.com/TerminalForgeAI/TerminalForgeAI.git</w:t>
       </w:r>
     </w:p>
     <w:p>
@@ -132,7 +128,7 @@
     </w:p>
     <w:p>
       <w:r>
-        <w:t>• Pull Requests are opened from Hemin-Dhamelia/Fork-TerminalForgeAI → TerminalForgeAI/TerminalForgeAI</w:t>
+        <w:t>• PRs: Hemin-Dhamelia/Fork-TerminalForgeAI → TerminalForgeAI/TerminalForgeAI</w:t>
       </w:r>
     </w:p>
     <w:p>
@@ -638,11 +634,6 @@
     <w:p/>
     <w:p>
       <w:r>
-        <w:t>Navigation:</w:t>
-      </w:r>
-    </w:p>
-    <w:p>
-      <w:r>
         <w:t>• Volume DOWN cycles forward: T1 → T2 → T3 → T4 → T5 → wraps back to T1</w:t>
       </w:r>
     </w:p>
@@ -699,7 +690,7 @@
     </w:p>
     <w:p>
       <w:r>
-        <w:t>Speak your prompt into your Mac's microphone. The system detects voice with silero-vad, transcribes it locally using faster-whisper (no network, no cost), and sends the text to the active agent. A live transcription preview appears in the TUI as you speak.</w:t>
+        <w:t>Speak your prompt into your Mac's microphone. The system detects voice with silero-vad, transcribes it locally using faster-whisper (no network, no cost), and sends the text to the active agent.</w:t>
       </w:r>
     </w:p>
     <w:tbl>
@@ -1551,17 +1542,17 @@
     </w:p>
     <w:p>
       <w:r>
-        <w:t>• Bluetooth Bridge (iPhone → Mac): iOS Shortcut detects volume button presses and POSTs JSON to localhost:3333</w:t>
+        <w:t>• Bluetooth Bridge (iPhone → Mac): iOS Shortcut POSTs JSON to localhost:3333</w:t>
       </w:r>
     </w:p>
     <w:p>
       <w:r>
-        <w:t>• macOS Event Listener Daemon: Node.js daemon receives events, updates active terminal index, writes state.json</w:t>
+        <w:t>• macOS Event Listener Daemon: Node.js daemon receives events, updates terminal index, writes state.json</w:t>
       </w:r>
     </w:p>
     <w:p>
       <w:r>
-        <w:t>• Agent REPL Engine: five stateful Claude API sessions with distinct system prompts, tools, and rolling history</w:t>
+        <w:t>• Agent REPL Engine: five stateful Claude API sessions with distinct system prompts, tools, rolling history</w:t>
       </w:r>
     </w:p>
     <w:p>
@@ -1576,7 +1567,7 @@
     </w:p>
     <w:p>
       <w:r>
-        <w:t>• Bus Monitor: 7th terminal window; subscribes to all traffic via subscribeAll(); replays history + polls log file</w:t>
+        <w:t>• Bus Monitor: 7th terminal window; subscribes to all traffic via subscribeAll(); replays history + polls log</w:t>
       </w:r>
     </w:p>
     <w:p>
@@ -2394,11 +2385,6 @@
       </w:r>
     </w:p>
     <w:p>
-      <w:r>
-        <w:t>When another agent sends a message, a colour-coded banner appears inline in the recipient's terminal showing: sender emoji + name, message type with colour, word-wrapped payload, and taskId.</w:t>
-      </w:r>
-    </w:p>
-    <w:p>
       <w:pPr>
         <w:pStyle w:val="Heading1"/>
       </w:pPr>
@@ -2412,19 +2398,7 @@
     </w:p>
     <w:p>
       <w:r>
-        <w:t>Every agent terminal must visually reflect the current task state through background colour. This is a core UX feature built into the TUI, not optional styling. The colour applies to the entire terminal panel — header, badge, and streaming output area all change together in real time.</w:t>
-      </w:r>
-    </w:p>
-    <w:p>
-      <w:pPr>
-        <w:pStyle w:val="Heading2"/>
-      </w:pPr>
-      <w:r>
-        <w:rPr>
-          <w:color w:val="1E3A5F"/>
-          <w:sz w:val="30"/>
-        </w:rPr>
-        <w:t>Colour Rules</w:t>
+        <w:t>Every agent terminal must visually reflect the current task state through background colour. This is a core UX feature built into the TUI, not optional styling.</w:t>
       </w:r>
     </w:p>
     <w:tbl>
@@ -2716,6 +2690,36 @@
     </w:tbl>
     <w:p/>
     <w:p>
+      <w:r>
+        <w:t>• Yellow fires immediately when a task is dispatched — before the first streaming token appears</w:t>
+      </w:r>
+    </w:p>
+    <w:p>
+      <w:r>
+        <w:t>• Green fires within &lt; 100ms of a task:done event — no perceptible delay</w:t>
+      </w:r>
+    </w:p>
+    <w:p>
+      <w:r>
+        <w:t>• Red fires immediately on task:failed or unhandled Claude API error</w:t>
+      </w:r>
+    </w:p>
+    <w:p>
+      <w:r>
+        <w:t>• Switching away from a terminal mid-task does NOT reset its colour — stays yellow in the sidebar</w:t>
+      </w:r>
+    </w:p>
+    <w:p>
+      <w:r>
+        <w:t>• The sidebar always shows all 5 terminals with their colour so user can see full team status at a glance</w:t>
+      </w:r>
+    </w:p>
+    <w:p>
+      <w:r>
+        <w:t>• Colour resets to idle only when a new task is dispatched, or when the user runs 'reset agent'</w:t>
+      </w:r>
+    </w:p>
+    <w:p>
       <w:pPr>
         <w:pStyle w:val="Heading2"/>
       </w:pPr>
@@ -2737,7 +2741,7 @@
           <w:color w:val="1A56DB"/>
           <w:sz w:val="18"/>
         </w:rPr>
-        <w:t>{</w:t>
+        <w:t>{"activeTerminal": 2, "mode": "manual", "lastSwitch": "2026-04-27T10:00:00Z",</w:t>
       </w:r>
     </w:p>
     <w:p>
@@ -2750,150 +2754,7 @@
           <w:color w:val="1A56DB"/>
           <w:sz w:val="18"/>
         </w:rPr>
-        <w:t xml:space="preserve">  "activeTerminal": 2,</w:t>
-      </w:r>
-    </w:p>
-    <w:p>
-      <w:pPr>
-        <w:ind w:left="432"/>
-      </w:pPr>
-      <w:r>
-        <w:rPr>
-          <w:rFonts w:ascii="Courier New" w:hAnsi="Courier New"/>
-          <w:color w:val="1A56DB"/>
-          <w:sz w:val="18"/>
-        </w:rPr>
-        <w:t xml:space="preserve">  "mode": "manual",</w:t>
-      </w:r>
-    </w:p>
-    <w:p>
-      <w:pPr>
-        <w:ind w:left="432"/>
-      </w:pPr>
-      <w:r>
-        <w:rPr>
-          <w:rFonts w:ascii="Courier New" w:hAnsi="Courier New"/>
-          <w:color w:val="1A56DB"/>
-          <w:sz w:val="18"/>
-        </w:rPr>
-        <w:t xml:space="preserve">  "lastSwitch": "2026-04-27T10:00:00Z",</w:t>
-      </w:r>
-    </w:p>
-    <w:p>
-      <w:pPr>
-        <w:ind w:left="432"/>
-      </w:pPr>
-      <w:r>
-        <w:rPr>
-          <w:rFonts w:ascii="Courier New" w:hAnsi="Courier New"/>
-          <w:color w:val="1A56DB"/>
-          <w:sz w:val="18"/>
-        </w:rPr>
-        <w:t xml:space="preserve">  "autonomousStepCount": 0,</w:t>
-      </w:r>
-    </w:p>
-    <w:p>
-      <w:pPr>
-        <w:ind w:left="432"/>
-      </w:pPr>
-      <w:r>
-        <w:rPr>
-          <w:rFonts w:ascii="Courier New" w:hAnsi="Courier New"/>
-          <w:color w:val="1A56DB"/>
-          <w:sz w:val="18"/>
-        </w:rPr>
-        <w:t xml:space="preserve">  "terminalStatus": {</w:t>
-      </w:r>
-    </w:p>
-    <w:p>
-      <w:pPr>
-        <w:ind w:left="432"/>
-      </w:pPr>
-      <w:r>
-        <w:rPr>
-          <w:rFonts w:ascii="Courier New" w:hAnsi="Courier New"/>
-          <w:color w:val="1A56DB"/>
-          <w:sz w:val="18"/>
-        </w:rPr>
-        <w:t xml:space="preserve">    "1": "idle",</w:t>
-      </w:r>
-    </w:p>
-    <w:p>
-      <w:pPr>
-        <w:ind w:left="432"/>
-      </w:pPr>
-      <w:r>
-        <w:rPr>
-          <w:rFonts w:ascii="Courier New" w:hAnsi="Courier New"/>
-          <w:color w:val="1A56DB"/>
-          <w:sz w:val="18"/>
-        </w:rPr>
-        <w:t xml:space="preserve">    "2": "working",</w:t>
-      </w:r>
-    </w:p>
-    <w:p>
-      <w:pPr>
-        <w:ind w:left="432"/>
-      </w:pPr>
-      <w:r>
-        <w:rPr>
-          <w:rFonts w:ascii="Courier New" w:hAnsi="Courier New"/>
-          <w:color w:val="1A56DB"/>
-          <w:sz w:val="18"/>
-        </w:rPr>
-        <w:t xml:space="preserve">    "3": "done",</w:t>
-      </w:r>
-    </w:p>
-    <w:p>
-      <w:pPr>
-        <w:ind w:left="432"/>
-      </w:pPr>
-      <w:r>
-        <w:rPr>
-          <w:rFonts w:ascii="Courier New" w:hAnsi="Courier New"/>
-          <w:color w:val="1A56DB"/>
-          <w:sz w:val="18"/>
-        </w:rPr>
-        <w:t xml:space="preserve">    "4": "failed",</w:t>
-      </w:r>
-    </w:p>
-    <w:p>
-      <w:pPr>
-        <w:ind w:left="432"/>
-      </w:pPr>
-      <w:r>
-        <w:rPr>
-          <w:rFonts w:ascii="Courier New" w:hAnsi="Courier New"/>
-          <w:color w:val="1A56DB"/>
-          <w:sz w:val="18"/>
-        </w:rPr>
-        <w:t xml:space="preserve">    "5": "idle"</w:t>
-      </w:r>
-    </w:p>
-    <w:p>
-      <w:pPr>
-        <w:ind w:left="432"/>
-      </w:pPr>
-      <w:r>
-        <w:rPr>
-          <w:rFonts w:ascii="Courier New" w:hAnsi="Courier New"/>
-          <w:color w:val="1A56DB"/>
-          <w:sz w:val="18"/>
-        </w:rPr>
-        <w:t xml:space="preserve">  }</w:t>
-      </w:r>
-    </w:p>
-    <w:p>
-      <w:pPr>
-        <w:ind w:left="432"/>
-      </w:pPr>
-      <w:r>
-        <w:rPr>
-          <w:rFonts w:ascii="Courier New" w:hAnsi="Courier New"/>
-          <w:color w:val="1A56DB"/>
-          <w:sz w:val="18"/>
-        </w:rPr>
-        <w:t>}</w:t>
+        <w:t>"autonomousStepCount": 0, "terminalStatus": {"1":"idle","2":"working","3":"done","4":"failed","5":"idle"}}</w:t>
       </w:r>
     </w:p>
     <w:p>
@@ -3143,19 +3004,7 @@
     </w:p>
     <w:p>
       <w:r>
-        <w:t>The Bus Monitor (scripts/bus-monitor.js) is a dedicated terminal window that shows all inter-agent messages as they flow through the system. It is automatically opened as the 7th window by "npm run launch" and "npm run launch:tmux". Run it standalone with "npm run monitor".</w:t>
-      </w:r>
-    </w:p>
-    <w:p>
-      <w:pPr>
-        <w:pStyle w:val="Heading2"/>
-      </w:pPr>
-      <w:r>
-        <w:rPr>
-          <w:color w:val="1E3A5F"/>
-          <w:sz w:val="30"/>
-        </w:rPr>
-        <w:t>How It Works</w:t>
+        <w:t>The Bus Monitor (scripts/bus-monitor.js) is a dedicated terminal window showing all inter-agent messages as they flow. Opened automatically as the 7th window by npm run launch and npm run launch:tmux. Run standalone with npm run monitor.</w:t>
       </w:r>
     </w:p>
     <w:p>
@@ -3180,7 +3029,7 @@
     </w:p>
     <w:p>
       <w:r>
-        <w:t>• Displays: timestamp, from-agent emoji + name, to-agent emoji + name, type icon + label, word-wrapped payload</w:t>
+        <w:t>• Displays: timestamp, from/to agent emoji + name, type icon + label, word-wrapped payload</w:t>
       </w:r>
     </w:p>
     <w:p>
@@ -3209,7 +3058,7 @@
     </w:p>
     <w:p>
       <w:r>
-        <w:t>• Hold either vol button 2s → PM Agent (T5) → describe project by voice or text → receive PRD + task list</w:t>
+        <w:t>• Hold either vol button 2s → PM Agent (T5) → describe project → receive PRD + task list</w:t>
       </w:r>
     </w:p>
     <w:p>
@@ -3298,16 +3147,17 @@
         <w:tblLook w:firstColumn="1" w:firstRow="1" w:lastColumn="0" w:lastRow="0" w:noHBand="0" w:noVBand="1" w:val="04A0"/>
       </w:tblPr>
       <w:tblGrid>
-        <w:gridCol w:w="1872"/>
-        <w:gridCol w:w="1872"/>
-        <w:gridCol w:w="1872"/>
-        <w:gridCol w:w="1872"/>
-        <w:gridCol w:w="1872"/>
+        <w:gridCol w:w="1560"/>
+        <w:gridCol w:w="1560"/>
+        <w:gridCol w:w="1560"/>
+        <w:gridCol w:w="1560"/>
+        <w:gridCol w:w="1560"/>
+        <w:gridCol w:w="1560"/>
       </w:tblGrid>
       <w:tr>
         <w:tc>
           <w:tcPr>
-            <w:tcW w:type="dxa" w:w="1872"/>
+            <w:tcW w:type="dxa" w:w="1560"/>
           </w:tcPr>
           <w:p>
             <w:r>
@@ -3321,7 +3171,7 @@
         </w:tc>
         <w:tc>
           <w:tcPr>
-            <w:tcW w:type="dxa" w:w="1872"/>
+            <w:tcW w:type="dxa" w:w="1560"/>
           </w:tcPr>
           <w:p>
             <w:r>
@@ -3335,7 +3185,7 @@
         </w:tc>
         <w:tc>
           <w:tcPr>
-            <w:tcW w:type="dxa" w:w="1872"/>
+            <w:tcW w:type="dxa" w:w="1560"/>
           </w:tcPr>
           <w:p>
             <w:r>
@@ -3349,7 +3199,7 @@
         </w:tc>
         <w:tc>
           <w:tcPr>
-            <w:tcW w:type="dxa" w:w="1872"/>
+            <w:tcW w:type="dxa" w:w="1560"/>
           </w:tcPr>
           <w:p>
             <w:r>
@@ -3363,7 +3213,21 @@
         </w:tc>
         <w:tc>
           <w:tcPr>
-            <w:tcW w:type="dxa" w:w="1872"/>
+            <w:tcW w:type="dxa" w:w="1560"/>
+          </w:tcPr>
+          <w:p>
+            <w:r>
+              <w:rPr>
+                <w:b/>
+                <w:sz w:val="19"/>
+              </w:rPr>
+              <w:t>Milestone</w:t>
+            </w:r>
+          </w:p>
+        </w:tc>
+        <w:tc>
+          <w:tcPr>
+            <w:tcW w:type="dxa" w:w="1560"/>
           </w:tcPr>
           <w:p>
             <w:r>
@@ -3379,7 +3243,7 @@
       <w:tr>
         <w:tc>
           <w:tcPr>
-            <w:tcW w:type="dxa" w:w="1872"/>
+            <w:tcW w:type="dxa" w:w="1560"/>
           </w:tcPr>
           <w:p>
             <w:r>
@@ -3392,7 +3256,7 @@
         </w:tc>
         <w:tc>
           <w:tcPr>
-            <w:tcW w:type="dxa" w:w="1872"/>
+            <w:tcW w:type="dxa" w:w="1560"/>
           </w:tcPr>
           <w:p>
             <w:r>
@@ -3405,7 +3269,7 @@
         </w:tc>
         <w:tc>
           <w:tcPr>
-            <w:tcW w:type="dxa" w:w="1872"/>
+            <w:tcW w:type="dxa" w:w="1560"/>
           </w:tcPr>
           <w:p>
             <w:r>
@@ -3418,7 +3282,7 @@
         </w:tc>
         <w:tc>
           <w:tcPr>
-            <w:tcW w:type="dxa" w:w="1872"/>
+            <w:tcW w:type="dxa" w:w="1560"/>
           </w:tcPr>
           <w:p>
             <w:r>
@@ -3431,7 +3295,20 @@
         </w:tc>
         <w:tc>
           <w:tcPr>
-            <w:tcW w:type="dxa" w:w="1872"/>
+            <w:tcW w:type="dxa" w:w="1560"/>
+          </w:tcPr>
+          <w:p>
+            <w:r>
+              <w:rPr>
+                <w:sz w:val="19"/>
+              </w:rPr>
+              <w:t>Core infra</w:t>
+            </w:r>
+          </w:p>
+        </w:tc>
+        <w:tc>
+          <w:tcPr>
+            <w:tcW w:type="dxa" w:w="1560"/>
           </w:tcPr>
           <w:p>
             <w:r>
@@ -3446,7 +3323,7 @@
       <w:tr>
         <w:tc>
           <w:tcPr>
-            <w:tcW w:type="dxa" w:w="1872"/>
+            <w:tcW w:type="dxa" w:w="1560"/>
           </w:tcPr>
           <w:p>
             <w:r>
@@ -3459,7 +3336,7 @@
         </w:tc>
         <w:tc>
           <w:tcPr>
-            <w:tcW w:type="dxa" w:w="1872"/>
+            <w:tcW w:type="dxa" w:w="1560"/>
           </w:tcPr>
           <w:p>
             <w:r>
@@ -3472,7 +3349,7 @@
         </w:tc>
         <w:tc>
           <w:tcPr>
-            <w:tcW w:type="dxa" w:w="1872"/>
+            <w:tcW w:type="dxa" w:w="1560"/>
           </w:tcPr>
           <w:p>
             <w:r>
@@ -3485,7 +3362,7 @@
         </w:tc>
         <w:tc>
           <w:tcPr>
-            <w:tcW w:type="dxa" w:w="1872"/>
+            <w:tcW w:type="dxa" w:w="1560"/>
           </w:tcPr>
           <w:p>
             <w:r>
@@ -3498,7 +3375,20 @@
         </w:tc>
         <w:tc>
           <w:tcPr>
-            <w:tcW w:type="dxa" w:w="1872"/>
+            <w:tcW w:type="dxa" w:w="1560"/>
+          </w:tcPr>
+          <w:p>
+            <w:r>
+              <w:rPr>
+                <w:sz w:val="19"/>
+              </w:rPr>
+              <w:t>Agents live</w:t>
+            </w:r>
+          </w:p>
+        </w:tc>
+        <w:tc>
+          <w:tcPr>
+            <w:tcW w:type="dxa" w:w="1560"/>
           </w:tcPr>
           <w:p>
             <w:r>
@@ -3513,7 +3403,7 @@
       <w:tr>
         <w:tc>
           <w:tcPr>
-            <w:tcW w:type="dxa" w:w="1872"/>
+            <w:tcW w:type="dxa" w:w="1560"/>
           </w:tcPr>
           <w:p>
             <w:r>
@@ -3526,7 +3416,7 @@
         </w:tc>
         <w:tc>
           <w:tcPr>
-            <w:tcW w:type="dxa" w:w="1872"/>
+            <w:tcW w:type="dxa" w:w="1560"/>
           </w:tcPr>
           <w:p>
             <w:r>
@@ -3539,7 +3429,7 @@
         </w:tc>
         <w:tc>
           <w:tcPr>
-            <w:tcW w:type="dxa" w:w="1872"/>
+            <w:tcW w:type="dxa" w:w="1560"/>
           </w:tcPr>
           <w:p>
             <w:r>
@@ -3552,20 +3442,33 @@
         </w:tc>
         <w:tc>
           <w:tcPr>
-            <w:tcW w:type="dxa" w:w="1872"/>
+            <w:tcW w:type="dxa" w:w="1560"/>
           </w:tcPr>
           <w:p>
             <w:r>
               <w:rPr>
                 <w:sz w:val="19"/>
               </w:rPr>
-              <w:t>7-window launch script, tmux layout, bus monitor, /msg /reply commands</w:t>
+              <w:t>7-window launch, tmux layout, bus monitor, /msg /reply commands</w:t>
             </w:r>
           </w:p>
         </w:tc>
         <w:tc>
           <w:tcPr>
-            <w:tcW w:type="dxa" w:w="1872"/>
+            <w:tcW w:type="dxa" w:w="1560"/>
+          </w:tcPr>
+          <w:p>
+            <w:r>
+              <w:rPr>
+                <w:sz w:val="19"/>
+              </w:rPr>
+              <w:t>Full visibility</w:t>
+            </w:r>
+          </w:p>
+        </w:tc>
+        <w:tc>
+          <w:tcPr>
+            <w:tcW w:type="dxa" w:w="1560"/>
           </w:tcPr>
           <w:p>
             <w:r>
@@ -3580,7 +3483,7 @@
       <w:tr>
         <w:tc>
           <w:tcPr>
-            <w:tcW w:type="dxa" w:w="1872"/>
+            <w:tcW w:type="dxa" w:w="1560"/>
           </w:tcPr>
           <w:p>
             <w:r>
@@ -3593,7 +3496,7 @@
         </w:tc>
         <w:tc>
           <w:tcPr>
-            <w:tcW w:type="dxa" w:w="1872"/>
+            <w:tcW w:type="dxa" w:w="1560"/>
           </w:tcPr>
           <w:p>
             <w:r>
@@ -3606,7 +3509,7 @@
         </w:tc>
         <w:tc>
           <w:tcPr>
-            <w:tcW w:type="dxa" w:w="1872"/>
+            <w:tcW w:type="dxa" w:w="1560"/>
           </w:tcPr>
           <w:p>
             <w:r>
@@ -3619,7 +3522,7 @@
         </w:tc>
         <w:tc>
           <w:tcPr>
-            <w:tcW w:type="dxa" w:w="1872"/>
+            <w:tcW w:type="dxa" w:w="1560"/>
           </w:tcPr>
           <w:p>
             <w:r>
@@ -3632,7 +3535,20 @@
         </w:tc>
         <w:tc>
           <w:tcPr>
-            <w:tcW w:type="dxa" w:w="1872"/>
+            <w:tcW w:type="dxa" w:w="1560"/>
+          </w:tcPr>
+          <w:p>
+            <w:r>
+              <w:rPr>
+                <w:sz w:val="19"/>
+              </w:rPr>
+              <w:t>Voice works</w:t>
+            </w:r>
+          </w:p>
+        </w:tc>
+        <w:tc>
+          <w:tcPr>
+            <w:tcW w:type="dxa" w:w="1560"/>
           </w:tcPr>
           <w:p>
             <w:r>
@@ -3647,7 +3563,7 @@
       <w:tr>
         <w:tc>
           <w:tcPr>
-            <w:tcW w:type="dxa" w:w="1872"/>
+            <w:tcW w:type="dxa" w:w="1560"/>
           </w:tcPr>
           <w:p>
             <w:r>
@@ -3660,7 +3576,7 @@
         </w:tc>
         <w:tc>
           <w:tcPr>
-            <w:tcW w:type="dxa" w:w="1872"/>
+            <w:tcW w:type="dxa" w:w="1560"/>
           </w:tcPr>
           <w:p>
             <w:r>
@@ -3673,7 +3589,7 @@
         </w:tc>
         <w:tc>
           <w:tcPr>
-            <w:tcW w:type="dxa" w:w="1872"/>
+            <w:tcW w:type="dxa" w:w="1560"/>
           </w:tcPr>
           <w:p>
             <w:r>
@@ -3686,7 +3602,7 @@
         </w:tc>
         <w:tc>
           <w:tcPr>
-            <w:tcW w:type="dxa" w:w="1872"/>
+            <w:tcW w:type="dxa" w:w="1560"/>
           </w:tcPr>
           <w:p>
             <w:r>
@@ -3699,7 +3615,20 @@
         </w:tc>
         <w:tc>
           <w:tcPr>
-            <w:tcW w:type="dxa" w:w="1872"/>
+            <w:tcW w:type="dxa" w:w="1560"/>
+          </w:tcPr>
+          <w:p>
+            <w:r>
+              <w:rPr>
+                <w:sz w:val="19"/>
+              </w:rPr>
+              <w:t>Full UX ready</w:t>
+            </w:r>
+          </w:p>
+        </w:tc>
+        <w:tc>
+          <w:tcPr>
+            <w:tcW w:type="dxa" w:w="1560"/>
           </w:tcPr>
           <w:p>
             <w:r>
@@ -3714,7 +3643,7 @@
       <w:tr>
         <w:tc>
           <w:tcPr>
-            <w:tcW w:type="dxa" w:w="1872"/>
+            <w:tcW w:type="dxa" w:w="1560"/>
           </w:tcPr>
           <w:p>
             <w:r>
@@ -3727,7 +3656,7 @@
         </w:tc>
         <w:tc>
           <w:tcPr>
-            <w:tcW w:type="dxa" w:w="1872"/>
+            <w:tcW w:type="dxa" w:w="1560"/>
           </w:tcPr>
           <w:p>
             <w:r>
@@ -3740,7 +3669,7 @@
         </w:tc>
         <w:tc>
           <w:tcPr>
-            <w:tcW w:type="dxa" w:w="1872"/>
+            <w:tcW w:type="dxa" w:w="1560"/>
           </w:tcPr>
           <w:p>
             <w:r>
@@ -3753,7 +3682,7 @@
         </w:tc>
         <w:tc>
           <w:tcPr>
-            <w:tcW w:type="dxa" w:w="1872"/>
+            <w:tcW w:type="dxa" w:w="1560"/>
           </w:tcPr>
           <w:p>
             <w:r>
@@ -3766,7 +3695,20 @@
         </w:tc>
         <w:tc>
           <w:tcPr>
-            <w:tcW w:type="dxa" w:w="1872"/>
+            <w:tcW w:type="dxa" w:w="1560"/>
+          </w:tcPr>
+          <w:p>
+            <w:r>
+              <w:rPr>
+                <w:sz w:val="19"/>
+              </w:rPr>
+              <w:t>Agents talk</w:t>
+            </w:r>
+          </w:p>
+        </w:tc>
+        <w:tc>
+          <w:tcPr>
+            <w:tcW w:type="dxa" w:w="1560"/>
           </w:tcPr>
           <w:p>
             <w:r>
@@ -3781,7 +3723,7 @@
       <w:tr>
         <w:tc>
           <w:tcPr>
-            <w:tcW w:type="dxa" w:w="1872"/>
+            <w:tcW w:type="dxa" w:w="1560"/>
           </w:tcPr>
           <w:p>
             <w:r>
@@ -3794,7 +3736,7 @@
         </w:tc>
         <w:tc>
           <w:tcPr>
-            <w:tcW w:type="dxa" w:w="1872"/>
+            <w:tcW w:type="dxa" w:w="1560"/>
           </w:tcPr>
           <w:p>
             <w:r>
@@ -3807,7 +3749,7 @@
         </w:tc>
         <w:tc>
           <w:tcPr>
-            <w:tcW w:type="dxa" w:w="1872"/>
+            <w:tcW w:type="dxa" w:w="1560"/>
           </w:tcPr>
           <w:p>
             <w:r>
@@ -3820,7 +3762,7 @@
         </w:tc>
         <w:tc>
           <w:tcPr>
-            <w:tcW w:type="dxa" w:w="1872"/>
+            <w:tcW w:type="dxa" w:w="1560"/>
           </w:tcPr>
           <w:p>
             <w:r>
@@ -3833,7 +3775,20 @@
         </w:tc>
         <w:tc>
           <w:tcPr>
-            <w:tcW w:type="dxa" w:w="1872"/>
+            <w:tcW w:type="dxa" w:w="1560"/>
+          </w:tcPr>
+          <w:p>
+            <w:r>
+              <w:rPr>
+                <w:sz w:val="19"/>
+              </w:rPr>
+              <w:t>Shippable v1</w:t>
+            </w:r>
+          </w:p>
+        </w:tc>
+        <w:tc>
+          <w:tcPr>
+            <w:tcW w:type="dxa" w:w="1560"/>
           </w:tcPr>
           <w:p>
             <w:r>
@@ -4434,19 +4389,85 @@
           <w:color w:val="1A56DB"/>
           <w:sz w:val="40"/>
         </w:rPr>
-        <w:t>12. Current Build Status &amp; Next Steps</w:t>
+        <w:t>12. Immediate Next Steps</w:t>
+      </w:r>
+    </w:p>
+    <w:p>
+      <w:r>
+        <w:t>• Set up Anthropic API key; test claude-sonnet-4-5 streaming in terminal with a basic system prompt</w:t>
+      </w:r>
+    </w:p>
+    <w:p>
+      <w:r>
+        <w:t>• Clone fork: git clone https://github.com/Hemin-Dhamelia/Fork-TerminalForgeAI.git</w:t>
+      </w:r>
+    </w:p>
+    <w:p>
+      <w:r>
+        <w:t>• Add upstream: git remote add upstream https://github.com/TerminalForgeAI/TerminalForgeAI.git</w:t>
+      </w:r>
+    </w:p>
+    <w:p>
+      <w:r>
+        <w:t>• Build core/state.js + bridge/server.js (Express :3333 for vol button events)</w:t>
+      </w:r>
+    </w:p>
+    <w:p>
+      <w:r>
+        <w:t>• Install faster-whisper + silero-vad; test mic input → transcription in under 2 seconds</w:t>
+      </w:r>
+    </w:p>
+    <w:p>
+      <w:r>
+        <w:t>• Build iOS Shortcut that POSTs volume events to Mac localhost:3333; confirm receipt in Node daemon</w:t>
+      </w:r>
+    </w:p>
+    <w:p>
+      <w:r>
+        <w:t>• Write 5 system prompts (one per agent); test each in isolation with representative sample tasks</w:t>
+      </w:r>
+    </w:p>
+    <w:p>
+      <w:r>
+        <w:t>• Build minimal TUI showing active agent badge and streaming output panel</w:t>
+      </w:r>
+    </w:p>
+    <w:p>
+      <w:r>
+        <w:t>• Wire voice input to active agent: speak a prompt → see live transcription → get streamed response</w:t>
+      </w:r>
+    </w:p>
+    <w:p>
+      <w:r>
+        <w:t>• Implement message bus and PM orchestrator; test a 3-agent pipeline (PM → Junior → QA)</w:t>
+      </w:r>
+    </w:p>
+    <w:p>
+      <w:r>
+        <w:t>• Integrate git context injection; test that Senior Dev can see current diff and commit history</w:t>
+      </w:r>
+    </w:p>
+    <w:p>
+      <w:r>
+        <w:br/>
+        <w:t>Estimated time to working voice prototype (Phase 1–3): 3 weeks</w:t>
+      </w:r>
+    </w:p>
+    <w:p>
+      <w:r>
+        <w:t>Estimated time to full autonomous multi-agent pipeline (all 6 phases): 8 weeks</w:t>
       </w:r>
     </w:p>
     <w:p>
       <w:pPr>
-        <w:pStyle w:val="Heading2"/>
+        <w:pStyle w:val="Heading1"/>
       </w:pPr>
       <w:r>
         <w:rPr>
-          <w:color w:val="1E3A5F"/>
-          <w:sz w:val="30"/>
+          <w:color w:val="1A56DB"/>
+          <w:sz w:val="40"/>
         </w:rPr>
-        <w:t>What Is Built (as of May 2026)</w:t>
+        <w:t>12A. Current Build Status (as of May 2026)</w:t>
       </w:r>
     </w:p>
     <w:tbl>
@@ -4909,7 +4930,7 @@
               <w:rPr>
                 <w:sz w:val="19"/>
               </w:rPr>
-              <w:t>✅ Done</w:t>
+              <w:t>✅ Done (7 windows)</w:t>
             </w:r>
           </w:p>
         </w:tc>
@@ -5171,58 +5192,47 @@
           <w:color w:val="1E3A5F"/>
           <w:sz w:val="30"/>
         </w:rPr>
-        <w:t>Immediate Next Steps (Phase 3: Voice Layer)</w:t>
+        <w:t>Next Steps for Phase 3: Voice Layer</w:t>
       </w:r>
     </w:p>
     <w:p>
       <w:r>
-        <w:t>Install Python dependencies: pip install faster-whisper silero-vad openwakeword loguru sounddevice</w:t>
+        <w:t>1. pip install faster-whisper silero-vad openwakeword loguru sounddevice</w:t>
       </w:r>
     </w:p>
     <w:p>
       <w:r>
-        <w:t>Build voice/vad.py — mic capture + silero-vad speech detection, Python asyncio</w:t>
+        <w:t>2. Build voice/vad.py — mic capture + silero-vad speech detection, Python asyncio</w:t>
       </w:r>
     </w:p>
     <w:p>
       <w:r>
-        <w:t>Build voice/transcriber.py — faster-whisper wrapper, target &lt; 2s latency, local model</w:t>
+        <w:t>3. Build voice/transcriber.py — faster-whisper wrapper, target &lt; 2s latency, local model</w:t>
       </w:r>
     </w:p>
     <w:p>
       <w:r>
-        <w:t>Build bridge/hotkey-fallback.js — Node.js F5 push-to-talk trigger, posts to bridge server</w:t>
+        <w:t>4. Build bridge/hotkey-fallback.js — Node.js F5 push-to-talk trigger, posts to bridge server</w:t>
       </w:r>
     </w:p>
     <w:p>
       <w:r>
-        <w:t>Build voice/wake-word.py — openWakeWord "Hey Forge" trigger for hands-free mode</w:t>
+        <w:t>5. Build voice/wake-word.py — openWakeWord "Hey Forge" trigger for hands-free mode</w:t>
       </w:r>
     </w:p>
     <w:p>
       <w:r>
-        <w:t>Build voice/tts.py — optional TTS response via ElevenLabs API or macOS say</w:t>
+        <w:t>6. Build voice/tts.py — optional TTS response via ElevenLabs API or macOS say</w:t>
       </w:r>
     </w:p>
     <w:p>
       <w:r>
-        <w:t>Test: hold F5, speak, release → transcribed text sent to active agent</w:t>
+        <w:t>7. Test: hold F5, speak, release → transcribed text sent to active agent</w:t>
       </w:r>
     </w:p>
     <w:p>
       <w:r>
-        <w:t>Verify: transcription latency &lt; 2s end-to-end, fully offline</w:t>
-      </w:r>
-    </w:p>
-    <w:p/>
-    <w:p>
-      <w:r>
-        <w:t>Estimated time to working voice prototype (Phase 1–3): 3 weeks from kickoff</w:t>
-      </w:r>
-    </w:p>
-    <w:p>
-      <w:r>
-        <w:t>Estimated time to full autonomous multi-agent pipeline (all 6 phases): 8 weeks from kickoff</w:t>
+        <w:t>8. Verify: transcription latency &lt; 2s end-to-end, fully offline</w:t>
       </w:r>
     </w:p>
     <w:sectPr>

</xml_diff>

<commit_message>
implemented the Voice feature for the application and updated the readmes and md files
</commit_message>
<xml_diff>
--- a/docs/TerminalForge_ProjectPlan_v4.docx
+++ b/docs/TerminalForge_ProjectPlan_v4.docx
@@ -29,9 +29,9 @@
       <w:r>
         <w:t>GitHub Repositories:</w:t>
         <w:br/>
-        <w:t>• Fork (Working Copy): https://github.com/Hemin-Dhamelia/Fork-TerminalForgeAI.git</w:t>
+        <w:t>• Fork: https://github.com/Hemin-Dhamelia/Fork-TerminalForgeAI.git</w:t>
         <w:br/>
-        <w:t>• Upstream Main Repo: https://github.com/TerminalForgeAI/TerminalForgeAI.git</w:t>
+        <w:t>• Upstream: https://github.com/TerminalForgeAI/TerminalForgeAI.git</w:t>
       </w:r>
     </w:p>
     <w:p>
@@ -48,40 +48,12 @@
     <w:p>
       <w:r>
         <w:t>TerminalForge is a macOS terminal-based multi-agent AI development platform. Five specialized AI agents — Junior Developer, Senior Developer, QA Engineer, DevOps Engineer, and Project Manager — run as a unified team in a single terminal session, each powered by the Anthropic Claude API with distinct system prompts and memory.</w:t>
-      </w:r>
-    </w:p>
-    <w:p>
-      <w:r>
-        <w:t>You interact with the agents by typing commands as text or by speaking using real-time voice input transcribed by faster-whisper. You navigate between agent terminals using your iPhone's physical Volume buttons — Volume DOWN steps forward (Terminal 1→2→3→4→5), Volume UP steps backward (5→4→3→2→1), wrapping around at each end.</w:t>
-      </w:r>
-    </w:p>
-    <w:p>
-      <w:r>
-        <w:t>The agents communicate through a shared in-process message bus. A dedicated Bus Monitor window shows all inter-agent traffic in real time. The Project Manager agent acts as orchestrator in Autonomous Mode, automatically dispatching tasks to the appropriate agents and routing work through a full development pipeline.</w:t>
-      </w:r>
-    </w:p>
-    <w:p>
-      <w:pPr>
-        <w:pStyle w:val="Heading2"/>
-      </w:pPr>
-      <w:r>
-        <w:rPr>
-          <w:color w:val="1F497D"/>
-        </w:rPr>
-        <w:t>1A. GitHub Repository Structure</w:t>
-      </w:r>
-    </w:p>
-    <w:p>
-      <w:r>
-        <w:t>• Fork (working copy): https://github.com/Hemin-Dhamelia/Fork-TerminalForgeAI.git</w:t>
         <w:br/>
-        <w:t>• Upstream main repo: https://github.com/TerminalForgeAI/TerminalForgeAI.git</w:t>
         <w:br/>
-        <w:t>• All feature development happens on branches in the fork</w:t>
+        <w:t>Users interact via text input or voice (faster-whisper, fully offline). Navigation uses iPhone Volume buttons or Tab key in the TUI. Agents communicate through an in-process EventEmitter message bus visible in a live Bus Monitor panel. The Project Manager orchestrates the team autonomously in AUTO mode.</w:t>
         <w:br/>
-        <w:t>• Pull Requests: Hemin-Dhamelia/Fork-TerminalForgeAI → TerminalForgeAI/TerminalForgeAI</w:t>
         <w:br/>
-        <w:t>• Branch naming: feature/phase1-event-listener, fix/&lt;short-description&gt;, chore/&lt;short-description&gt;</w:t>
+        <w:t>A single startup command (./start.sh or npm run go) checks all dependencies, installs what is missing, and starts the full stack.</w:t>
       </w:r>
     </w:p>
     <w:p>
@@ -108,7 +80,7 @@
         <w:pStyle w:val="ListBullet"/>
       </w:pPr>
       <w:r>
-        <w:t>Voice and text input — speak or type to any agent, switch between modes at any time</w:t>
+        <w:t>Voice and text input — speak or type to any agent, switch modes at any time</w:t>
       </w:r>
     </w:p>
     <w:p>
@@ -156,7 +128,15 @@
         <w:pStyle w:val="ListBullet"/>
       </w:pPr>
       <w:r>
-        <w:t>Zero-friction UX — no mouse needed; hardware button = agent switch; voice or typing = input</w:t>
+        <w:t>Zero-friction UX — no mouse; hardware button or Tab key = agent switch; voice or typing = input</w:t>
+      </w:r>
+    </w:p>
+    <w:p>
+      <w:pPr>
+        <w:pStyle w:val="ListBullet"/>
+      </w:pPr>
+      <w:r>
+        <w:t>One-command startup — ./start.sh installs everything and starts the full stack</w:t>
       </w:r>
     </w:p>
     <w:p>
@@ -167,7 +147,7 @@
         <w:rPr>
           <w:color w:val="1F497D"/>
         </w:rPr>
-        <w:t>3. Agent Terminals &amp; Volume Button Navigation</w:t>
+        <w:t>3. Agent Terminals</w:t>
       </w:r>
     </w:p>
     <w:tbl>
@@ -243,7 +223,7 @@
           </w:tcPr>
           <w:p>
             <w:r>
-              <w:t>Terminal 1</w:t>
+              <w:t>T1</w:t>
             </w:r>
           </w:p>
         </w:tc>
@@ -263,7 +243,7 @@
           </w:tcPr>
           <w:p>
             <w:r>
-              <w:t>Code scaffolding, feature implementation, unit tests, bug fixes</w:t>
+              <w:t>Code scaffolding, feature impl, unit tests, bug fixes</w:t>
             </w:r>
           </w:p>
         </w:tc>
@@ -285,7 +265,7 @@
           </w:tcPr>
           <w:p>
             <w:r>
-              <w:t>Terminal 2</w:t>
+              <w:t>T2</w:t>
             </w:r>
           </w:p>
         </w:tc>
@@ -327,7 +307,7 @@
           </w:tcPr>
           <w:p>
             <w:r>
-              <w:t>Terminal 3</w:t>
+              <w:t>T3</w:t>
             </w:r>
           </w:p>
         </w:tc>
@@ -347,7 +327,7 @@
           </w:tcPr>
           <w:p>
             <w:r>
-              <w:t>Test plan creation, test generation, regression testing, bug reports</w:t>
+              <w:t>Test plan creation, test generation, regression, bug reports</w:t>
             </w:r>
           </w:p>
         </w:tc>
@@ -357,7 +337,7 @@
           </w:tcPr>
           <w:p>
             <w:r>
-              <w:t>Test suites, test runner output, bug issues</w:t>
+              <w:t>Test suites, runner output, bug issues</w:t>
             </w:r>
           </w:p>
         </w:tc>
@@ -369,7 +349,7 @@
           </w:tcPr>
           <w:p>
             <w:r>
-              <w:t>Terminal 4</w:t>
+              <w:t>T4</w:t>
             </w:r>
           </w:p>
         </w:tc>
@@ -389,7 +369,7 @@
           </w:tcPr>
           <w:p>
             <w:r>
-              <w:t>CI/CD, Docker, infra-as-code, deploy scripts, monitoring</w:t>
+              <w:t>CI/CD, Docker, infra-as-code, deploy scripts</w:t>
             </w:r>
           </w:p>
         </w:tc>
@@ -411,7 +391,7 @@
           </w:tcPr>
           <w:p>
             <w:r>
-              <w:t>Terminal 5</w:t>
+              <w:t>T5</w:t>
             </w:r>
           </w:p>
         </w:tc>
@@ -431,7 +411,7 @@
           </w:tcPr>
           <w:p>
             <w:r>
-              <w:t>PRD → tickets, sprint planning, orchestration, summaries</w:t>
+              <w:t>PRD, sprint planning, orchestration, summaries</w:t>
             </w:r>
           </w:p>
         </w:tc>
@@ -441,24 +421,13 @@
           </w:tcPr>
           <w:p>
             <w:r>
-              <w:t>Task dispatches, progress tracking, summaries</w:t>
+              <w:t>Task dispatches, progress tracking</w:t>
             </w:r>
           </w:p>
         </w:tc>
       </w:tr>
     </w:tbl>
     <w:p/>
-    <w:p>
-      <w:r>
-        <w:t>Navigation:</w:t>
-        <w:br/>
-        <w:t>• Volume DOWN: Terminal 1 → 2 → 3 → 4 → 5 → wraps back to 1</w:t>
-        <w:br/>
-        <w:t>• Volume UP: Terminal 5 → 4 → 3 → 2 → 1 → wraps back to 5</w:t>
-        <w:br/>
-        <w:t>• Hold either button 2 seconds: toggle Autonomous Mode on/off</w:t>
-      </w:r>
-    </w:p>
     <w:p>
       <w:pPr>
         <w:pStyle w:val="Heading1"/>
@@ -467,34 +436,7 @@
         <w:rPr>
           <w:color w:val="1F497D"/>
         </w:rPr>
-        <w:t>4. Input Modes: Text &amp; Voice</w:t>
-      </w:r>
-    </w:p>
-    <w:p>
-      <w:pPr>
-        <w:pStyle w:val="Heading2"/>
-      </w:pPr>
-      <w:r>
-        <w:rPr>
-          <w:color w:val="1F497D"/>
-        </w:rPr>
-        <w:t>4.1 Text Input</w:t>
-      </w:r>
-    </w:p>
-    <w:p>
-      <w:r>
-        <w:t>The always-available default mode. Type your prompt in the terminal. Supports multi-line input, code paste, file paths, and structured data. Zero additional latency.</w:t>
-      </w:r>
-    </w:p>
-    <w:p>
-      <w:pPr>
-        <w:pStyle w:val="Heading2"/>
-      </w:pPr>
-      <w:r>
-        <w:rPr>
-          <w:color w:val="1F497D"/>
-        </w:rPr>
-        <w:t>4.2 Voice Input</w:t>
+        <w:t>4. Input Modes</w:t>
       </w:r>
     </w:p>
     <w:tbl>
@@ -566,7 +508,7 @@
           </w:tcPr>
           <w:p>
             <w:r>
-              <w:t>Hold F5 while speaking; release to send</w:t>
+              <w:t>Press SPACE in hotkey window to toggle recording</w:t>
             </w:r>
           </w:p>
         </w:tc>
@@ -576,7 +518,7 @@
           </w:tcPr>
           <w:p>
             <w:r>
-              <w:t>Most reliable. No false activations. Build this first.</w:t>
+              <w:t>Most reliable. No false activations. Default.</w:t>
             </w:r>
           </w:p>
         </w:tc>
@@ -588,7 +530,7 @@
           </w:tcPr>
           <w:p>
             <w:r>
-              <w:t>Wake Word</w:t>
+              <w:t>Auto-VAD</w:t>
             </w:r>
           </w:p>
         </w:tc>
@@ -598,7 +540,7 @@
           </w:tcPr>
           <w:p>
             <w:r>
-              <w:t>Say 'Hey Forge' to activate, speak, silence to send</w:t>
+              <w:t>Always listening; 1.5s pause sends prompt</w:t>
             </w:r>
           </w:p>
         </w:tc>
@@ -608,7 +550,7 @@
           </w:tcPr>
           <w:p>
             <w:r>
-              <w:t>Fully hands-free. Needs openWakeWord model.</w:t>
+              <w:t>Hands-free. Needs quiet environment.</w:t>
             </w:r>
           </w:p>
         </w:tc>
@@ -620,7 +562,7 @@
           </w:tcPr>
           <w:p>
             <w:r>
-              <w:t>Auto-VAD</w:t>
+              <w:t>Wake Word</w:t>
             </w:r>
           </w:p>
         </w:tc>
@@ -630,7 +572,7 @@
           </w:tcPr>
           <w:p>
             <w:r>
-              <w:t>System always listens; detects speech start/end</w:t>
+              <w:t>Say "Hey Forge" to activate</w:t>
             </w:r>
           </w:p>
         </w:tc>
@@ -640,7 +582,7 @@
           </w:tcPr>
           <w:p>
             <w:r>
-              <w:t>Easiest UX. Slight false-positive risk in noise.</w:t>
+              <w:t>Fully hands-free. Needs openWakeWord model.</w:t>
             </w:r>
           </w:p>
         </w:tc>
@@ -652,7 +594,7 @@
           </w:tcPr>
           <w:p>
             <w:r>
-              <w:t>Text Fallback</w:t>
+              <w:t>Text Input</w:t>
             </w:r>
           </w:p>
         </w:tc>
@@ -662,7 +604,7 @@
           </w:tcPr>
           <w:p>
             <w:r>
-              <w:t>Type directly in the terminal</w:t>
+              <w:t>Type in TUI active pane, press Enter</w:t>
             </w:r>
           </w:p>
         </w:tc>
@@ -737,7 +679,7 @@
               <w:rPr>
                 <w:b/>
               </w:rPr>
-              <w:t>Purpose</w:t>
+              <w:t>Status</w:t>
             </w:r>
           </w:p>
         </w:tc>
@@ -769,7 +711,7 @@
           </w:tcPr>
           <w:p>
             <w:r>
-              <w:t>Per-agent system prompts, tool use, multi-turn memory</w:t>
+              <w:t>✅ Built</w:t>
             </w:r>
           </w:p>
         </w:tc>
@@ -791,7 +733,7 @@
           </w:tcPr>
           <w:p>
             <w:r>
-              <w:t>faster-whisper (local, CTranslate2)</w:t>
+              <w:t>faster-whisper (local, CTranslate2, offline)</w:t>
             </w:r>
           </w:p>
         </w:tc>
@@ -801,7 +743,7 @@
           </w:tcPr>
           <w:p>
             <w:r>
-              <w:t>Local offline transcription, &lt; 2s latency, no cost</w:t>
+              <w:t>✅ Built — Phase 3</w:t>
             </w:r>
           </w:p>
         </w:tc>
@@ -823,7 +765,7 @@
           </w:tcPr>
           <w:p>
             <w:r>
-              <w:t>silero-vad (Python)</w:t>
+              <w:t>silero-vad v5 VADIterator (Python)</w:t>
             </w:r>
           </w:p>
         </w:tc>
@@ -833,7 +775,7 @@
           </w:tcPr>
           <w:p>
             <w:r>
-              <w:t>Accurate speech start/end detection in noisy environments</w:t>
+              <w:t>✅ Built — Phase 3</w:t>
             </w:r>
           </w:p>
         </w:tc>
@@ -855,7 +797,7 @@
           </w:tcPr>
           <w:p>
             <w:r>
-              <w:t>openWakeWord — 'Hey Forge'</w:t>
+              <w:t>openWakeWord — "Hey Forge"</w:t>
             </w:r>
           </w:p>
         </w:tc>
@@ -865,7 +807,7 @@
           </w:tcPr>
           <w:p>
             <w:r>
-              <w:t>Triggers listening; low false-positive rate</w:t>
+              <w:t>✅ Built — Phase 3</w:t>
             </w:r>
           </w:p>
         </w:tc>
@@ -887,7 +829,7 @@
           </w:tcPr>
           <w:p>
             <w:r>
-              <w:t>ElevenLabs API or macOS say</w:t>
+              <w:t>macOS say (default) or ElevenLabs API</w:t>
             </w:r>
           </w:p>
         </w:tc>
@@ -897,7 +839,7 @@
           </w:tcPr>
           <w:p>
             <w:r>
-              <w:t>Agent voice output; off by default</w:t>
+              <w:t>✅ Built — Phase 3</w:t>
             </w:r>
           </w:p>
         </w:tc>
@@ -919,7 +861,7 @@
           </w:tcPr>
           <w:p>
             <w:r>
-              <w:t>Ink (React-for-terminal, Node.js) — BUILT</w:t>
+              <w:t>Ink (React-for-terminal, Node.js)</w:t>
             </w:r>
           </w:p>
         </w:tc>
@@ -929,7 +871,7 @@
           </w:tcPr>
           <w:p>
             <w:r>
-              <w:t>All 5 agents side-by-side, streaming, bus monitor panel</w:t>
+              <w:t>✅ Built — Phase 4</w:t>
             </w:r>
           </w:p>
         </w:tc>
@@ -961,7 +903,7 @@
           </w:tcPr>
           <w:p>
             <w:r>
-              <w:t>Volume button events reach the Mac daemon</w:t>
+              <w:t>✅ Built — Phase 1</w:t>
             </w:r>
           </w:p>
         </w:tc>
@@ -983,7 +925,7 @@
           </w:tcPr>
           <w:p>
             <w:r>
-              <w:t>Node.js Express daemon</w:t>
+              <w:t>Node.js Express daemon (bridge/server.js)</w:t>
             </w:r>
           </w:p>
         </w:tc>
@@ -993,7 +935,7 @@
           </w:tcPr>
           <w:p>
             <w:r>
-              <w:t>Receives button events; updates state.json</w:t>
+              <w:t>✅ Built — Phase 1</w:t>
             </w:r>
           </w:p>
         </w:tc>
@@ -1015,7 +957,7 @@
           </w:tcPr>
           <w:p>
             <w:r>
-              <w:t>Node.js EventEmitter (in-process)</w:t>
+              <w:t>Node.js EventEmitter (in-process, no broker)</w:t>
             </w:r>
           </w:p>
         </w:tc>
@@ -1025,7 +967,7 @@
           </w:tcPr>
           <w:p>
             <w:r>
-              <w:t>Agent-to-agent routing; no external broker needed</w:t>
+              <w:t>✅ Built — Phase 2</w:t>
             </w:r>
           </w:p>
         </w:tc>
@@ -1047,7 +989,7 @@
           </w:tcPr>
           <w:p>
             <w:r>
-              <w:t>Node.js (scripts/bus-monitor.js) + TUI panel</w:t>
+              <w:t>Node.js scripts/bus-monitor.js + TUI panel</w:t>
             </w:r>
           </w:p>
         </w:tc>
@@ -1057,7 +999,7 @@
           </w:tcPr>
           <w:p>
             <w:r>
-              <w:t>Live inter-agent traffic — standalone and TUI panel</w:t>
+              <w:t>✅ Built</w:t>
             </w:r>
           </w:p>
         </w:tc>
@@ -1089,7 +1031,7 @@
           </w:tcPr>
           <w:p>
             <w:r>
-              <w:t>Project state, tasks, handoffs readable by all agents</w:t>
+              <w:t>✅ Built — Phase 2</w:t>
             </w:r>
           </w:p>
         </w:tc>
@@ -1121,7 +1063,7 @@
           </w:tcPr>
           <w:p>
             <w:r>
-              <w:t>Injects diff, log, status into agent context on switch</w:t>
+              <w:t>✅ Built — Phase 2</w:t>
             </w:r>
           </w:p>
         </w:tc>
@@ -1133,6 +1075,38 @@
           </w:tcPr>
           <w:p>
             <w:r>
+              <w:t>Startup Script</w:t>
+            </w:r>
+          </w:p>
+        </w:tc>
+        <w:tc>
+          <w:tcPr>
+            <w:tcW w:type="dxa" w:w="2880"/>
+          </w:tcPr>
+          <w:p>
+            <w:r>
+              <w:t>scripts/start.sh (bash)</w:t>
+            </w:r>
+          </w:p>
+        </w:tc>
+        <w:tc>
+          <w:tcPr>
+            <w:tcW w:type="dxa" w:w="2880"/>
+          </w:tcPr>
+          <w:p>
+            <w:r>
+              <w:t>✅ Built</w:t>
+            </w:r>
+          </w:p>
+        </w:tc>
+      </w:tr>
+      <w:tr>
+        <w:tc>
+          <w:tcPr>
+            <w:tcW w:type="dxa" w:w="2880"/>
+          </w:tcPr>
+          <w:p>
+            <w:r>
               <w:t>Runtime</w:t>
             </w:r>
           </w:p>
@@ -1153,7 +1127,7 @@
           </w:tcPr>
           <w:p>
             <w:r>
-              <w:t>Monorepo: /core /agents /voice /bridge /ui /scripts</w:t>
+              <w:t>—</w:t>
             </w:r>
           </w:p>
         </w:tc>
@@ -1173,13 +1147,10 @@
     </w:p>
     <w:p>
       <w:pPr>
-        <w:pStyle w:val="Heading2"/>
+        <w:pStyle w:val="ListBullet"/>
       </w:pPr>
       <w:r>
-        <w:rPr>
-          <w:color w:val="1F497D"/>
-        </w:rPr>
-        <w:t>6.1 Component Overview</w:t>
+        <w:t>Bluetooth Bridge: iOS Shortcut POSTs JSON to localhost:3333</w:t>
       </w:r>
     </w:p>
     <w:p>
@@ -1187,7 +1158,7 @@
         <w:pStyle w:val="ListBullet"/>
       </w:pPr>
       <w:r>
-        <w:t>Bluetooth Bridge (iPhone → Mac): iOS Shortcut POSTs JSON to localhost:3333</w:t>
+        <w:t>macOS Event Listener: Node.js receives events, updates active terminal, writes state.json</w:t>
       </w:r>
     </w:p>
     <w:p>
@@ -1195,7 +1166,7 @@
         <w:pStyle w:val="ListBullet"/>
       </w:pPr>
       <w:r>
-        <w:t>macOS Event Listener Daemon: Node.js receives events, updates active terminal index, writes state.json</w:t>
+        <w:t>Agent Engine: 5 stateful Claude API sessions with distinct system prompts, rolling history</w:t>
       </w:r>
     </w:p>
     <w:p>
@@ -1203,7 +1174,7 @@
         <w:pStyle w:val="ListBullet"/>
       </w:pPr>
       <w:r>
-        <w:t>Agent REPL Engine: five stateful Claude API sessions with distinct system prompts, tools, and rolling history</w:t>
+        <w:t>Shared Context Store: project.md, open_tasks.json, handoffs.md injected per agent call</w:t>
       </w:r>
     </w:p>
     <w:p>
@@ -1211,7 +1182,7 @@
         <w:pStyle w:val="ListBullet"/>
       </w:pPr>
       <w:r>
-        <w:t>Shared Context Store: project.md, open_tasks.json, handoffs.md in .terminalforge/ injected into each agent call</w:t>
+        <w:t>Message Bus: in-process EventEmitter — envelope { id, from, to, type, payload, taskId, timestamp, read }</w:t>
       </w:r>
     </w:p>
     <w:p>
@@ -1219,7 +1190,7 @@
         <w:pStyle w:val="ListBullet"/>
       </w:pPr>
       <w:r>
-        <w:t>Message Bus: in-process EventEmitter; JSON envelope { id, from, to, type, payload, taskId, timestamp, read }</w:t>
+        <w:t>Bus Monitor: TUI right panel + standalone terminal — subscribeAll() + 500ms file poll</w:t>
       </w:r>
     </w:p>
     <w:p>
@@ -1227,7 +1198,7 @@
         <w:pStyle w:val="ListBullet"/>
       </w:pPr>
       <w:r>
-        <w:t>Bus Monitor: 7th terminal window + TUI right panel; subscribes to all traffic; replays history + polls log file</w:t>
+        <w:t>Terminal UI (BUILT): Ink — StatusBar + 5 AgentPanes + BusMonitorPanel; Tab/Shift+Tab navigation</w:t>
       </w:r>
     </w:p>
     <w:p>
@@ -1235,7 +1206,7 @@
         <w:pStyle w:val="ListBullet"/>
       </w:pPr>
       <w:r>
-        <w:t>Terminal UI (BUILT): Ink TUI — StatusBar + 5 AgentPanes (active/inactive) + BusMonitorPanel side-by-side</w:t>
+        <w:t>Voice Layer (BUILT): mic → silero-vad → faster-whisper → bridge POST → voice_input.json → TUI auto-submit</w:t>
       </w:r>
     </w:p>
     <w:p>
@@ -1243,7 +1214,7 @@
         <w:pStyle w:val="ListBullet"/>
       </w:pPr>
       <w:r>
-        <w:t>Voice Layer: mic → silero-vad → faster-whisper → text → active agent; optional TTS response (Phase 3)</w:t>
+        <w:t>Startup Script (BUILT): ./start.sh — 7-step setup, starts bridge + voice + TUI, cleans up on exit</w:t>
       </w:r>
     </w:p>
     <w:p>
@@ -1270,12 +1241,10 @@
     </w:p>
     <w:p>
       <w:r>
-        <w:t>Manual Mode: you are the orchestrator. Switch agents with volume buttons or Tab key. Each agent waits for your explicit prompt. Best for focused work and debugging.</w:t>
-      </w:r>
-    </w:p>
-    <w:p>
-      <w:r>
-        <w:t>Autonomous Mode: activated by holding either volume button for 2 seconds. Give a high-level goal; the PM Agent breaks it into tasks and dispatches each to the correct agent. You can intervene at any time.</w:t>
+        <w:t>Manual Mode: you are the orchestrator. Switch agents with volume buttons or Tab key.</w:t>
+        <w:br/>
+        <w:br/>
+        <w:t>Autonomous Mode: hold volume button 2s. PM Agent breaks goal into tasks and dispatches automatically.</w:t>
       </w:r>
     </w:p>
     <w:p>
@@ -1286,7 +1255,38 @@
         <w:rPr>
           <w:color w:val="1F497D"/>
         </w:rPr>
-        <w:t>7.2 Message Routing Map</w:t>
+        <w:t>7.2 Message Bus API — Built</w:t>
+      </w:r>
+    </w:p>
+    <w:p>
+      <w:r>
+        <w:t>publish({ from, to, type, payload, taskId? }) — validate + emit + append to messages.log</w:t>
+        <w:br/>
+        <w:t>subscribe(agentId, callback) — targeted delivery</w:t>
+        <w:br/>
+        <w:t>subscribeAll(callback) — all traffic (bus monitor, TUI panel)</w:t>
+        <w:br/>
+        <w:t>unsubscribe(agentId, callback)</w:t>
+        <w:br/>
+        <w:t>readLog() — parse messages.log → array</w:t>
+        <w:br/>
+        <w:t>getUnread(agentId) — filter unread messages</w:t>
+        <w:br/>
+        <w:br/>
+        <w:t>Message types: task · review · escalation · bug-report · handoff · summary</w:t>
+        <w:br/>
+        <w:t>Agent IDs: junior-dev · senior-dev · qa-engineer · devops-engineer · project-manager</w:t>
+      </w:r>
+    </w:p>
+    <w:p>
+      <w:pPr>
+        <w:pStyle w:val="Heading1"/>
+      </w:pPr>
+      <w:r>
+        <w:rPr>
+          <w:color w:val="1F497D"/>
+        </w:rPr>
+        <w:t>7B. Terminal Colour System</w:t>
       </w:r>
     </w:p>
     <w:tbl>
@@ -1310,7 +1310,7 @@
               <w:rPr>
                 <w:b/>
               </w:rPr>
-              <w:t>From</w:t>
+              <w:t>State</w:t>
             </w:r>
           </w:p>
         </w:tc>
@@ -1323,7 +1323,7 @@
               <w:rPr>
                 <w:b/>
               </w:rPr>
-              <w:t>To</w:t>
+              <w:t>Colour</w:t>
             </w:r>
           </w:p>
         </w:tc>
@@ -1336,7 +1336,7 @@
               <w:rPr>
                 <w:b/>
               </w:rPr>
-              <w:t>Message / Handoff Content</w:t>
+              <w:t>When</w:t>
             </w:r>
           </w:p>
         </w:tc>
@@ -1348,7 +1348,7 @@
           </w:tcPr>
           <w:p>
             <w:r>
-              <w:t>PM Agent</w:t>
+              <w:t>idle</w:t>
             </w:r>
           </w:p>
         </w:tc>
@@ -1358,7 +1358,7 @@
           </w:tcPr>
           <w:p>
             <w:r>
-              <w:t>Junior Developer</w:t>
+              <w:t>Default (none)</w:t>
             </w:r>
           </w:p>
         </w:tc>
@@ -1368,7 +1368,7 @@
           </w:tcPr>
           <w:p>
             <w:r>
-              <w:t>Dispatches implementation tasks with file paths and acceptance criteria</w:t>
+              <w:t>Agent waiting — no active task</w:t>
             </w:r>
           </w:p>
         </w:tc>
@@ -1380,7 +1380,7 @@
           </w:tcPr>
           <w:p>
             <w:r>
-              <w:t>PM Agent</w:t>
+              <w:t>working</w:t>
             </w:r>
           </w:p>
         </w:tc>
@@ -1390,7 +1390,7 @@
           </w:tcPr>
           <w:p>
             <w:r>
-              <w:t>Senior Developer</w:t>
+              <w:t>YELLOW (bgYellow)</w:t>
             </w:r>
           </w:p>
         </w:tc>
@@ -1400,7 +1400,7 @@
           </w:tcPr>
           <w:p>
             <w:r>
-              <w:t>Assigns architecture decisions or high-complexity features</w:t>
+              <w:t>Task dispatched — fires before first streaming token</w:t>
             </w:r>
           </w:p>
         </w:tc>
@@ -1412,7 +1412,7 @@
           </w:tcPr>
           <w:p>
             <w:r>
-              <w:t>PM Agent</w:t>
+              <w:t>done</w:t>
             </w:r>
           </w:p>
         </w:tc>
@@ -1422,7 +1422,7 @@
           </w:tcPr>
           <w:p>
             <w:r>
-              <w:t>QA Engineer</w:t>
+              <w:t>GREEN (bgGreen)</w:t>
             </w:r>
           </w:p>
         </w:tc>
@@ -1432,7 +1432,7 @@
           </w:tcPr>
           <w:p>
             <w:r>
-              <w:t>Triggers test generation once feature branch is marked complete</w:t>
+              <w:t>Task completed successfully</w:t>
             </w:r>
           </w:p>
         </w:tc>
@@ -1444,7 +1444,7 @@
           </w:tcPr>
           <w:p>
             <w:r>
-              <w:t>PM Agent</w:t>
+              <w:t>failed</w:t>
             </w:r>
           </w:p>
         </w:tc>
@@ -1454,7 +1454,7 @@
           </w:tcPr>
           <w:p>
             <w:r>
-              <w:t>DevOps Engineer</w:t>
+              <w:t>RED (bgRed)</w:t>
             </w:r>
           </w:p>
         </w:tc>
@@ -1464,508 +1464,7 @@
           </w:tcPr>
           <w:p>
             <w:r>
-              <w:t>Requests pipeline/deploy setup when code is merged to main</w:t>
-            </w:r>
-          </w:p>
-        </w:tc>
-      </w:tr>
-      <w:tr>
-        <w:tc>
-          <w:tcPr>
-            <w:tcW w:type="dxa" w:w="2880"/>
-          </w:tcPr>
-          <w:p>
-            <w:r>
-              <w:t>Junior Developer</w:t>
-            </w:r>
-          </w:p>
-        </w:tc>
-        <w:tc>
-          <w:tcPr>
-            <w:tcW w:type="dxa" w:w="2880"/>
-          </w:tcPr>
-          <w:p>
-            <w:r>
-              <w:t>Senior Developer</w:t>
-            </w:r>
-          </w:p>
-        </w:tc>
-        <w:tc>
-          <w:tcPr>
-            <w:tcW w:type="dxa" w:w="2880"/>
-          </w:tcPr>
-          <w:p>
-            <w:r>
-              <w:t>Escalates blockers for senior review</w:t>
-            </w:r>
-          </w:p>
-        </w:tc>
-      </w:tr>
-      <w:tr>
-        <w:tc>
-          <w:tcPr>
-            <w:tcW w:type="dxa" w:w="2880"/>
-          </w:tcPr>
-          <w:p>
-            <w:r>
-              <w:t>Senior Developer</w:t>
-            </w:r>
-          </w:p>
-        </w:tc>
-        <w:tc>
-          <w:tcPr>
-            <w:tcW w:type="dxa" w:w="2880"/>
-          </w:tcPr>
-          <w:p>
-            <w:r>
-              <w:t>Junior Developer</w:t>
-            </w:r>
-          </w:p>
-        </w:tc>
-        <w:tc>
-          <w:tcPr>
-            <w:tcW w:type="dxa" w:w="2880"/>
-          </w:tcPr>
-          <w:p>
-            <w:r>
-              <w:t>Returns reviewed code with inline fix instructions</w:t>
-            </w:r>
-          </w:p>
-        </w:tc>
-      </w:tr>
-      <w:tr>
-        <w:tc>
-          <w:tcPr>
-            <w:tcW w:type="dxa" w:w="2880"/>
-          </w:tcPr>
-          <w:p>
-            <w:r>
-              <w:t>Senior Developer</w:t>
-            </w:r>
-          </w:p>
-        </w:tc>
-        <w:tc>
-          <w:tcPr>
-            <w:tcW w:type="dxa" w:w="2880"/>
-          </w:tcPr>
-          <w:p>
-            <w:r>
-              <w:t>QA Engineer</w:t>
-            </w:r>
-          </w:p>
-        </w:tc>
-        <w:tc>
-          <w:tcPr>
-            <w:tcW w:type="dxa" w:w="2880"/>
-          </w:tcPr>
-          <w:p>
-            <w:r>
-              <w:t>Notifies QA when feature is code-complete and ready for testing</w:t>
-            </w:r>
-          </w:p>
-        </w:tc>
-      </w:tr>
-      <w:tr>
-        <w:tc>
-          <w:tcPr>
-            <w:tcW w:type="dxa" w:w="2880"/>
-          </w:tcPr>
-          <w:p>
-            <w:r>
-              <w:t>QA Engineer</w:t>
-            </w:r>
-          </w:p>
-        </w:tc>
-        <w:tc>
-          <w:tcPr>
-            <w:tcW w:type="dxa" w:w="2880"/>
-          </w:tcPr>
-          <w:p>
-            <w:r>
-              <w:t>Junior Developer</w:t>
-            </w:r>
-          </w:p>
-        </w:tc>
-        <w:tc>
-          <w:tcPr>
-            <w:tcW w:type="dxa" w:w="2880"/>
-          </w:tcPr>
-          <w:p>
-            <w:r>
-              <w:t>Files bug report with repro steps, expected vs actual, severity</w:t>
-            </w:r>
-          </w:p>
-        </w:tc>
-      </w:tr>
-      <w:tr>
-        <w:tc>
-          <w:tcPr>
-            <w:tcW w:type="dxa" w:w="2880"/>
-          </w:tcPr>
-          <w:p>
-            <w:r>
-              <w:t>QA Engineer</w:t>
-            </w:r>
-          </w:p>
-        </w:tc>
-        <w:tc>
-          <w:tcPr>
-            <w:tcW w:type="dxa" w:w="2880"/>
-          </w:tcPr>
-          <w:p>
-            <w:r>
-              <w:t>Senior Developer</w:t>
-            </w:r>
-          </w:p>
-        </w:tc>
-        <w:tc>
-          <w:tcPr>
-            <w:tcW w:type="dxa" w:w="2880"/>
-          </w:tcPr>
-          <w:p>
-            <w:r>
-              <w:t>Escalates architectural bugs requiring senior investigation</w:t>
-            </w:r>
-          </w:p>
-        </w:tc>
-      </w:tr>
-      <w:tr>
-        <w:tc>
-          <w:tcPr>
-            <w:tcW w:type="dxa" w:w="2880"/>
-          </w:tcPr>
-          <w:p>
-            <w:r>
-              <w:t>DevOps Engineer</w:t>
-            </w:r>
-          </w:p>
-        </w:tc>
-        <w:tc>
-          <w:tcPr>
-            <w:tcW w:type="dxa" w:w="2880"/>
-          </w:tcPr>
-          <w:p>
-            <w:r>
-              <w:t>Senior Developer</w:t>
-            </w:r>
-          </w:p>
-        </w:tc>
-        <w:tc>
-          <w:tcPr>
-            <w:tcW w:type="dxa" w:w="2880"/>
-          </w:tcPr>
-          <w:p>
-            <w:r>
-              <w:t>Requests confirmation before infra changes affecting app config</w:t>
-            </w:r>
-          </w:p>
-        </w:tc>
-      </w:tr>
-    </w:tbl>
-    <w:p/>
-    <w:p>
-      <w:pPr>
-        <w:pStyle w:val="Heading2"/>
-      </w:pPr>
-      <w:r>
-        <w:rPr>
-          <w:color w:val="1F497D"/>
-        </w:rPr>
-        <w:t>7.3 Message Bus API — BUILT</w:t>
-      </w:r>
-    </w:p>
-    <w:p>
-      <w:r>
-        <w:t>publish({ from, to, type, payload, taskId? }) — validate + emit + append to messages.log</w:t>
-        <w:br/>
-        <w:t>subscribe(agentId, callback) — targeted — each agent REPL receives its messages</w:t>
-        <w:br/>
-        <w:t>subscribeAll(callback) — all traffic — bus monitor uses this</w:t>
-        <w:br/>
-        <w:t>unsubscribe(agentId, callback)</w:t>
-        <w:br/>
-        <w:t>readLog() — parse full messages.log → array of envelopes</w:t>
-        <w:br/>
-        <w:t>getUnread(agentId) — filter unread messages for a specific agent</w:t>
-      </w:r>
-    </w:p>
-    <w:p>
-      <w:r>
-        <w:t>Message types: task · review · escalation · bug-report · handoff · summary</w:t>
-        <w:br/>
-        <w:t>Agent IDs: junior-dev · senior-dev · qa-engineer · devops-engineer · project-manager</w:t>
-      </w:r>
-    </w:p>
-    <w:p>
-      <w:pPr>
-        <w:pStyle w:val="Heading2"/>
-      </w:pPr>
-      <w:r>
-        <w:rPr>
-          <w:color w:val="1F497D"/>
-        </w:rPr>
-        <w:t>7.4 Agent REPL Commands — BUILT</w:t>
-      </w:r>
-    </w:p>
-    <w:p>
-      <w:r>
-        <w:t>/msg &lt;agentId&gt; &lt;type&gt; &lt;message&gt; — send a message to another agent</w:t>
-        <w:br/>
-        <w:t>/reply &lt;message&gt; — quick-reply to the last received message</w:t>
-        <w:br/>
-        <w:t>/clear — clear this agent's conversation history</w:t>
-        <w:br/>
-        <w:t>/status — show current terminal state from state.json</w:t>
-        <w:br/>
-        <w:t>/quit — close this agent REPL</w:t>
-      </w:r>
-    </w:p>
-    <w:p>
-      <w:pPr>
-        <w:pStyle w:val="Heading1"/>
-      </w:pPr>
-      <w:r>
-        <w:rPr>
-          <w:color w:val="1F497D"/>
-        </w:rPr>
-        <w:t>7B. Terminal Colour System — Task State Indicator</w:t>
-      </w:r>
-    </w:p>
-    <w:p>
-      <w:r>
-        <w:t>Every agent terminal visually reflects the current task state through background colour. This is a core UX feature built into the TUI.</w:t>
-      </w:r>
-    </w:p>
-    <w:tbl>
-      <w:tblPr>
-        <w:tblStyle w:val="TableGrid"/>
-        <w:tblW w:type="auto" w:w="0"/>
-        <w:tblLook w:firstColumn="1" w:firstRow="1" w:lastColumn="0" w:lastRow="0" w:noHBand="0" w:noVBand="1" w:val="04A0"/>
-      </w:tblPr>
-      <w:tblGrid>
-        <w:gridCol w:w="2160"/>
-        <w:gridCol w:w="2160"/>
-        <w:gridCol w:w="2160"/>
-        <w:gridCol w:w="2160"/>
-      </w:tblGrid>
-      <w:tr>
-        <w:tc>
-          <w:tcPr>
-            <w:tcW w:type="dxa" w:w="2160"/>
-          </w:tcPr>
-          <w:p>
-            <w:r>
-              <w:rPr>
-                <w:b/>
-              </w:rPr>
-              <w:t>Task State</w:t>
-            </w:r>
-          </w:p>
-        </w:tc>
-        <w:tc>
-          <w:tcPr>
-            <w:tcW w:type="dxa" w:w="2160"/>
-          </w:tcPr>
-          <w:p>
-            <w:r>
-              <w:rPr>
-                <w:b/>
-              </w:rPr>
-              <w:t>Terminal Colour</w:t>
-            </w:r>
-          </w:p>
-        </w:tc>
-        <w:tc>
-          <w:tcPr>
-            <w:tcW w:type="dxa" w:w="2160"/>
-          </w:tcPr>
-          <w:p>
-            <w:r>
-              <w:rPr>
-                <w:b/>
-              </w:rPr>
-              <w:t>Ink Class</w:t>
-            </w:r>
-          </w:p>
-        </w:tc>
-        <w:tc>
-          <w:tcPr>
-            <w:tcW w:type="dxa" w:w="2160"/>
-          </w:tcPr>
-          <w:p>
-            <w:r>
-              <w:rPr>
-                <w:b/>
-              </w:rPr>
-              <w:t>When It Fires</w:t>
-            </w:r>
-          </w:p>
-        </w:tc>
-      </w:tr>
-      <w:tr>
-        <w:tc>
-          <w:tcPr>
-            <w:tcW w:type="dxa" w:w="2160"/>
-          </w:tcPr>
-          <w:p>
-            <w:r>
-              <w:t>idle</w:t>
-            </w:r>
-          </w:p>
-        </w:tc>
-        <w:tc>
-          <w:tcPr>
-            <w:tcW w:type="dxa" w:w="2160"/>
-          </w:tcPr>
-          <w:p>
-            <w:r>
-              <w:t>Default (no colour)</w:t>
-            </w:r>
-          </w:p>
-        </w:tc>
-        <w:tc>
-          <w:tcPr>
-            <w:tcW w:type="dxa" w:w="2160"/>
-          </w:tcPr>
-          <w:p>
-            <w:r>
-              <w:t>none</w:t>
-            </w:r>
-          </w:p>
-        </w:tc>
-        <w:tc>
-          <w:tcPr>
-            <w:tcW w:type="dxa" w:w="2160"/>
-          </w:tcPr>
-          <w:p>
-            <w:r>
-              <w:t>Agent is waiting for a prompt — no active task</w:t>
-            </w:r>
-          </w:p>
-        </w:tc>
-      </w:tr>
-      <w:tr>
-        <w:tc>
-          <w:tcPr>
-            <w:tcW w:type="dxa" w:w="2160"/>
-          </w:tcPr>
-          <w:p>
-            <w:r>
-              <w:t>working</w:t>
-            </w:r>
-          </w:p>
-        </w:tc>
-        <w:tc>
-          <w:tcPr>
-            <w:tcW w:type="dxa" w:w="2160"/>
-          </w:tcPr>
-          <w:p>
-            <w:r>
-              <w:t>YELLOW</w:t>
-            </w:r>
-          </w:p>
-        </w:tc>
-        <w:tc>
-          <w:tcPr>
-            <w:tcW w:type="dxa" w:w="2160"/>
-          </w:tcPr>
-          <w:p>
-            <w:r>
-              <w:t>bgYellow</w:t>
-            </w:r>
-          </w:p>
-        </w:tc>
-        <w:tc>
-          <w:tcPr>
-            <w:tcW w:type="dxa" w:w="2160"/>
-          </w:tcPr>
-          <w:p>
-            <w:r>
-              <w:t>Fires immediately when a task is dispatched — before the first token streams</w:t>
-            </w:r>
-          </w:p>
-        </w:tc>
-      </w:tr>
-      <w:tr>
-        <w:tc>
-          <w:tcPr>
-            <w:tcW w:type="dxa" w:w="2160"/>
-          </w:tcPr>
-          <w:p>
-            <w:r>
-              <w:t>done</w:t>
-            </w:r>
-          </w:p>
-        </w:tc>
-        <w:tc>
-          <w:tcPr>
-            <w:tcW w:type="dxa" w:w="2160"/>
-          </w:tcPr>
-          <w:p>
-            <w:r>
-              <w:t>GREEN</w:t>
-            </w:r>
-          </w:p>
-        </w:tc>
-        <w:tc>
-          <w:tcPr>
-            <w:tcW w:type="dxa" w:w="2160"/>
-          </w:tcPr>
-          <w:p>
-            <w:r>
-              <w:t>bgGreen</w:t>
-            </w:r>
-          </w:p>
-        </w:tc>
-        <w:tc>
-          <w:tcPr>
-            <w:tcW w:type="dxa" w:w="2160"/>
-          </w:tcPr>
-          <w:p>
-            <w:r>
-              <w:t>Fires within &lt; 100ms of a task:done event — task completed successfully</w:t>
-            </w:r>
-          </w:p>
-        </w:tc>
-      </w:tr>
-      <w:tr>
-        <w:tc>
-          <w:tcPr>
-            <w:tcW w:type="dxa" w:w="2160"/>
-          </w:tcPr>
-          <w:p>
-            <w:r>
-              <w:t>failed</w:t>
-            </w:r>
-          </w:p>
-        </w:tc>
-        <w:tc>
-          <w:tcPr>
-            <w:tcW w:type="dxa" w:w="2160"/>
-          </w:tcPr>
-          <w:p>
-            <w:r>
-              <w:t>RED</w:t>
-            </w:r>
-          </w:p>
-        </w:tc>
-        <w:tc>
-          <w:tcPr>
-            <w:tcW w:type="dxa" w:w="2160"/>
-          </w:tcPr>
-          <w:p>
-            <w:r>
-              <w:t>bgRed</w:t>
-            </w:r>
-          </w:p>
-        </w:tc>
-        <w:tc>
-          <w:tcPr>
-            <w:tcW w:type="dxa" w:w="2160"/>
-          </w:tcPr>
-          <w:p>
-            <w:r>
-              <w:t>Fires immediately on task:failed or any unhandled API error</w:t>
+              <w:t>Task failed or API error</w:t>
             </w:r>
           </w:p>
         </w:tc>
@@ -1980,23 +1479,45 @@
         <w:rPr>
           <w:color w:val="1F497D"/>
         </w:rPr>
-        <w:t>7C. Bus Monitor — Real-Time Observability — BUILT</w:t>
+        <w:t>7C. Voice Pipeline Integration</w:t>
       </w:r>
     </w:p>
     <w:p>
       <w:r>
-        <w:t>The Bus Monitor runs in a dedicated 7th terminal window and is also embedded as the right panel in the TUI. It shows all inter-agent messages as they flow through the system.</w:t>
+        <w:t>Integration flow: Python pipeline → POST localhost:3333/voice → bridge reads activeTerminal from state.json → writes voice_input.json (atomic rename) → TUI polls every 500ms → marks consumed → calls handleSubmit(text) on active agent.</w:t>
         <w:br/>
         <w:br/>
-        <w:t>• Replays the last 20 messages from .terminalforge/messages.log on start</w:t>
+        <w:t>voice_state.json: { "status": "idle|listening|recording|transcribing", "mode": "push-to-talk|auto-vad|wake-word", "recording": false }</w:t>
         <w:br/>
-        <w:t>• Subscribes to all live traffic via subscribeAll() for in-process messages</w:t>
+        <w:t>voice_input.json: { "text": "...", "targetTerminal": 2, "confidence": 1.0, "consumed": false, "timestamp": "..." }</w:t>
+      </w:r>
+    </w:p>
+    <w:p>
+      <w:pPr>
+        <w:pStyle w:val="Heading1"/>
+      </w:pPr>
+      <w:r>
+        <w:rPr>
+          <w:color w:val="1F497D"/>
+        </w:rPr>
+        <w:t>7D. Startup Script</w:t>
+      </w:r>
+    </w:p>
+    <w:p>
+      <w:r>
+        <w:t>scripts/start.sh (symlinked as ./start.sh) — one-command full stack startup.</w:t>
         <w:br/>
-        <w:t>• Polls messages.log every 500ms to catch messages published from other processes</w:t>
         <w:br/>
-        <w:t>• Run standalone: npm run monitor</w:t>
+        <w:t>Run: ./start.sh or npm run go</w:t>
         <w:br/>
-        <w:t>• In TUI: right panel (12% width) shows live feed always visible</w:t>
+        <w:br/>
+        <w:t>Options: --voice (push-to-talk), --voice=auto (auto-VAD), --voice=wake (wake word), --no-voice (text only), --debug (verbose logging)</w:t>
+        <w:br/>
+        <w:br/>
+        <w:t>7 steps: check Node.js → check Python → npm install (if needed) → pip install (missing only) → validate .env → init .terminalforge/ → select voice mode → start bridge (background, health-checked) → start voice pipeline (background) → open hotkey window (push-to-talk) → start TUI (foreground)</w:t>
+        <w:br/>
+        <w:br/>
+        <w:t>Ctrl+C triggers cleanup trap: kills bridge and voice PIDs, resets voice_state.json to idle.</w:t>
       </w:r>
     </w:p>
     <w:p>
@@ -2018,7 +1539,7 @@
         <w:rPr>
           <w:color w:val="1F497D"/>
         </w:rPr>
-        <w:t>8.1 Starting a New Project (Manual Mode)</w:t>
+        <w:t>8.1 Starting (One Command)</w:t>
       </w:r>
     </w:p>
     <w:p>
@@ -2026,7 +1547,7 @@
         <w:pStyle w:val="ListNumber"/>
       </w:pPr>
       <w:r>
-        <w:t>npm run ui → all 5 agents open side-by-side in one fullscreen window</w:t>
+        <w:t>./start.sh — checks everything, installs deps, asks for voice mode, starts full stack</w:t>
       </w:r>
     </w:p>
     <w:p>
@@ -2034,7 +1555,7 @@
         <w:pStyle w:val="ListNumber"/>
       </w:pPr>
       <w:r>
-        <w:t>Press Tab to navigate to T5 PM → describe project → receive PRD + task list</w:t>
+        <w:t>TUI opens: all 5 agents side-by-side + bus monitor panel</w:t>
       </w:r>
     </w:p>
     <w:p>
@@ -2042,7 +1563,7 @@
         <w:pStyle w:val="ListNumber"/>
       </w:pPr>
       <w:r>
-        <w:t>Tab to T1 Junior Dev → confirm architecture, create folder scaffold</w:t>
+        <w:t>Tab to navigate between agents, Enter to submit prompts</w:t>
       </w:r>
     </w:p>
     <w:p>
@@ -2050,7 +1571,7 @@
         <w:pStyle w:val="ListNumber"/>
       </w:pPr>
       <w:r>
-        <w:t>Implement feature by feature, committing after each</w:t>
+        <w:t>Type or speak (if voice pipeline running) — transcribed text auto-routes to active agent</w:t>
       </w:r>
     </w:p>
     <w:p>
@@ -2058,55 +1579,7 @@
         <w:pStyle w:val="ListNumber"/>
       </w:pPr>
       <w:r>
-        <w:t>Tab to T3 QA → generate test cases, run tests, file bugs back to Junior Dev</w:t>
-      </w:r>
-    </w:p>
-    <w:p>
-      <w:pPr>
-        <w:pStyle w:val="ListNumber"/>
-      </w:pPr>
-      <w:r>
-        <w:t>Tab to T4 DevOps → write Dockerfile, CI pipeline YAML, deployment script</w:t>
-      </w:r>
-    </w:p>
-    <w:p>
-      <w:pPr>
-        <w:pStyle w:val="ListNumber"/>
-      </w:pPr>
-      <w:r>
-        <w:t>Tab to T5 PM → sprint review summary, mark tasks done, plan next iteration</w:t>
-      </w:r>
-    </w:p>
-    <w:p>
-      <w:pPr>
-        <w:pStyle w:val="ListNumber"/>
-      </w:pPr>
-      <w:r>
-        <w:t>Bus Monitor right panel always visible — watch all inter-agent messages live</w:t>
-      </w:r>
-    </w:p>
-    <w:p>
-      <w:pPr>
-        <w:pStyle w:val="Heading2"/>
-      </w:pPr>
-      <w:r>
-        <w:rPr>
-          <w:color w:val="1F497D"/>
-        </w:rPr>
-        <w:t>8.2 Autonomous Mode (Hands-Free)</w:t>
-      </w:r>
-    </w:p>
-    <w:p>
-      <w:r>
-        <w:t>Hold either volume button for 2s → Autonomous Mode activates (status bar changes to AUTO)</w:t>
-        <w:br/>
-        <w:t>Speak or type a high-level goal: "Build a CRUD REST API with user auth and PostgreSQL"</w:t>
-        <w:br/>
-        <w:t>PM Agent generates task list and begins dispatching automatically</w:t>
-        <w:br/>
-        <w:t>Watch the pipeline execute in the TUI; all agent messages visible in Bus Monitor panel</w:t>
-        <w:br/>
-        <w:t>Interrupt at any time by holding either volume button → returns to Manual Mode immediately</w:t>
+        <w:t>Ctrl+C to stop everything cleanly</w:t>
       </w:r>
     </w:p>
     <w:p>
@@ -2237,7 +1710,7 @@
           </w:tcPr>
           <w:p>
             <w:r>
-              <w:t>Bluetooth bridge, vol event listener, Claude API streaming test</w:t>
+              <w:t>Bridge, state, event listener, navigation</w:t>
             </w:r>
           </w:p>
         </w:tc>
@@ -2289,7 +1762,7 @@
           </w:tcPr>
           <w:p>
             <w:r>
-              <w:t>5 agent sessions w/ system prompts, shared context store, git integration</w:t>
+              <w:t>5 Claude sessions, context injection, git</w:t>
             </w:r>
           </w:p>
         </w:tc>
@@ -2341,7 +1814,7 @@
           </w:tcPr>
           <w:p>
             <w:r>
-              <w:t>7-window launch script, tmux layout, bus monitor, inline REPL banners, /msg /reply</w:t>
+              <w:t>7-window launch, tmux, bus monitor, agent REPL</w:t>
             </w:r>
           </w:p>
         </w:tc>
@@ -2393,7 +1866,7 @@
           </w:tcPr>
           <w:p>
             <w:r>
-              <w:t>Mic → faster-whisper → agent prompt; silero-vad; wake word; optional TTS</w:t>
+              <w:t>faster-whisper STT, silero-vad, 3 modes, TUI integration</w:t>
             </w:r>
           </w:p>
         </w:tc>
@@ -2403,7 +1876,7 @@
           </w:tcPr>
           <w:p>
             <w:r>
-              <w:t>🔜 NEXT</w:t>
+              <w:t>✅ COMPLETE</w:t>
             </w:r>
           </w:p>
         </w:tc>
@@ -2445,7 +1918,7 @@
           </w:tcPr>
           <w:p>
             <w:r>
-              <w:t>Ink TUI: all 5 agents side-by-side, streaming, Tab navigation, bus monitor panel, status bar</w:t>
+              <w:t>Ink TUI: all 5 agents side-by-side, streaming, bus panel</w:t>
             </w:r>
           </w:p>
         </w:tc>
@@ -2467,7 +1940,7 @@
           </w:tcPr>
           <w:p>
             <w:r>
-              <w:t>Phase 5</w:t>
+              <w:t>Startup Script</w:t>
             </w:r>
           </w:p>
         </w:tc>
@@ -2477,7 +1950,7 @@
           </w:tcPr>
           <w:p>
             <w:r>
-              <w:t>Agent Comms</w:t>
+              <w:t>Full Stack Launcher</w:t>
             </w:r>
           </w:p>
         </w:tc>
@@ -2487,7 +1960,7 @@
           </w:tcPr>
           <w:p>
             <w:r>
-              <w:t>Week 7</w:t>
+              <w:t>Week 6</w:t>
             </w:r>
           </w:p>
         </w:tc>
@@ -2497,7 +1970,7 @@
           </w:tcPr>
           <w:p>
             <w:r>
-              <w:t>PM orchestrator loop, auto-dispatch, agent handoff protocol (message bus core done)</w:t>
+              <w:t>./start.sh one-command startup</w:t>
             </w:r>
           </w:p>
         </w:tc>
@@ -2507,7 +1980,7 @@
           </w:tcPr>
           <w:p>
             <w:r>
-              <w:t>🔜</w:t>
+              <w:t>✅ COMPLETE</w:t>
             </w:r>
           </w:p>
         </w:tc>
@@ -2519,6 +1992,58 @@
           </w:tcPr>
           <w:p>
             <w:r>
+              <w:t>Phase 5</w:t>
+            </w:r>
+          </w:p>
+        </w:tc>
+        <w:tc>
+          <w:tcPr>
+            <w:tcW w:type="dxa" w:w="1728"/>
+          </w:tcPr>
+          <w:p>
+            <w:r>
+              <w:t>Agent Comms</w:t>
+            </w:r>
+          </w:p>
+        </w:tc>
+        <w:tc>
+          <w:tcPr>
+            <w:tcW w:type="dxa" w:w="1728"/>
+          </w:tcPr>
+          <w:p>
+            <w:r>
+              <w:t>Week 7</w:t>
+            </w:r>
+          </w:p>
+        </w:tc>
+        <w:tc>
+          <w:tcPr>
+            <w:tcW w:type="dxa" w:w="1728"/>
+          </w:tcPr>
+          <w:p>
+            <w:r>
+              <w:t>PM orchestrator loop, auto-dispatch, bus event wiring</w:t>
+            </w:r>
+          </w:p>
+        </w:tc>
+        <w:tc>
+          <w:tcPr>
+            <w:tcW w:type="dxa" w:w="1728"/>
+          </w:tcPr>
+          <w:p>
+            <w:r>
+              <w:t>🔜 NEXT</w:t>
+            </w:r>
+          </w:p>
+        </w:tc>
+      </w:tr>
+      <w:tr>
+        <w:tc>
+          <w:tcPr>
+            <w:tcW w:type="dxa" w:w="1728"/>
+          </w:tcPr>
+          <w:p>
+            <w:r>
               <w:t>Phase 6</w:t>
             </w:r>
           </w:p>
@@ -2549,7 +2074,7 @@
           </w:tcPr>
           <w:p>
             <w:r>
-              <w:t>Error handling, logging, onboarding guide, demo project (full web app built end-to-end)</w:t>
+              <w:t>Error handling, QUICKSTART.md, end-to-end demo</w:t>
             </w:r>
           </w:p>
         </w:tc>
@@ -2670,7 +2195,7 @@
           </w:tcPr>
           <w:p>
             <w:r>
-              <w:t>Use macOS AVAudioSession native hook instead of BT vol intercept</w:t>
+              <w:t>Use macOS AVAudioSession or hotkey fallback</w:t>
             </w:r>
           </w:p>
         </w:tc>
@@ -2712,7 +2237,7 @@
           </w:tcPr>
           <w:p>
             <w:r>
-              <w:t>Use faster-whisper local; stream chunks; show Listening in TUI</w:t>
+              <w:t>faster-whisper local int8; built-in vad_filter</w:t>
             </w:r>
           </w:p>
         </w:tc>
@@ -2754,7 +2279,7 @@
           </w:tcPr>
           <w:p>
             <w:r>
-              <w:t>Rolling summary store; inject only relevant context per agent per call</w:t>
+              <w:t>Rolling summary; inject only last 3 handoffs + git</w:t>
             </w:r>
           </w:p>
         </w:tc>
@@ -2776,7 +2301,7 @@
           </w:tcPr>
           <w:p>
             <w:r>
-              <w:t>Agent infinite loop in orchestrated mode</w:t>
+              <w:t>Agent infinite loop in autonomous mode</w:t>
             </w:r>
           </w:p>
         </w:tc>
@@ -2796,7 +2321,7 @@
           </w:tcPr>
           <w:p>
             <w:r>
-              <w:t>PM agent max-step budget (default 20); user interrupt by holding vol button</w:t>
+              <w:t>PM max-step budget 20; user interrupt via vol hold</w:t>
             </w:r>
           </w:p>
         </w:tc>
@@ -2818,7 +2343,7 @@
           </w:tcPr>
           <w:p>
             <w:r>
-              <w:t>Voice false activation in noisy environment</w:t>
+              <w:t>Voice false activation in noise</w:t>
             </w:r>
           </w:p>
         </w:tc>
@@ -2838,7 +2363,7 @@
           </w:tcPr>
           <w:p>
             <w:r>
-              <w:t>Default Push-to-Talk; VAD sensitivity configurable in config.json</w:t>
+              <w:t>Default push-to-talk; VAD threshold configurable</w:t>
             </w:r>
           </w:p>
         </w:tc>
@@ -2880,7 +2405,7 @@
           </w:tcPr>
           <w:p>
             <w:r>
-              <w:t>Thin abstraction wrapper; document tested macOS versions (14.x, 15.x)</w:t>
+              <w:t>Thin wrapper; hotkey-fallback.js as alternative</w:t>
             </w:r>
           </w:p>
         </w:tc>
@@ -2922,7 +2447,7 @@
           </w:tcPr>
           <w:p>
             <w:r>
-              <w:t>Pin system prompts per agent; add session-reset command</w:t>
+              <w:t>Pinned system prompts; session-reset command</w:t>
             </w:r>
           </w:p>
         </w:tc>
@@ -2964,7 +2489,7 @@
           </w:tcPr>
           <w:p>
             <w:r>
-              <w:t>messages.log is the persistent log; bus-monitor replays on start</w:t>
+              <w:t>messages.log is persistent; bus-monitor replays on start</w:t>
             </w:r>
           </w:p>
         </w:tc>
@@ -2997,7 +2522,7 @@
         <w:pStyle w:val="ListBullet"/>
       </w:pPr>
       <w:r>
-        <w:t>Terminal colour system: yellow fires in &lt; 50ms of task dispatch, green/red in &lt; 100ms of task resolution</w:t>
+        <w:t>Terminal colour: yellow fires in &lt; 50ms of task dispatch, green/red in &lt; 100ms</w:t>
       </w:r>
     </w:p>
     <w:p>
@@ -3005,7 +2530,7 @@
         <w:pStyle w:val="ListBullet"/>
       </w:pPr>
       <w:r>
-        <w:t>Agent switch latency: &lt; 500ms from volume button press to new agent active in terminal</w:t>
+        <w:t>Agent switch latency: &lt; 500ms from volume button press to new agent active</w:t>
       </w:r>
     </w:p>
     <w:p>
@@ -3029,7 +2554,7 @@
         <w:pStyle w:val="ListBullet"/>
       </w:pPr>
       <w:r>
-        <w:t>Autonomous pipeline: PM agent routes a feature request through all 5 agents without manual switching</w:t>
+        <w:t>Autonomous pipeline: PM routes a feature request through all 5 agents without manual switching</w:t>
       </w:r>
     </w:p>
     <w:p>
@@ -3037,7 +2562,7 @@
         <w:pStyle w:val="ListBullet"/>
       </w:pPr>
       <w:r>
-        <w:t>End-to-end build: a full CRUD web app can be scaffolded, tested, and containerised using only TerminalForge</w:t>
+        <w:t>End-to-end build: full CRUD web app scaffolded, tested, containerised using only TerminalForge</w:t>
       </w:r>
     </w:p>
     <w:p>
@@ -3045,7 +2570,7 @@
         <w:pStyle w:val="ListBullet"/>
       </w:pPr>
       <w:r>
-        <w:t>Context retention: agents correctly reference prior outputs and handoff notes 95%+ of the time</w:t>
+        <w:t>Context retention: agents correctly reference prior outputs 95%+ of the time</w:t>
       </w:r>
     </w:p>
     <w:p>
@@ -3053,7 +2578,7 @@
         <w:pStyle w:val="ListBullet"/>
       </w:pPr>
       <w:r>
-        <w:t>Zero mouse required: entire session operable with only voice/keyboard + volume buttons</w:t>
+        <w:t>Zero mouse required: entire session operable with voice/keyboard + volume buttons</w:t>
       </w:r>
     </w:p>
     <w:p>
@@ -3061,7 +2586,7 @@
         <w:pStyle w:val="ListBullet"/>
       </w:pPr>
       <w:r>
-        <w:t>Observability: all inter-agent messages visible in real time in Bus Monitor within &lt; 1s of publish</w:t>
+        <w:t>One-command startup: ./start.sh handles all setup without manual steps</w:t>
       </w:r>
     </w:p>
     <w:p>
@@ -3080,7 +2605,7 @@
         <w:pStyle w:val="ListNumber"/>
       </w:pPr>
       <w:r>
-        <w:t>npm run ui — launch full TUI with all 5 agents side-by-side (ALREADY BUILT)</w:t>
+        <w:t>Run ./start.sh — all setup is automated (Node.js, Python, .env, all deps)</w:t>
       </w:r>
     </w:p>
     <w:p>
@@ -3088,7 +2613,7 @@
         <w:pStyle w:val="ListNumber"/>
       </w:pPr>
       <w:r>
-        <w:t>Set up Anthropic API key if not done; test with npm run ui</w:t>
+        <w:t>Phase 5: build PM orchestrator loop in agents/project-manager.js</w:t>
       </w:r>
     </w:p>
     <w:p>
@@ -3096,7 +2621,7 @@
         <w:pStyle w:val="ListNumber"/>
       </w:pPr>
       <w:r>
-        <w:t>Install Python dependencies for Phase 3: pip install faster-whisper silero-vad openwakeword loguru sounddevice</w:t>
+        <w:t>Phase 5: wire task:dispatched/done/failed bus events to terminalStatus in state.json</w:t>
       </w:r>
     </w:p>
     <w:p>
@@ -3104,7 +2629,7 @@
         <w:pStyle w:val="ListNumber"/>
       </w:pPr>
       <w:r>
-        <w:t>Build voice/vad.py — mic capture + silero-vad speech detection</w:t>
+        <w:t>Phase 6: add error handling + retry logic on Claude API calls</w:t>
       </w:r>
     </w:p>
     <w:p>
@@ -3112,7 +2637,7 @@
         <w:pStyle w:val="ListNumber"/>
       </w:pPr>
       <w:r>
-        <w:t>Build voice/transcriber.py — faster-whisper wrapper, target &lt; 2s latency</w:t>
+        <w:t>Phase 6: write docs/QUICKSTART.md onboarding guide</w:t>
       </w:r>
     </w:p>
     <w:p>
@@ -3120,31 +2645,7 @@
         <w:pStyle w:val="ListNumber"/>
       </w:pPr>
       <w:r>
-        <w:t>Build bridge/hotkey-fallback.js — F5 push-to-talk trigger</w:t>
-      </w:r>
-    </w:p>
-    <w:p>
-      <w:pPr>
-        <w:pStyle w:val="ListNumber"/>
-      </w:pPr>
-      <w:r>
-        <w:t>Build voice/wake-word.py — openWakeWord "Hey Forge" trigger</w:t>
-      </w:r>
-    </w:p>
-    <w:p>
-      <w:pPr>
-        <w:pStyle w:val="ListNumber"/>
-      </w:pPr>
-      <w:r>
-        <w:t>Build voice/tts.py — optional TTS via ElevenLabs or macOS say</w:t>
-      </w:r>
-    </w:p>
-    <w:p>
-      <w:pPr>
-        <w:pStyle w:val="ListNumber"/>
-      </w:pPr>
-      <w:r>
-        <w:t>Test: hold F5, speak, release → transcribed text sent to active agent in TUI</w:t>
+        <w:t>Phase 6: record end-to-end demo — build a CRUD API using only TerminalForge</w:t>
       </w:r>
     </w:p>
     <w:p>
@@ -3237,7 +2738,7 @@
           </w:tcPr>
           <w:p>
             <w:r>
-              <w:t>✅ Done</w:t>
+              <w:t>✅ Done — updated with voice helpers</w:t>
             </w:r>
           </w:p>
         </w:tc>
@@ -3269,7 +2770,7 @@
           </w:tcPr>
           <w:p>
             <w:r>
-              <w:t>✅ Done</w:t>
+              <w:t>✅ Done — updated with /voice endpoints</w:t>
             </w:r>
           </w:p>
         </w:tc>
@@ -3537,7 +3038,7 @@
           </w:tcPr>
           <w:p>
             <w:r>
-              <w:t>TUI entry point</w:t>
+              <w:t>Startup script</w:t>
             </w:r>
           </w:p>
         </w:tc>
@@ -3547,7 +3048,7 @@
           </w:tcPr>
           <w:p>
             <w:r>
-              <w:t>scripts/ui.js</w:t>
+              <w:t>scripts/start.sh, start.sh</w:t>
             </w:r>
           </w:p>
         </w:tc>
@@ -3557,7 +3058,7 @@
           </w:tcPr>
           <w:p>
             <w:r>
-              <w:t>✅ Done — npm run ui</w:t>
+              <w:t>✅ Done — one-command launcher</w:t>
             </w:r>
           </w:p>
         </w:tc>
@@ -3569,7 +3070,7 @@
           </w:tcPr>
           <w:p>
             <w:r>
-              <w:t>TUI root component</w:t>
+              <w:t>TUI entry point</w:t>
             </w:r>
           </w:p>
         </w:tc>
@@ -3579,7 +3080,7 @@
           </w:tcPr>
           <w:p>
             <w:r>
-              <w:t>ui/App.jsx</w:t>
+              <w:t>scripts/ui.js</w:t>
             </w:r>
           </w:p>
         </w:tc>
@@ -3589,7 +3090,7 @@
           </w:tcPr>
           <w:p>
             <w:r>
-              <w:t>✅ Done — Phase 4</w:t>
+              <w:t>✅ Done</w:t>
             </w:r>
           </w:p>
         </w:tc>
@@ -3601,7 +3102,7 @@
           </w:tcPr>
           <w:p>
             <w:r>
-              <w:t>TUI agent pane</w:t>
+              <w:t>TUI root</w:t>
             </w:r>
           </w:p>
         </w:tc>
@@ -3611,7 +3112,7 @@
           </w:tcPr>
           <w:p>
             <w:r>
-              <w:t>ui/AgentPane.jsx</w:t>
+              <w:t>ui/App.jsx</w:t>
             </w:r>
           </w:p>
         </w:tc>
@@ -3621,7 +3122,7 @@
           </w:tcPr>
           <w:p>
             <w:r>
-              <w:t>✅ Done — Phase 4</w:t>
+              <w:t>✅ Done — updated with voice polling</w:t>
             </w:r>
           </w:p>
         </w:tc>
@@ -3633,7 +3134,7 @@
           </w:tcPr>
           <w:p>
             <w:r>
-              <w:t>TUI status bar</w:t>
+              <w:t>TUI agent pane</w:t>
             </w:r>
           </w:p>
         </w:tc>
@@ -3643,7 +3144,7 @@
           </w:tcPr>
           <w:p>
             <w:r>
-              <w:t>ui/StatusBar.jsx</w:t>
+              <w:t>ui/AgentPane.jsx</w:t>
             </w:r>
           </w:p>
         </w:tc>
@@ -3653,7 +3154,7 @@
           </w:tcPr>
           <w:p>
             <w:r>
-              <w:t>✅ Done — Phase 4</w:t>
+              <w:t>✅ Done</w:t>
             </w:r>
           </w:p>
         </w:tc>
@@ -3665,7 +3166,7 @@
           </w:tcPr>
           <w:p>
             <w:r>
-              <w:t>TUI bus monitor panel</w:t>
+              <w:t>TUI status bar</w:t>
             </w:r>
           </w:p>
         </w:tc>
@@ -3675,7 +3176,7 @@
           </w:tcPr>
           <w:p>
             <w:r>
-              <w:t>ui/BusMonitorPanel.jsx</w:t>
+              <w:t>ui/StatusBar.jsx</w:t>
             </w:r>
           </w:p>
         </w:tc>
@@ -3685,7 +3186,7 @@
           </w:tcPr>
           <w:p>
             <w:r>
-              <w:t>✅ Done — Phase 4</w:t>
+              <w:t>✅ Done — updated with voice indicator</w:t>
             </w:r>
           </w:p>
         </w:tc>
@@ -3697,7 +3198,7 @@
           </w:tcPr>
           <w:p>
             <w:r>
-              <w:t>TUI colour manager</w:t>
+              <w:t>TUI bus panel</w:t>
             </w:r>
           </w:p>
         </w:tc>
@@ -3707,7 +3208,7 @@
           </w:tcPr>
           <w:p>
             <w:r>
-              <w:t>ui/TerminalColorManager.jsx</w:t>
+              <w:t>ui/BusMonitorPanel.jsx</w:t>
             </w:r>
           </w:p>
         </w:tc>
@@ -3717,7 +3218,7 @@
           </w:tcPr>
           <w:p>
             <w:r>
-              <w:t>✅ Done — Phase 4</w:t>
+              <w:t>✅ Done</w:t>
             </w:r>
           </w:p>
         </w:tc>
@@ -3729,7 +3230,7 @@
           </w:tcPr>
           <w:p>
             <w:r>
-              <w:t>Phase 1 tests</w:t>
+              <w:t>TUI colour manager</w:t>
             </w:r>
           </w:p>
         </w:tc>
@@ -3739,7 +3240,7 @@
           </w:tcPr>
           <w:p>
             <w:r>
-              <w:t>tests/test-switch.js</w:t>
+              <w:t>ui/TerminalColorManager.jsx</w:t>
             </w:r>
           </w:p>
         </w:tc>
@@ -3749,7 +3250,7 @@
           </w:tcPr>
           <w:p>
             <w:r>
-              <w:t>✅ 19 passing</w:t>
+              <w:t>✅ Done</w:t>
             </w:r>
           </w:p>
         </w:tc>
@@ -3761,7 +3262,7 @@
           </w:tcPr>
           <w:p>
             <w:r>
-              <w:t>Phase 2 tests</w:t>
+              <w:t>Voice pipeline</w:t>
             </w:r>
           </w:p>
         </w:tc>
@@ -3771,7 +3272,7 @@
           </w:tcPr>
           <w:p>
             <w:r>
-              <w:t>tests/test-agents.js</w:t>
+              <w:t>voice/pipeline.py</w:t>
             </w:r>
           </w:p>
         </w:tc>
@@ -3781,7 +3282,7 @@
           </w:tcPr>
           <w:p>
             <w:r>
-              <w:t>✅ 47 passing</w:t>
+              <w:t>✅ Done — Phase 3</w:t>
             </w:r>
           </w:p>
         </w:tc>
@@ -3793,7 +3294,7 @@
           </w:tcPr>
           <w:p>
             <w:r>
-              <w:t>Voice pipeline</w:t>
+              <w:t>Voice transcriber</w:t>
             </w:r>
           </w:p>
         </w:tc>
@@ -3803,7 +3304,7 @@
           </w:tcPr>
           <w:p>
             <w:r>
-              <w:t>voice/*.py</w:t>
+              <w:t>voice/transcriber.py</w:t>
             </w:r>
           </w:p>
         </w:tc>
@@ -3813,7 +3314,7 @@
           </w:tcPr>
           <w:p>
             <w:r>
-              <w:t>🔜 Phase 3</w:t>
+              <w:t>✅ Done — Phase 3</w:t>
             </w:r>
           </w:p>
         </w:tc>
@@ -3825,6 +3326,102 @@
           </w:tcPr>
           <w:p>
             <w:r>
+              <w:t>Voice VAD</w:t>
+            </w:r>
+          </w:p>
+        </w:tc>
+        <w:tc>
+          <w:tcPr>
+            <w:tcW w:type="dxa" w:w="2880"/>
+          </w:tcPr>
+          <w:p>
+            <w:r>
+              <w:t>voice/vad.py</w:t>
+            </w:r>
+          </w:p>
+        </w:tc>
+        <w:tc>
+          <w:tcPr>
+            <w:tcW w:type="dxa" w:w="2880"/>
+          </w:tcPr>
+          <w:p>
+            <w:r>
+              <w:t>✅ Done — Phase 3</w:t>
+            </w:r>
+          </w:p>
+        </w:tc>
+      </w:tr>
+      <w:tr>
+        <w:tc>
+          <w:tcPr>
+            <w:tcW w:type="dxa" w:w="2880"/>
+          </w:tcPr>
+          <w:p>
+            <w:r>
+              <w:t>Voice wake word</w:t>
+            </w:r>
+          </w:p>
+        </w:tc>
+        <w:tc>
+          <w:tcPr>
+            <w:tcW w:type="dxa" w:w="2880"/>
+          </w:tcPr>
+          <w:p>
+            <w:r>
+              <w:t>voice/wake-word.py</w:t>
+            </w:r>
+          </w:p>
+        </w:tc>
+        <w:tc>
+          <w:tcPr>
+            <w:tcW w:type="dxa" w:w="2880"/>
+          </w:tcPr>
+          <w:p>
+            <w:r>
+              <w:t>✅ Done — Phase 3</w:t>
+            </w:r>
+          </w:p>
+        </w:tc>
+      </w:tr>
+      <w:tr>
+        <w:tc>
+          <w:tcPr>
+            <w:tcW w:type="dxa" w:w="2880"/>
+          </w:tcPr>
+          <w:p>
+            <w:r>
+              <w:t>Voice TTS</w:t>
+            </w:r>
+          </w:p>
+        </w:tc>
+        <w:tc>
+          <w:tcPr>
+            <w:tcW w:type="dxa" w:w="2880"/>
+          </w:tcPr>
+          <w:p>
+            <w:r>
+              <w:t>voice/tts.py</w:t>
+            </w:r>
+          </w:p>
+        </w:tc>
+        <w:tc>
+          <w:tcPr>
+            <w:tcW w:type="dxa" w:w="2880"/>
+          </w:tcPr>
+          <w:p>
+            <w:r>
+              <w:t>✅ Done — Phase 3</w:t>
+            </w:r>
+          </w:p>
+        </w:tc>
+      </w:tr>
+      <w:tr>
+        <w:tc>
+          <w:tcPr>
+            <w:tcW w:type="dxa" w:w="2880"/>
+          </w:tcPr>
+          <w:p>
+            <w:r>
               <w:t>Hotkey fallback</w:t>
             </w:r>
           </w:p>
@@ -3845,7 +3442,103 @@
           </w:tcPr>
           <w:p>
             <w:r>
-              <w:t>🔜 Phase 3</w:t>
+              <w:t>✅ Done — Phase 3</w:t>
+            </w:r>
+          </w:p>
+        </w:tc>
+      </w:tr>
+      <w:tr>
+        <w:tc>
+          <w:tcPr>
+            <w:tcW w:type="dxa" w:w="2880"/>
+          </w:tcPr>
+          <w:p>
+            <w:r>
+              <w:t>Python deps</w:t>
+            </w:r>
+          </w:p>
+        </w:tc>
+        <w:tc>
+          <w:tcPr>
+            <w:tcW w:type="dxa" w:w="2880"/>
+          </w:tcPr>
+          <w:p>
+            <w:r>
+              <w:t>requirements.txt</w:t>
+            </w:r>
+          </w:p>
+        </w:tc>
+        <w:tc>
+          <w:tcPr>
+            <w:tcW w:type="dxa" w:w="2880"/>
+          </w:tcPr>
+          <w:p>
+            <w:r>
+              <w:t>✅ Done — Phase 3</w:t>
+            </w:r>
+          </w:p>
+        </w:tc>
+      </w:tr>
+      <w:tr>
+        <w:tc>
+          <w:tcPr>
+            <w:tcW w:type="dxa" w:w="2880"/>
+          </w:tcPr>
+          <w:p>
+            <w:r>
+              <w:t>Phase 1 tests</w:t>
+            </w:r>
+          </w:p>
+        </w:tc>
+        <w:tc>
+          <w:tcPr>
+            <w:tcW w:type="dxa" w:w="2880"/>
+          </w:tcPr>
+          <w:p>
+            <w:r>
+              <w:t>tests/test-switch.js</w:t>
+            </w:r>
+          </w:p>
+        </w:tc>
+        <w:tc>
+          <w:tcPr>
+            <w:tcW w:type="dxa" w:w="2880"/>
+          </w:tcPr>
+          <w:p>
+            <w:r>
+              <w:t>✅ 19 passing</w:t>
+            </w:r>
+          </w:p>
+        </w:tc>
+      </w:tr>
+      <w:tr>
+        <w:tc>
+          <w:tcPr>
+            <w:tcW w:type="dxa" w:w="2880"/>
+          </w:tcPr>
+          <w:p>
+            <w:r>
+              <w:t>Phase 2 tests</w:t>
+            </w:r>
+          </w:p>
+        </w:tc>
+        <w:tc>
+          <w:tcPr>
+            <w:tcW w:type="dxa" w:w="2880"/>
+          </w:tcPr>
+          <w:p>
+            <w:r>
+              <w:t>tests/test-agents.js</w:t>
+            </w:r>
+          </w:p>
+        </w:tc>
+        <w:tc>
+          <w:tcPr>
+            <w:tcW w:type="dxa" w:w="2880"/>
+          </w:tcPr>
+          <w:p>
+            <w:r>
+              <w:t>✅ 47 passing</w:t>
             </w:r>
           </w:p>
         </w:tc>
@@ -3893,11 +3586,6 @@
           <w:color w:val="1F497D"/>
         </w:rPr>
         <w:t>12B. End-to-End Test Results (May 2026)</w:t>
-      </w:r>
-    </w:p>
-    <w:p>
-      <w:r>
-        <w:t>Full live test suite run against the real stack using the real Claude API. All 8 test areas verified.</w:t>
       </w:r>
     </w:p>
     <w:tbl>
@@ -4027,7 +3715,7 @@
           </w:tcPr>
           <w:p>
             <w:r>
-              <w:t>/health, /volume (down/up/hold), /state, 300ms debounce all working</w:t>
+              <w:t>/health, /volume (down/up/hold), /state, 300ms debounce</w:t>
             </w:r>
           </w:p>
         </w:tc>
@@ -4079,7 +3767,7 @@
           </w:tcPr>
           <w:p>
             <w:r>
-              <w:t>T1 1797ms · T2 1666ms · T3 2211ms · T4 2264ms · T5 2371ms — correct identity on all</w:t>
+              <w:t>T1 1797ms · T2 1666ms · T3 2211ms · T4 2264ms · T5 2371ms</w:t>
             </w:r>
           </w:p>
         </w:tc>
@@ -4131,7 +3819,7 @@
           </w:tcPr>
           <w:p>
             <w:r>
-              <w:t>/msg, /reply, targeted delivery, subscribeAll fan-out, all 3 validation rejections correct</w:t>
+              <w:t>/msg, /reply, targeted delivery, subscribeAll, validation</w:t>
             </w:r>
           </w:p>
         </w:tc>
@@ -4183,7 +3871,7 @@
           </w:tcPr>
           <w:p>
             <w:r>
-              <w:t>publish/subscribe/readLog/getUnread; invalid agent, type, and empty payload all rejected</w:t>
+              <w:t>publish/subscribe/readLog/getUnread; all validation rejections</w:t>
             </w:r>
           </w:p>
         </w:tc>
@@ -4235,7 +3923,7 @@
           </w:tcPr>
           <w:p>
             <w:r>
-              <w:t>PROJECT, GIT, TASKS, MESSAGES, HANDOFF sections present on every agent call</w:t>
+              <w:t>PROJECT, GIT, TASKS, MESSAGES, HANDOFF sections injected</w:t>
             </w:r>
           </w:p>
         </w:tc>
@@ -4287,7 +3975,7 @@
           </w:tcPr>
           <w:p>
             <w:r>
-              <w:t>History replay (last 20 msgs), live subscribeAll, 500ms cross-process file poll</w:t>
+              <w:t>History replay, live subscribeAll, 500ms cross-process poll</w:t>
             </w:r>
           </w:p>
         </w:tc>
@@ -4339,7 +4027,7 @@
           </w:tcPr>
           <w:p>
             <w:r>
-              <w:t>DOWN 1→2→3→4→5→1, UP 1→5→4→3→2→1→5, HOLD manual↔auto, 100ms debounce</w:t>
+              <w:t>DOWN 1→2→3→4→5→1, UP wraparound, HOLD toggle, debounce</w:t>
             </w:r>
           </w:p>
         </w:tc>
@@ -4391,7 +4079,7 @@
           </w:tcPr>
           <w:p>
             <w:r>
-              <w:t>Complete PM→JuniorDev→SeniorDev pipeline with real Claude API calls</w:t>
+              <w:t>PM→JuniorDev→SeniorDev with real Claude API calls</w:t>
             </w:r>
           </w:p>
         </w:tc>
@@ -4401,11 +4089,9 @@
     <w:p>
       <w:r>
         <w:t>Total verified checks: 91 (19 Phase 1 + 47 Phase 2 + 25 E2E pipeline)</w:t>
-      </w:r>
-    </w:p>
-    <w:p>
-      <w:r>
-        <w:t>Pipeline trace: PM (T5) called Claude → task published to junior-dev (taskId: task-e2e-001) → Junior Dev context injected unread task → Junior Dev (T1) called Claude, wrote implementation + unit test, escalated → escalation published to senior-dev → Senior Dev (T2) called Claude, reviewed and approved. Zero regressions.</w:t>
+        <w:br/>
+        <w:br/>
+        <w:t>E2E pipeline: PM (T5) created task via Claude → published to junior-dev (taskId: task-e2e-001) → Junior Dev built implementation + escalated → Senior Dev reviewed and approved. Zero regressions.</w:t>
       </w:r>
     </w:p>
     <w:p>
@@ -4419,9 +4105,214 @@
         <w:t>12C. Phase 4 TUI Build — Complete (May 2026)</w:t>
       </w:r>
     </w:p>
+    <w:tbl>
+      <w:tblPr>
+        <w:tblStyle w:val="TableGrid"/>
+        <w:tblW w:type="auto" w:w="0"/>
+        <w:tblLook w:firstColumn="1" w:firstRow="1" w:lastColumn="0" w:lastRow="0" w:noHBand="0" w:noVBand="1" w:val="04A0"/>
+      </w:tblPr>
+      <w:tblGrid>
+        <w:gridCol w:w="4320"/>
+        <w:gridCol w:w="4320"/>
+      </w:tblGrid>
+      <w:tr>
+        <w:tc>
+          <w:tcPr>
+            <w:tcW w:type="dxa" w:w="4320"/>
+          </w:tcPr>
+          <w:p>
+            <w:r>
+              <w:rPr>
+                <w:b/>
+              </w:rPr>
+              <w:t>File</w:t>
+            </w:r>
+          </w:p>
+        </w:tc>
+        <w:tc>
+          <w:tcPr>
+            <w:tcW w:type="dxa" w:w="4320"/>
+          </w:tcPr>
+          <w:p>
+            <w:r>
+              <w:rPr>
+                <w:b/>
+              </w:rPr>
+              <w:t>What It Does</w:t>
+            </w:r>
+          </w:p>
+        </w:tc>
+      </w:tr>
+      <w:tr>
+        <w:tc>
+          <w:tcPr>
+            <w:tcW w:type="dxa" w:w="4320"/>
+          </w:tcPr>
+          <w:p>
+            <w:r>
+              <w:t>ui/App.jsx</w:t>
+            </w:r>
+          </w:p>
+        </w:tc>
+        <w:tc>
+          <w:tcPr>
+            <w:tcW w:type="dxa" w:w="4320"/>
+          </w:tcPr>
+          <w:p>
+            <w:r>
+              <w:t>Root component. All state: conversations, activeTerminal, mode, terminalStatus, inputValue, isProcessing, busMessages, voiceStatus. Handles /clear /status /msg /reply and normal prompts. Tab/Shift+Tab navigation. 1s state.json poll + 500ms voice_input.json poll.</w:t>
+            </w:r>
+          </w:p>
+        </w:tc>
+      </w:tr>
+      <w:tr>
+        <w:tc>
+          <w:tcPr>
+            <w:tcW w:type="dxa" w:w="4320"/>
+          </w:tcPr>
+          <w:p>
+            <w:r>
+              <w:t>ui/AgentPane.jsx</w:t>
+            </w:r>
+          </w:p>
+        </w:tc>
+        <w:tc>
+          <w:tcPr>
+            <w:tcW w:type="dxa" w:w="4320"/>
+          </w:tcPr>
+          <w:p>
+            <w:r>
+              <w:t>Active: double border, 36% width, TextInput, full conversation. Inactive: single border, compact, last 8 lines. ConvLine renders user/assistant/notification/system messages.</w:t>
+            </w:r>
+          </w:p>
+        </w:tc>
+      </w:tr>
+      <w:tr>
+        <w:tc>
+          <w:tcPr>
+            <w:tcW w:type="dxa" w:w="4320"/>
+          </w:tcPr>
+          <w:p>
+            <w:r>
+              <w:t>ui/StatusBar.jsx</w:t>
+            </w:r>
+          </w:p>
+        </w:tc>
+        <w:tc>
+          <w:tcPr>
+            <w:tcW w:type="dxa" w:w="4320"/>
+          </w:tcPr>
+          <w:p>
+            <w:r>
+              <w:t>Top bar: brand, MANUAL/AUTO badge, active agent, 5 status dots, message count, voice indicator, key hints.</w:t>
+            </w:r>
+          </w:p>
+        </w:tc>
+      </w:tr>
+      <w:tr>
+        <w:tc>
+          <w:tcPr>
+            <w:tcW w:type="dxa" w:w="4320"/>
+          </w:tcPr>
+          <w:p>
+            <w:r>
+              <w:t>ui/BusMonitorPanel.jsx</w:t>
+            </w:r>
+          </w:p>
+        </w:tc>
+        <w:tc>
+          <w:tcPr>
+            <w:tcW w:type="dxa" w:w="4320"/>
+          </w:tcPr>
+          <w:p>
+            <w:r>
+              <w:t>Right panel (12%): live feed of all bus messages — timestamp, from/to emojis, type label, payload preview.</w:t>
+            </w:r>
+          </w:p>
+        </w:tc>
+      </w:tr>
+      <w:tr>
+        <w:tc>
+          <w:tcPr>
+            <w:tcW w:type="dxa" w:w="4320"/>
+          </w:tcPr>
+          <w:p>
+            <w:r>
+              <w:t>ui/TerminalColorManager.jsx</w:t>
+            </w:r>
+          </w:p>
+        </w:tc>
+        <w:tc>
+          <w:tcPr>
+            <w:tcW w:type="dxa" w:w="4320"/>
+          </w:tcPr>
+          <w:p>
+            <w:r>
+              <w:t>AGENT_INFO map + STATUS_STYLES map. getAgentInfo() and getStatusStyle() helpers.</w:t>
+            </w:r>
+          </w:p>
+        </w:tc>
+      </w:tr>
+      <w:tr>
+        <w:tc>
+          <w:tcPr>
+            <w:tcW w:type="dxa" w:w="4320"/>
+          </w:tcPr>
+          <w:p>
+            <w:r>
+              <w:t>scripts/ui.js</w:t>
+            </w:r>
+          </w:p>
+        </w:tc>
+        <w:tc>
+          <w:tcPr>
+            <w:tcW w:type="dxa" w:w="4320"/>
+          </w:tcPr>
+          <w:p>
+            <w:r>
+              <w:t>Entry point: dotenv, API key check, cursor hide, render(&lt;App&gt;), cursor restore on exit.</w:t>
+            </w:r>
+          </w:p>
+        </w:tc>
+      </w:tr>
+      <w:tr>
+        <w:tc>
+          <w:tcPr>
+            <w:tcW w:type="dxa" w:w="4320"/>
+          </w:tcPr>
+          <w:p>
+            <w:r>
+              <w:t>tsconfig.json</w:t>
+            </w:r>
+          </w:p>
+        </w:tc>
+        <w:tc>
+          <w:tcPr>
+            <w:tcW w:type="dxa" w:w="4320"/>
+          </w:tcPr>
+          <w:p>
+            <w:r>
+              <w:t>"jsx": "react-jsx", "jsxImportSource": "react", "module": "ESNext", "allowJs": true.</w:t>
+            </w:r>
+          </w:p>
+        </w:tc>
+      </w:tr>
+    </w:tbl>
+    <w:p/>
+    <w:p>
+      <w:pPr>
+        <w:pStyle w:val="Heading1"/>
+      </w:pPr>
+      <w:r>
+        <w:rPr>
+          <w:color w:val="1F497D"/>
+        </w:rPr>
+        <w:t>12D. Phase 3 Voice Layer Build — Complete (May 2026)</w:t>
+      </w:r>
+    </w:p>
     <w:p>
       <w:r>
-        <w:t>Full-screen Ink TUI built and verified. Launch with: npm run ui</w:t>
+        <w:t>Full voice pipeline. Transcription fully offline. Three modes. TUI auto-submits transcribed text to active agent.</w:t>
       </w:r>
     </w:p>
     <w:p>
@@ -4432,27 +4323,175 @@
         <w:rPr>
           <w:color w:val="1F497D"/>
         </w:rPr>
-        <w:t>Layout</w:t>
+        <w:t>Architecture</w:t>
       </w:r>
     </w:p>
     <w:p>
       <w:r>
-        <w:t>+-----+------------------------+-------+-------+-------+----------+</w:t>
-        <w:br/>
-        <w:t>| T1  |    T2 (ACTIVE)         |  T3   |  T4   |  T5   | Bus Mon  |</w:t>
-        <w:br/>
-        <w:t>| JD  | streaming output...    |  QA   |  DO   |  PM   | live     |</w:t>
-        <w:br/>
-        <w:t>|     | [T2] &gt; your prompt     |       |       |       | feed     |</w:t>
-        <w:br/>
-        <w:t>+-----+------------------------+-------+-------+-------+----------+</w:t>
+        <w:t>Mic → sounddevice InputStream → silero-vad VADIterator (512-sample @ 16kHz) → speech → faster-whisper transcribe() → POST localhost:3333/voice → bridge writes voice_input.json (atomic) → TUI polls 500ms → handleSubmit(text) on active agent</w:t>
       </w:r>
     </w:p>
     <w:p>
+      <w:pPr>
+        <w:pStyle w:val="Heading2"/>
+      </w:pPr>
       <w:r>
-        <w:t>Width allocation (&gt;= 160 cols): active pane 36%, each of 4 inactive panes 16%, bus monitor 12%. Narrower terminals use equal-width panes.</w:t>
+        <w:rPr>
+          <w:color w:val="1F497D"/>
+        </w:rPr>
+        <w:t>Three Voice Modes</w:t>
       </w:r>
     </w:p>
+    <w:tbl>
+      <w:tblPr>
+        <w:tblStyle w:val="TableGrid"/>
+        <w:tblW w:type="auto" w:w="0"/>
+        <w:tblLook w:firstColumn="1" w:firstRow="1" w:lastColumn="0" w:lastRow="0" w:noHBand="0" w:noVBand="1" w:val="04A0"/>
+      </w:tblPr>
+      <w:tblGrid>
+        <w:gridCol w:w="2880"/>
+        <w:gridCol w:w="2880"/>
+        <w:gridCol w:w="2880"/>
+      </w:tblGrid>
+      <w:tr>
+        <w:tc>
+          <w:tcPr>
+            <w:tcW w:type="dxa" w:w="2880"/>
+          </w:tcPr>
+          <w:p>
+            <w:r>
+              <w:rPr>
+                <w:b/>
+              </w:rPr>
+              <w:t>Mode</w:t>
+            </w:r>
+          </w:p>
+        </w:tc>
+        <w:tc>
+          <w:tcPr>
+            <w:tcW w:type="dxa" w:w="2880"/>
+          </w:tcPr>
+          <w:p>
+            <w:r>
+              <w:rPr>
+                <w:b/>
+              </w:rPr>
+              <w:t>Command</w:t>
+            </w:r>
+          </w:p>
+        </w:tc>
+        <w:tc>
+          <w:tcPr>
+            <w:tcW w:type="dxa" w:w="2880"/>
+          </w:tcPr>
+          <w:p>
+            <w:r>
+              <w:rPr>
+                <w:b/>
+              </w:rPr>
+              <w:t>How It Works</w:t>
+            </w:r>
+          </w:p>
+        </w:tc>
+      </w:tr>
+      <w:tr>
+        <w:tc>
+          <w:tcPr>
+            <w:tcW w:type="dxa" w:w="2880"/>
+          </w:tcPr>
+          <w:p>
+            <w:r>
+              <w:t>push-to-talk</w:t>
+            </w:r>
+          </w:p>
+        </w:tc>
+        <w:tc>
+          <w:tcPr>
+            <w:tcW w:type="dxa" w:w="2880"/>
+          </w:tcPr>
+          <w:p>
+            <w:r>
+              <w:t>npm run voice + npm run voice:hotkey</w:t>
+            </w:r>
+          </w:p>
+        </w:tc>
+        <w:tc>
+          <w:tcPr>
+            <w:tcW w:type="dxa" w:w="2880"/>
+          </w:tcPr>
+          <w:p>
+            <w:r>
+              <w:t>Spacebar/R/F5 in hotkey terminal toggles voice_state.json recording flag</w:t>
+            </w:r>
+          </w:p>
+        </w:tc>
+      </w:tr>
+      <w:tr>
+        <w:tc>
+          <w:tcPr>
+            <w:tcW w:type="dxa" w:w="2880"/>
+          </w:tcPr>
+          <w:p>
+            <w:r>
+              <w:t>auto-vad</w:t>
+            </w:r>
+          </w:p>
+        </w:tc>
+        <w:tc>
+          <w:tcPr>
+            <w:tcW w:type="dxa" w:w="2880"/>
+          </w:tcPr>
+          <w:p>
+            <w:r>
+              <w:t>npm run voice:auto</w:t>
+            </w:r>
+          </w:p>
+        </w:tc>
+        <w:tc>
+          <w:tcPr>
+            <w:tcW w:type="dxa" w:w="2880"/>
+          </w:tcPr>
+          <w:p>
+            <w:r>
+              <w:t>silero-vad runs continuously; 1.5s silence ends utterance</w:t>
+            </w:r>
+          </w:p>
+        </w:tc>
+      </w:tr>
+      <w:tr>
+        <w:tc>
+          <w:tcPr>
+            <w:tcW w:type="dxa" w:w="2880"/>
+          </w:tcPr>
+          <w:p>
+            <w:r>
+              <w:t>wake-word</w:t>
+            </w:r>
+          </w:p>
+        </w:tc>
+        <w:tc>
+          <w:tcPr>
+            <w:tcW w:type="dxa" w:w="2880"/>
+          </w:tcPr>
+          <w:p>
+            <w:r>
+              <w:t>npm run voice:wake</w:t>
+            </w:r>
+          </w:p>
+        </w:tc>
+        <w:tc>
+          <w:tcPr>
+            <w:tcW w:type="dxa" w:w="2880"/>
+          </w:tcPr>
+          <w:p>
+            <w:r>
+              <w:t>openWakeWord listens for "Hey Forge"; on detect, records one utterance</w:t>
+            </w:r>
+          </w:p>
+        </w:tc>
+      </w:tr>
+    </w:tbl>
+    <w:p/>
     <w:p>
       <w:pPr>
         <w:pStyle w:val="Heading2"/>
@@ -4509,7 +4548,7 @@
           </w:tcPr>
           <w:p>
             <w:r>
-              <w:t>ui/App.jsx</w:t>
+              <w:t>voice/pipeline.py</w:t>
             </w:r>
           </w:p>
         </w:tc>
@@ -4519,7 +4558,7 @@
           </w:tcPr>
           <w:p>
             <w:r>
-              <w:t>Root component — all state (conversations, activeTerminal, mode, terminalStatus, inputValue, isProcessing, busMessages). Handles /clear, /status, /msg, /reply, normal prompts with streaming. Tab/Shift+Tab navigation. 1s state.json poll for bridge vol-button events.</w:t>
+              <w:t>Loads transcriber, runs mode loop, POSTs to localhost:3333/voice. Args: --mode, --model, --debug.</w:t>
             </w:r>
           </w:p>
         </w:tc>
@@ -4531,7 +4570,7 @@
           </w:tcPr>
           <w:p>
             <w:r>
-              <w:t>ui/AgentPane.jsx</w:t>
+              <w:t>voice/transcriber.py</w:t>
             </w:r>
           </w:p>
         </w:tc>
@@ -4541,7 +4580,7 @@
           </w:tcPr>
           <w:p>
             <w:r>
-              <w:t>Active: double border, 36% width, TextInput, full conversation. Inactive: single border, compact, last 8 lines. ConvLine renders user (cyan), assistant (white), notification (yellow banner), system (green/red).</w:t>
+              <w:t>WhisperModel (base.en, int8 CPU). transcribe(np.ndarray) → str. Built-in vad_filter.</w:t>
             </w:r>
           </w:p>
         </w:tc>
@@ -4553,7 +4592,7 @@
           </w:tcPr>
           <w:p>
             <w:r>
-              <w:t>ui/StatusBar.jsx</w:t>
+              <w:t>voice/vad.py</w:t>
             </w:r>
           </w:p>
         </w:tc>
@@ -4563,7 +4602,7 @@
           </w:tcPr>
           <w:p>
             <w:r>
-              <w:t>Top bar (1 line) — brand, MANUAL/AUTO badge, active agent name+emoji, 5 mini status dots, message count, Tab/Enter/Ctrl+C hints.</w:t>
+              <w:t>record_push_to_talk (polls voice_state.json). record_auto_vad (VADIterator streaming, 512-sample chunks).</w:t>
             </w:r>
           </w:p>
         </w:tc>
@@ -4575,7 +4614,7 @@
           </w:tcPr>
           <w:p>
             <w:r>
-              <w:t>ui/BusMonitorPanel.jsx</w:t>
+              <w:t>voice/wake-word.py</w:t>
             </w:r>
           </w:p>
         </w:tc>
@@ -4585,7 +4624,7 @@
           </w:tcPr>
           <w:p>
             <w:r>
-              <w:t>Right panel (12% width) — scrollable live feed of all inter-agent bus messages. Timestamp, from→to emojis, type label, payload preview.</w:t>
+              <w:t>WakeWordDetector. openwakeword.model.Model. Falls back to "alexa" if "hey_forge" not trained.</w:t>
             </w:r>
           </w:p>
         </w:tc>
@@ -4597,7 +4636,7 @@
           </w:tcPr>
           <w:p>
             <w:r>
-              <w:t>ui/TerminalColorManager.jsx</w:t>
+              <w:t>voice/tts.py</w:t>
             </w:r>
           </w:p>
         </w:tc>
@@ -4607,7 +4646,7 @@
           </w:tcPr>
           <w:p>
             <w:r>
-              <w:t>AGENT_INFO map (name, emoji, colour per terminal 1–5). STATUS_STYLES map (bgColor, label, dot per idle/working/done/failed). Helper functions getAgentInfo() and getStatusStyle().</w:t>
+              <w:t>speak(text, provider). speak_say() non-blocking Popen. speak_elevenlabs() via SDK.</w:t>
             </w:r>
           </w:p>
         </w:tc>
@@ -4619,7 +4658,7 @@
           </w:tcPr>
           <w:p>
             <w:r>
-              <w:t>scripts/ui.js</w:t>
+              <w:t>bridge/hotkey-fallback.js</w:t>
             </w:r>
           </w:p>
         </w:tc>
@@ -4629,29 +4668,7 @@
           </w:tcPr>
           <w:p>
             <w:r>
-              <w:t>Entry point — dotenv load, API key validation, cursor hide, render(&lt;App&gt;), cursor restore + screen clear on SIGINT/SIGTERM/exit.</w:t>
-            </w:r>
-          </w:p>
-        </w:tc>
-      </w:tr>
-      <w:tr>
-        <w:tc>
-          <w:tcPr>
-            <w:tcW w:type="dxa" w:w="4320"/>
-          </w:tcPr>
-          <w:p>
-            <w:r>
-              <w:t>tsconfig.json</w:t>
-            </w:r>
-          </w:p>
-        </w:tc>
-        <w:tc>
-          <w:tcPr>
-            <w:tcW w:type="dxa" w:w="4320"/>
-          </w:tcPr>
-          <w:p>
-            <w:r>
-              <w:t>Added for tsx JSX transform: "jsx": "react-jsx", "jsxImportSource": "react", "module": "ESNext", "allowJs": true.</w:t>
+              <w:t>readline raw mode. Spacebar/R/F5 toggles recording. Atomic rename write. Polls pipeline status.</w:t>
             </w:r>
           </w:p>
         </w:tc>
@@ -4666,7 +4683,7 @@
         <w:rPr>
           <w:color w:val="1F497D"/>
         </w:rPr>
-        <w:t>Dependencies Added</w:t>
+        <w:t>Python Dependencies</w:t>
       </w:r>
     </w:p>
     <w:tbl>
@@ -4728,7 +4745,7 @@
           </w:tcPr>
           <w:p>
             <w:r>
-              <w:t>ink</w:t>
+              <w:t>faster-whisper</w:t>
             </w:r>
           </w:p>
         </w:tc>
@@ -4738,7 +4755,7 @@
           </w:tcPr>
           <w:p>
             <w:r>
-              <w:t>^4.4.1</w:t>
+              <w:t>&gt;=1.0.0</w:t>
             </w:r>
           </w:p>
         </w:tc>
@@ -4748,7 +4765,7 @@
           </w:tcPr>
           <w:p>
             <w:r>
-              <w:t>React-for-terminal — Box, Text, useInput, useStdout, useStdin</w:t>
+              <w:t>Local offline STT — CTranslate2 int8</w:t>
             </w:r>
           </w:p>
         </w:tc>
@@ -4760,7 +4777,7 @@
           </w:tcPr>
           <w:p>
             <w:r>
-              <w:t>react</w:t>
+              <w:t>silero-vad</w:t>
             </w:r>
           </w:p>
         </w:tc>
@@ -4770,7 +4787,7 @@
           </w:tcPr>
           <w:p>
             <w:r>
-              <w:t>^18.3.1</w:t>
+              <w:t>&gt;=5.1.2</w:t>
             </w:r>
           </w:p>
         </w:tc>
@@ -4780,7 +4797,7 @@
           </w:tcPr>
           <w:p>
             <w:r>
-              <w:t>JSX runtime for Ink</w:t>
+              <w:t>VADIterator streaming speech detection</w:t>
             </w:r>
           </w:p>
         </w:tc>
@@ -4792,7 +4809,7 @@
           </w:tcPr>
           <w:p>
             <w:r>
-              <w:t>ink-text-input</w:t>
+              <w:t>sounddevice</w:t>
             </w:r>
           </w:p>
         </w:tc>
@@ -4802,7 +4819,7 @@
           </w:tcPr>
           <w:p>
             <w:r>
-              <w:t>^5.0.1</w:t>
+              <w:t>&gt;=0.5.1</w:t>
             </w:r>
           </w:p>
         </w:tc>
@@ -4812,7 +4829,7 @@
           </w:tcPr>
           <w:p>
             <w:r>
-              <w:t>TextInput component for active pane prompt box</w:t>
+              <w:t>Cross-platform mic capture</w:t>
             </w:r>
           </w:p>
         </w:tc>
@@ -4824,7 +4841,7 @@
           </w:tcPr>
           <w:p>
             <w:r>
-              <w:t>tsx</w:t>
+              <w:t>numpy</w:t>
             </w:r>
           </w:p>
         </w:tc>
@@ -4834,7 +4851,7 @@
           </w:tcPr>
           <w:p>
             <w:r>
-              <w:t>^4.21.0</w:t>
+              <w:t>&gt;=1.24.0</w:t>
             </w:r>
           </w:p>
         </w:tc>
@@ -4844,7 +4861,329 @@
           </w:tcPr>
           <w:p>
             <w:r>
-              <w:t>Zero-config JSX + ESM runner (npx tsx scripts/ui.js)</w:t>
+              <w:t>Audio buffer handling</w:t>
+            </w:r>
+          </w:p>
+        </w:tc>
+      </w:tr>
+      <w:tr>
+        <w:tc>
+          <w:tcPr>
+            <w:tcW w:type="dxa" w:w="2880"/>
+          </w:tcPr>
+          <w:p>
+            <w:r>
+              <w:t>loguru</w:t>
+            </w:r>
+          </w:p>
+        </w:tc>
+        <w:tc>
+          <w:tcPr>
+            <w:tcW w:type="dxa" w:w="2880"/>
+          </w:tcPr>
+          <w:p>
+            <w:r>
+              <w:t>&gt;=0.7.2</w:t>
+            </w:r>
+          </w:p>
+        </w:tc>
+        <w:tc>
+          <w:tcPr>
+            <w:tcW w:type="dxa" w:w="2880"/>
+          </w:tcPr>
+          <w:p>
+            <w:r>
+              <w:t>Logging</w:t>
+            </w:r>
+          </w:p>
+        </w:tc>
+      </w:tr>
+      <w:tr>
+        <w:tc>
+          <w:tcPr>
+            <w:tcW w:type="dxa" w:w="2880"/>
+          </w:tcPr>
+          <w:p>
+            <w:r>
+              <w:t>requests</w:t>
+            </w:r>
+          </w:p>
+        </w:tc>
+        <w:tc>
+          <w:tcPr>
+            <w:tcW w:type="dxa" w:w="2880"/>
+          </w:tcPr>
+          <w:p>
+            <w:r>
+              <w:t>&gt;=2.32.0</w:t>
+            </w:r>
+          </w:p>
+        </w:tc>
+        <w:tc>
+          <w:tcPr>
+            <w:tcW w:type="dxa" w:w="2880"/>
+          </w:tcPr>
+          <w:p>
+            <w:r>
+              <w:t>HTTP POST to bridge</w:t>
+            </w:r>
+          </w:p>
+        </w:tc>
+      </w:tr>
+      <w:tr>
+        <w:tc>
+          <w:tcPr>
+            <w:tcW w:type="dxa" w:w="2880"/>
+          </w:tcPr>
+          <w:p>
+            <w:r>
+              <w:t>openwakeword</w:t>
+            </w:r>
+          </w:p>
+        </w:tc>
+        <w:tc>
+          <w:tcPr>
+            <w:tcW w:type="dxa" w:w="2880"/>
+          </w:tcPr>
+          <w:p>
+            <w:r>
+              <w:t>&gt;=0.6.0</w:t>
+            </w:r>
+          </w:p>
+        </w:tc>
+        <w:tc>
+          <w:tcPr>
+            <w:tcW w:type="dxa" w:w="2880"/>
+          </w:tcPr>
+          <w:p>
+            <w:r>
+              <w:t>Wake word detection (optional)</w:t>
+            </w:r>
+          </w:p>
+        </w:tc>
+      </w:tr>
+    </w:tbl>
+    <w:p/>
+    <w:p>
+      <w:pPr>
+        <w:pStyle w:val="Heading1"/>
+      </w:pPr>
+      <w:r>
+        <w:rPr>
+          <w:color w:val="1F497D"/>
+        </w:rPr>
+        <w:t>12E. Startup Script — Complete (May 2026)</w:t>
+      </w:r>
+    </w:p>
+    <w:p>
+      <w:r>
+        <w:t>Single-command launcher: scripts/start.sh (symlinked as ./start.sh)</w:t>
+        <w:br/>
+        <w:br/>
+        <w:t>Run: ./start.sh or npm run go</w:t>
+        <w:br/>
+        <w:t>Options: --voice, --voice=auto, --voice=wake, --no-voice, --debug, --help</w:t>
+      </w:r>
+    </w:p>
+    <w:p>
+      <w:pPr>
+        <w:pStyle w:val="Heading2"/>
+      </w:pPr>
+      <w:r>
+        <w:rPr>
+          <w:color w:val="1F497D"/>
+        </w:rPr>
+        <w:t>7 Setup Steps</w:t>
+      </w:r>
+    </w:p>
+    <w:tbl>
+      <w:tblPr>
+        <w:tblStyle w:val="TableGrid"/>
+        <w:tblW w:type="auto" w:w="0"/>
+        <w:tblLook w:firstColumn="1" w:firstRow="1" w:lastColumn="0" w:lastRow="0" w:noHBand="0" w:noVBand="1" w:val="04A0"/>
+      </w:tblPr>
+      <w:tblGrid>
+        <w:gridCol w:w="4320"/>
+        <w:gridCol w:w="4320"/>
+      </w:tblGrid>
+      <w:tr>
+        <w:tc>
+          <w:tcPr>
+            <w:tcW w:type="dxa" w:w="4320"/>
+          </w:tcPr>
+          <w:p>
+            <w:r>
+              <w:rPr>
+                <w:b/>
+              </w:rPr>
+              <w:t>Step</w:t>
+            </w:r>
+          </w:p>
+        </w:tc>
+        <w:tc>
+          <w:tcPr>
+            <w:tcW w:type="dxa" w:w="4320"/>
+          </w:tcPr>
+          <w:p>
+            <w:r>
+              <w:rPr>
+                <w:b/>
+              </w:rPr>
+              <w:t>Action</w:t>
+            </w:r>
+          </w:p>
+        </w:tc>
+      </w:tr>
+      <w:tr>
+        <w:tc>
+          <w:tcPr>
+            <w:tcW w:type="dxa" w:w="4320"/>
+          </w:tcPr>
+          <w:p>
+            <w:r>
+              <w:t>1</w:t>
+            </w:r>
+          </w:p>
+        </w:tc>
+        <w:tc>
+          <w:tcPr>
+            <w:tcW w:type="dxa" w:w="4320"/>
+          </w:tcPr>
+          <w:p>
+            <w:r>
+              <w:t>Check Node.js &gt;= v18 — fail clearly with install link if missing</w:t>
+            </w:r>
+          </w:p>
+        </w:tc>
+      </w:tr>
+      <w:tr>
+        <w:tc>
+          <w:tcPr>
+            <w:tcW w:type="dxa" w:w="4320"/>
+          </w:tcPr>
+          <w:p>
+            <w:r>
+              <w:t>2</w:t>
+            </w:r>
+          </w:p>
+        </w:tc>
+        <w:tc>
+          <w:tcPr>
+            <w:tcW w:type="dxa" w:w="4320"/>
+          </w:tcPr>
+          <w:p>
+            <w:r>
+              <w:t>Check Python &gt;= 3.11 — silently disable voice if not found</w:t>
+            </w:r>
+          </w:p>
+        </w:tc>
+      </w:tr>
+      <w:tr>
+        <w:tc>
+          <w:tcPr>
+            <w:tcW w:type="dxa" w:w="4320"/>
+          </w:tcPr>
+          <w:p>
+            <w:r>
+              <w:t>3</w:t>
+            </w:r>
+          </w:p>
+        </w:tc>
+        <w:tc>
+          <w:tcPr>
+            <w:tcW w:type="dxa" w:w="4320"/>
+          </w:tcPr>
+          <w:p>
+            <w:r>
+              <w:t>npm install — only if node_modules missing or package.json newer</w:t>
+            </w:r>
+          </w:p>
+        </w:tc>
+      </w:tr>
+      <w:tr>
+        <w:tc>
+          <w:tcPr>
+            <w:tcW w:type="dxa" w:w="4320"/>
+          </w:tcPr>
+          <w:p>
+            <w:r>
+              <w:t>4</w:t>
+            </w:r>
+          </w:p>
+        </w:tc>
+        <w:tc>
+          <w:tcPr>
+            <w:tcW w:type="dxa" w:w="4320"/>
+          </w:tcPr>
+          <w:p>
+            <w:r>
+              <w:t>pip install — check each package individually, only install what is missing</w:t>
+            </w:r>
+          </w:p>
+        </w:tc>
+      </w:tr>
+      <w:tr>
+        <w:tc>
+          <w:tcPr>
+            <w:tcW w:type="dxa" w:w="4320"/>
+          </w:tcPr>
+          <w:p>
+            <w:r>
+              <w:t>5</w:t>
+            </w:r>
+          </w:p>
+        </w:tc>
+        <w:tc>
+          <w:tcPr>
+            <w:tcW w:type="dxa" w:w="4320"/>
+          </w:tcPr>
+          <w:p>
+            <w:r>
+              <w:t>Validate .env — must exist and ANTHROPIC_API_KEY must start with sk-</w:t>
+            </w:r>
+          </w:p>
+        </w:tc>
+      </w:tr>
+      <w:tr>
+        <w:tc>
+          <w:tcPr>
+            <w:tcW w:type="dxa" w:w="4320"/>
+          </w:tcPr>
+          <w:p>
+            <w:r>
+              <w:t>6</w:t>
+            </w:r>
+          </w:p>
+        </w:tc>
+        <w:tc>
+          <w:tcPr>
+            <w:tcW w:type="dxa" w:w="4320"/>
+          </w:tcPr>
+          <w:p>
+            <w:r>
+              <w:t>Init .terminalforge/ — create state.json if missing, reset voice_state.json, clear voice_input.json</w:t>
+            </w:r>
+          </w:p>
+        </w:tc>
+      </w:tr>
+      <w:tr>
+        <w:tc>
+          <w:tcPr>
+            <w:tcW w:type="dxa" w:w="4320"/>
+          </w:tcPr>
+          <w:p>
+            <w:r>
+              <w:t>7</w:t>
+            </w:r>
+          </w:p>
+        </w:tc>
+        <w:tc>
+          <w:tcPr>
+            <w:tcW w:type="dxa" w:w="4320"/>
+          </w:tcPr>
+          <w:p>
+            <w:r>
+              <w:t>Select voice mode — interactive menu if no --voice flag passed</w:t>
             </w:r>
           </w:p>
         </w:tc>
@@ -4859,57 +5198,320 @@
         <w:rPr>
           <w:color w:val="1F497D"/>
         </w:rPr>
-        <w:t>Key Technical Notes</w:t>
+        <w:t>Launch Sequence</w:t>
       </w:r>
     </w:p>
     <w:p>
       <w:pPr>
-        <w:pStyle w:val="ListBullet"/>
+        <w:pStyle w:val="ListNumber"/>
       </w:pPr>
       <w:r>
-        <w:t>All .jsx files (not .js) — tsx pre-pass lexer handles JSX correctly with .jsx extension + tsconfig.json</w:t>
+        <w:t>Kill any stale process on port 3333</w:t>
       </w:r>
     </w:p>
     <w:p>
       <w:pPr>
-        <w:pStyle w:val="ListBullet"/>
+        <w:pStyle w:val="ListNumber"/>
       </w:pPr>
       <w:r>
-        <w:t>All Unicode box-drawing and decorative characters replaced with ASCII for tsx lexer compatibility</w:t>
+        <w:t>Start bridge server in background — poll GET /health up to 5s to confirm it is up</w:t>
       </w:r>
     </w:p>
     <w:p>
       <w:pPr>
-        <w:pStyle w:val="ListBullet"/>
+        <w:pStyle w:val="ListNumber"/>
       </w:pPr>
       <w:r>
-        <w:t>useInput guarded with { isActive: Boolean(isRawModeSupported) } — prevents crash when stdin is not a TTY</w:t>
+        <w:t>Start voice pipeline in background (if enabled) — log to .terminalforge/voice.log</w:t>
       </w:r>
     </w:p>
     <w:p>
       <w:pPr>
-        <w:pStyle w:val="ListBullet"/>
+        <w:pStyle w:val="ListNumber"/>
       </w:pPr>
       <w:r>
-        <w:t>Streaming: adds {role:"assistant", text:"", streaming:true} placeholder, updates via setState callback in onToken, marks streaming:false on complete</w:t>
+        <w:t>Open hotkey controller in new iTerm2 tab or Terminal.app window (push-to-talk only)</w:t>
       </w:r>
     </w:p>
     <w:p>
       <w:pPr>
-        <w:pStyle w:val="ListBullet"/>
+        <w:pStyle w:val="ListNumber"/>
       </w:pPr>
       <w:r>
-        <w:t>goToTerminal writes state.json directly (not via direction-based switchTerminal) since target index is known</w:t>
+        <w:t>Start TUI in foreground — Ctrl+C triggers cleanup trap</w:t>
       </w:r>
     </w:p>
     <w:p>
       <w:pPr>
-        <w:pStyle w:val="ListBullet"/>
+        <w:pStyle w:val="Heading2"/>
       </w:pPr>
       <w:r>
-        <w:t>1s state polling picks up bridge server vol-button changes while TUI is running</w:t>
+        <w:rPr>
+          <w:color w:val="1F497D"/>
+        </w:rPr>
+        <w:t>npm Scripts Added</w:t>
       </w:r>
     </w:p>
+    <w:tbl>
+      <w:tblPr>
+        <w:tblStyle w:val="TableGrid"/>
+        <w:tblW w:type="auto" w:w="0"/>
+        <w:tblLook w:firstColumn="1" w:firstRow="1" w:lastColumn="0" w:lastRow="0" w:noHBand="0" w:noVBand="1" w:val="04A0"/>
+      </w:tblPr>
+      <w:tblGrid>
+        <w:gridCol w:w="4320"/>
+        <w:gridCol w:w="4320"/>
+      </w:tblGrid>
+      <w:tr>
+        <w:tc>
+          <w:tcPr>
+            <w:tcW w:type="dxa" w:w="4320"/>
+          </w:tcPr>
+          <w:p>
+            <w:r>
+              <w:rPr>
+                <w:b/>
+              </w:rPr>
+              <w:t>Command</w:t>
+            </w:r>
+          </w:p>
+        </w:tc>
+        <w:tc>
+          <w:tcPr>
+            <w:tcW w:type="dxa" w:w="4320"/>
+          </w:tcPr>
+          <w:p>
+            <w:r>
+              <w:rPr>
+                <w:b/>
+              </w:rPr>
+              <w:t>What It Does</w:t>
+            </w:r>
+          </w:p>
+        </w:tc>
+      </w:tr>
+      <w:tr>
+        <w:tc>
+          <w:tcPr>
+            <w:tcW w:type="dxa" w:w="4320"/>
+          </w:tcPr>
+          <w:p>
+            <w:r>
+              <w:t>npm run go</w:t>
+            </w:r>
+          </w:p>
+        </w:tc>
+        <w:tc>
+          <w:tcPr>
+            <w:tcW w:type="dxa" w:w="4320"/>
+          </w:tcPr>
+          <w:p>
+            <w:r>
+              <w:t>./start.sh — interactive</w:t>
+            </w:r>
+          </w:p>
+        </w:tc>
+      </w:tr>
+      <w:tr>
+        <w:tc>
+          <w:tcPr>
+            <w:tcW w:type="dxa" w:w="4320"/>
+          </w:tcPr>
+          <w:p>
+            <w:r>
+              <w:t>npm run go:voice</w:t>
+            </w:r>
+          </w:p>
+        </w:tc>
+        <w:tc>
+          <w:tcPr>
+            <w:tcW w:type="dxa" w:w="4320"/>
+          </w:tcPr>
+          <w:p>
+            <w:r>
+              <w:t>./start.sh --voice — push-to-talk</w:t>
+            </w:r>
+          </w:p>
+        </w:tc>
+      </w:tr>
+      <w:tr>
+        <w:tc>
+          <w:tcPr>
+            <w:tcW w:type="dxa" w:w="4320"/>
+          </w:tcPr>
+          <w:p>
+            <w:r>
+              <w:t>npm run go:auto</w:t>
+            </w:r>
+          </w:p>
+        </w:tc>
+        <w:tc>
+          <w:tcPr>
+            <w:tcW w:type="dxa" w:w="4320"/>
+          </w:tcPr>
+          <w:p>
+            <w:r>
+              <w:t>./start.sh --voice=auto — auto-VAD</w:t>
+            </w:r>
+          </w:p>
+        </w:tc>
+      </w:tr>
+      <w:tr>
+        <w:tc>
+          <w:tcPr>
+            <w:tcW w:type="dxa" w:w="4320"/>
+          </w:tcPr>
+          <w:p>
+            <w:r>
+              <w:t>npm run go:no-voice</w:t>
+            </w:r>
+          </w:p>
+        </w:tc>
+        <w:tc>
+          <w:tcPr>
+            <w:tcW w:type="dxa" w:w="4320"/>
+          </w:tcPr>
+          <w:p>
+            <w:r>
+              <w:t>./start.sh --no-voice — text-only</w:t>
+            </w:r>
+          </w:p>
+        </w:tc>
+      </w:tr>
+      <w:tr>
+        <w:tc>
+          <w:tcPr>
+            <w:tcW w:type="dxa" w:w="4320"/>
+          </w:tcPr>
+          <w:p>
+            <w:r>
+              <w:t>npm run go:debug</w:t>
+            </w:r>
+          </w:p>
+        </w:tc>
+        <w:tc>
+          <w:tcPr>
+            <w:tcW w:type="dxa" w:w="4320"/>
+          </w:tcPr>
+          <w:p>
+            <w:r>
+              <w:t>./start.sh --debug — DEBUG=tf:*</w:t>
+            </w:r>
+          </w:p>
+        </w:tc>
+      </w:tr>
+      <w:tr>
+        <w:tc>
+          <w:tcPr>
+            <w:tcW w:type="dxa" w:w="4320"/>
+          </w:tcPr>
+          <w:p>
+            <w:r>
+              <w:t>npm run voice</w:t>
+            </w:r>
+          </w:p>
+        </w:tc>
+        <w:tc>
+          <w:tcPr>
+            <w:tcW w:type="dxa" w:w="4320"/>
+          </w:tcPr>
+          <w:p>
+            <w:r>
+              <w:t>python3 voice/pipeline.py</w:t>
+            </w:r>
+          </w:p>
+        </w:tc>
+      </w:tr>
+      <w:tr>
+        <w:tc>
+          <w:tcPr>
+            <w:tcW w:type="dxa" w:w="4320"/>
+          </w:tcPr>
+          <w:p>
+            <w:r>
+              <w:t>npm run voice:auto</w:t>
+            </w:r>
+          </w:p>
+        </w:tc>
+        <w:tc>
+          <w:tcPr>
+            <w:tcW w:type="dxa" w:w="4320"/>
+          </w:tcPr>
+          <w:p>
+            <w:r>
+              <w:t>python3 voice/pipeline.py --mode auto-vad</w:t>
+            </w:r>
+          </w:p>
+        </w:tc>
+      </w:tr>
+      <w:tr>
+        <w:tc>
+          <w:tcPr>
+            <w:tcW w:type="dxa" w:w="4320"/>
+          </w:tcPr>
+          <w:p>
+            <w:r>
+              <w:t>npm run voice:wake</w:t>
+            </w:r>
+          </w:p>
+        </w:tc>
+        <w:tc>
+          <w:tcPr>
+            <w:tcW w:type="dxa" w:w="4320"/>
+          </w:tcPr>
+          <w:p>
+            <w:r>
+              <w:t>python3 voice/pipeline.py --mode wake-word</w:t>
+            </w:r>
+          </w:p>
+        </w:tc>
+      </w:tr>
+      <w:tr>
+        <w:tc>
+          <w:tcPr>
+            <w:tcW w:type="dxa" w:w="4320"/>
+          </w:tcPr>
+          <w:p>
+            <w:r>
+              <w:t>npm run voice:hotkey</w:t>
+            </w:r>
+          </w:p>
+        </w:tc>
+        <w:tc>
+          <w:tcPr>
+            <w:tcW w:type="dxa" w:w="4320"/>
+          </w:tcPr>
+          <w:p>
+            <w:r>
+              <w:t>node bridge/hotkey-fallback.js</w:t>
+            </w:r>
+          </w:p>
+        </w:tc>
+      </w:tr>
+      <w:tr>
+        <w:tc>
+          <w:tcPr>
+            <w:tcW w:type="dxa" w:w="4320"/>
+          </w:tcPr>
+          <w:p>
+            <w:r>
+              <w:t>npm run voice:debug</w:t>
+            </w:r>
+          </w:p>
+        </w:tc>
+        <w:tc>
+          <w:tcPr>
+            <w:tcW w:type="dxa" w:w="4320"/>
+          </w:tcPr>
+          <w:p>
+            <w:r>
+              <w:t>python3 voice/pipeline.py --debug</w:t>
+            </w:r>
+          </w:p>
+        </w:tc>
+      </w:tr>
+    </w:tbl>
+    <w:p/>
     <w:sectPr>
       <w:pgSz w:w="12240" w:h="15840"/>
       <w:pgMar w:top="1440" w:right="1800" w:bottom="1440" w:left="1800" w:header="720" w:footer="720" w:gutter="0"/>

</xml_diff>

<commit_message>
fixed the voice space button issue
</commit_message>
<xml_diff>
--- a/docs/TerminalForge_ProjectPlan_v4.docx
+++ b/docs/TerminalForge_ProjectPlan_v4.docx
@@ -5512,6 +5512,2320 @@
       </w:tr>
     </w:tbl>
     <w:p/>
+    <w:p>
+      <w:pPr>
+        <w:pStyle w:val="Heading1"/>
+      </w:pPr>
+      <w:r>
+        <w:t>13. Complete User Commands Reference</w:t>
+      </w:r>
+    </w:p>
+    <w:p>
+      <w:r>
+        <w:t>Everything needed to start, use, and stop TerminalForge — all commands in one place.</w:t>
+      </w:r>
+    </w:p>
+    <w:p>
+      <w:pPr>
+        <w:pStyle w:val="Heading2"/>
+      </w:pPr>
+      <w:r>
+        <w:t>13.1 Starting the Application</w:t>
+      </w:r>
+    </w:p>
+    <w:tbl>
+      <w:tblPr>
+        <w:tblStyle w:val="TableGrid"/>
+        <w:tblW w:type="auto" w:w="0"/>
+        <w:tblLook w:firstColumn="1" w:firstRow="1" w:lastColumn="0" w:lastRow="0" w:noHBand="0" w:noVBand="1" w:val="04A0"/>
+      </w:tblPr>
+      <w:tblGrid>
+        <w:gridCol w:w="4320"/>
+        <w:gridCol w:w="4320"/>
+      </w:tblGrid>
+      <w:tr>
+        <w:tc>
+          <w:tcPr>
+            <w:tcW w:type="dxa" w:w="4320"/>
+          </w:tcPr>
+          <w:p>
+            <w:r>
+              <w:t>Command</w:t>
+            </w:r>
+          </w:p>
+        </w:tc>
+        <w:tc>
+          <w:tcPr>
+            <w:tcW w:type="dxa" w:w="4320"/>
+          </w:tcPr>
+          <w:p>
+            <w:r>
+              <w:t>What It Does</w:t>
+            </w:r>
+          </w:p>
+        </w:tc>
+      </w:tr>
+      <w:tr>
+        <w:tc>
+          <w:tcPr>
+            <w:tcW w:type="dxa" w:w="4320"/>
+          </w:tcPr>
+          <w:p>
+            <w:r>
+              <w:t>./start.sh</w:t>
+            </w:r>
+          </w:p>
+        </w:tc>
+        <w:tc>
+          <w:tcPr>
+            <w:tcW w:type="dxa" w:w="4320"/>
+          </w:tcPr>
+          <w:p>
+            <w:r>
+              <w:t>Interactive one-command launcher — prompts for voice mode, installs missing deps, starts everything (RECOMMENDED)</w:t>
+            </w:r>
+          </w:p>
+        </w:tc>
+      </w:tr>
+      <w:tr>
+        <w:tc>
+          <w:tcPr>
+            <w:tcW w:type="dxa" w:w="4320"/>
+          </w:tcPr>
+          <w:p>
+            <w:r>
+              <w:t>npm run go</w:t>
+            </w:r>
+          </w:p>
+        </w:tc>
+        <w:tc>
+          <w:tcPr>
+            <w:tcW w:type="dxa" w:w="4320"/>
+          </w:tcPr>
+          <w:p>
+            <w:r>
+              <w:t>Same as ./start.sh</w:t>
+            </w:r>
+          </w:p>
+        </w:tc>
+      </w:tr>
+      <w:tr>
+        <w:tc>
+          <w:tcPr>
+            <w:tcW w:type="dxa" w:w="4320"/>
+          </w:tcPr>
+          <w:p>
+            <w:r>
+              <w:t>npm run go:voice</w:t>
+            </w:r>
+          </w:p>
+        </w:tc>
+        <w:tc>
+          <w:tcPr>
+            <w:tcW w:type="dxa" w:w="4320"/>
+          </w:tcPr>
+          <w:p>
+            <w:r>
+              <w:t>Start with push-to-talk voice (Space key to record)</w:t>
+            </w:r>
+          </w:p>
+        </w:tc>
+      </w:tr>
+      <w:tr>
+        <w:tc>
+          <w:tcPr>
+            <w:tcW w:type="dxa" w:w="4320"/>
+          </w:tcPr>
+          <w:p>
+            <w:r>
+              <w:t>npm run go:auto</w:t>
+            </w:r>
+          </w:p>
+        </w:tc>
+        <w:tc>
+          <w:tcPr>
+            <w:tcW w:type="dxa" w:w="4320"/>
+          </w:tcPr>
+          <w:p>
+            <w:r>
+              <w:t>Start with always-listening auto-VAD voice</w:t>
+            </w:r>
+          </w:p>
+        </w:tc>
+      </w:tr>
+      <w:tr>
+        <w:tc>
+          <w:tcPr>
+            <w:tcW w:type="dxa" w:w="4320"/>
+          </w:tcPr>
+          <w:p>
+            <w:r>
+              <w:t>npm run go:no-voice</w:t>
+            </w:r>
+          </w:p>
+        </w:tc>
+        <w:tc>
+          <w:tcPr>
+            <w:tcW w:type="dxa" w:w="4320"/>
+          </w:tcPr>
+          <w:p>
+            <w:r>
+              <w:t>Start without voice pipeline (text-only mode)</w:t>
+            </w:r>
+          </w:p>
+        </w:tc>
+      </w:tr>
+      <w:tr>
+        <w:tc>
+          <w:tcPr>
+            <w:tcW w:type="dxa" w:w="4320"/>
+          </w:tcPr>
+          <w:p>
+            <w:r>
+              <w:t>npm run go:debug</w:t>
+            </w:r>
+          </w:p>
+        </w:tc>
+        <w:tc>
+          <w:tcPr>
+            <w:tcW w:type="dxa" w:w="4320"/>
+          </w:tcPr>
+          <w:p>
+            <w:r>
+              <w:t>Start everything with DEBUG=tf:* verbose logging</w:t>
+            </w:r>
+          </w:p>
+        </w:tc>
+      </w:tr>
+      <w:tr>
+        <w:tc>
+          <w:tcPr>
+            <w:tcW w:type="dxa" w:w="4320"/>
+          </w:tcPr>
+          <w:p>
+            <w:r>
+              <w:t>npm run ui</w:t>
+            </w:r>
+          </w:p>
+        </w:tc>
+        <w:tc>
+          <w:tcPr>
+            <w:tcW w:type="dxa" w:w="4320"/>
+          </w:tcPr>
+          <w:p>
+            <w:r>
+              <w:t>TUI only — bridge server must already be running separately</w:t>
+            </w:r>
+          </w:p>
+        </w:tc>
+      </w:tr>
+      <w:tr>
+        <w:tc>
+          <w:tcPr>
+            <w:tcW w:type="dxa" w:w="4320"/>
+          </w:tcPr>
+          <w:p>
+            <w:r>
+              <w:t>npm run ui:debug</w:t>
+            </w:r>
+          </w:p>
+        </w:tc>
+        <w:tc>
+          <w:tcPr>
+            <w:tcW w:type="dxa" w:w="4320"/>
+          </w:tcPr>
+          <w:p>
+            <w:r>
+              <w:t>TUI with verbose debug logging</w:t>
+            </w:r>
+          </w:p>
+        </w:tc>
+      </w:tr>
+      <w:tr>
+        <w:tc>
+          <w:tcPr>
+            <w:tcW w:type="dxa" w:w="4320"/>
+          </w:tcPr>
+          <w:p>
+            <w:r>
+              <w:t>npm start</w:t>
+            </w:r>
+          </w:p>
+        </w:tc>
+        <w:tc>
+          <w:tcPr>
+            <w:tcW w:type="dxa" w:w="4320"/>
+          </w:tcPr>
+          <w:p>
+            <w:r>
+              <w:t>Bridge server only (port 3333)</w:t>
+            </w:r>
+          </w:p>
+        </w:tc>
+      </w:tr>
+      <w:tr>
+        <w:tc>
+          <w:tcPr>
+            <w:tcW w:type="dxa" w:w="4320"/>
+          </w:tcPr>
+          <w:p>
+            <w:r>
+              <w:t>npm run launch</w:t>
+            </w:r>
+          </w:p>
+        </w:tc>
+        <w:tc>
+          <w:tcPr>
+            <w:tcW w:type="dxa" w:w="4320"/>
+          </w:tcPr>
+          <w:p>
+            <w:r>
+              <w:t>Opens 7 separate windows in iTerm2 or Terminal.app</w:t>
+            </w:r>
+          </w:p>
+        </w:tc>
+      </w:tr>
+      <w:tr>
+        <w:tc>
+          <w:tcPr>
+            <w:tcW w:type="dxa" w:w="4320"/>
+          </w:tcPr>
+          <w:p>
+            <w:r>
+              <w:t>npm run launch:tmux</w:t>
+            </w:r>
+          </w:p>
+        </w:tc>
+        <w:tc>
+          <w:tcPr>
+            <w:tcW w:type="dxa" w:w="4320"/>
+          </w:tcPr>
+          <w:p>
+            <w:r>
+              <w:t>Opens 7 tmux windows — switch with Ctrl+B 0–6</w:t>
+            </w:r>
+          </w:p>
+        </w:tc>
+      </w:tr>
+    </w:tbl>
+    <w:p/>
+    <w:p>
+      <w:pPr>
+        <w:pStyle w:val="Heading2"/>
+      </w:pPr>
+      <w:r>
+        <w:t>13.2 Stopping the Application</w:t>
+      </w:r>
+    </w:p>
+    <w:tbl>
+      <w:tblPr>
+        <w:tblStyle w:val="TableGrid"/>
+        <w:tblW w:type="auto" w:w="0"/>
+        <w:tblLook w:firstColumn="1" w:firstRow="1" w:lastColumn="0" w:lastRow="0" w:noHBand="0" w:noVBand="1" w:val="04A0"/>
+      </w:tblPr>
+      <w:tblGrid>
+        <w:gridCol w:w="4320"/>
+        <w:gridCol w:w="4320"/>
+      </w:tblGrid>
+      <w:tr>
+        <w:tc>
+          <w:tcPr>
+            <w:tcW w:type="dxa" w:w="4320"/>
+          </w:tcPr>
+          <w:p>
+            <w:r>
+              <w:t>Action</w:t>
+            </w:r>
+          </w:p>
+        </w:tc>
+        <w:tc>
+          <w:tcPr>
+            <w:tcW w:type="dxa" w:w="4320"/>
+          </w:tcPr>
+          <w:p>
+            <w:r>
+              <w:t>Command</w:t>
+            </w:r>
+          </w:p>
+        </w:tc>
+      </w:tr>
+      <w:tr>
+        <w:tc>
+          <w:tcPr>
+            <w:tcW w:type="dxa" w:w="4320"/>
+          </w:tcPr>
+          <w:p>
+            <w:r>
+              <w:t>Clean stop (recommended)</w:t>
+            </w:r>
+          </w:p>
+        </w:tc>
+        <w:tc>
+          <w:tcPr>
+            <w:tcW w:type="dxa" w:w="4320"/>
+          </w:tcPr>
+          <w:p>
+            <w:r>
+              <w:t>Press Ctrl+C in the TUI or start.sh terminal</w:t>
+            </w:r>
+          </w:p>
+        </w:tc>
+      </w:tr>
+      <w:tr>
+        <w:tc>
+          <w:tcPr>
+            <w:tcW w:type="dxa" w:w="4320"/>
+          </w:tcPr>
+          <w:p>
+            <w:r>
+              <w:t>Kill bridge server</w:t>
+            </w:r>
+          </w:p>
+        </w:tc>
+        <w:tc>
+          <w:tcPr>
+            <w:tcW w:type="dxa" w:w="4320"/>
+          </w:tcPr>
+          <w:p>
+            <w:r>
+              <w:t>kill $(lsof -ti:3333)</w:t>
+            </w:r>
+          </w:p>
+        </w:tc>
+      </w:tr>
+      <w:tr>
+        <w:tc>
+          <w:tcPr>
+            <w:tcW w:type="dxa" w:w="4320"/>
+          </w:tcPr>
+          <w:p>
+            <w:r>
+              <w:t>Kill voice pipeline</w:t>
+            </w:r>
+          </w:p>
+        </w:tc>
+        <w:tc>
+          <w:tcPr>
+            <w:tcW w:type="dxa" w:w="4320"/>
+          </w:tcPr>
+          <w:p>
+            <w:r>
+              <w:t>pkill -f "pipeline.py"</w:t>
+            </w:r>
+          </w:p>
+        </w:tc>
+      </w:tr>
+      <w:tr>
+        <w:tc>
+          <w:tcPr>
+            <w:tcW w:type="dxa" w:w="4320"/>
+          </w:tcPr>
+          <w:p>
+            <w:r>
+              <w:t>Kill agent REPLs</w:t>
+            </w:r>
+          </w:p>
+        </w:tc>
+        <w:tc>
+          <w:tcPr>
+            <w:tcW w:type="dxa" w:w="4320"/>
+          </w:tcPr>
+          <w:p>
+            <w:r>
+              <w:t>pkill -f "agent-repl.js"</w:t>
+            </w:r>
+          </w:p>
+        </w:tc>
+      </w:tr>
+      <w:tr>
+        <w:tc>
+          <w:tcPr>
+            <w:tcW w:type="dxa" w:w="4320"/>
+          </w:tcPr>
+          <w:p>
+            <w:r>
+              <w:t>Kill bus monitor</w:t>
+            </w:r>
+          </w:p>
+        </w:tc>
+        <w:tc>
+          <w:tcPr>
+            <w:tcW w:type="dxa" w:w="4320"/>
+          </w:tcPr>
+          <w:p>
+            <w:r>
+              <w:t>pkill -f "bus-monitor.js"</w:t>
+            </w:r>
+          </w:p>
+        </w:tc>
+      </w:tr>
+      <w:tr>
+        <w:tc>
+          <w:tcPr>
+            <w:tcW w:type="dxa" w:w="4320"/>
+          </w:tcPr>
+          <w:p>
+            <w:r>
+              <w:t>Kill tmux session</w:t>
+            </w:r>
+          </w:p>
+        </w:tc>
+        <w:tc>
+          <w:tcPr>
+            <w:tcW w:type="dxa" w:w="4320"/>
+          </w:tcPr>
+          <w:p>
+            <w:r>
+              <w:t>tmux kill-session -t terminalforge</w:t>
+            </w:r>
+          </w:p>
+        </w:tc>
+      </w:tr>
+      <w:tr>
+        <w:tc>
+          <w:tcPr>
+            <w:tcW w:type="dxa" w:w="4320"/>
+          </w:tcPr>
+          <w:p>
+            <w:r>
+              <w:t>Kill everything at once</w:t>
+            </w:r>
+          </w:p>
+        </w:tc>
+        <w:tc>
+          <w:tcPr>
+            <w:tcW w:type="dxa" w:w="4320"/>
+          </w:tcPr>
+          <w:p>
+            <w:r>
+              <w:t>kill $(lsof -ti:3333) &amp;&amp; pkill -f "agent-repl.js" &amp;&amp; pkill -f "bus-monitor.js"</w:t>
+            </w:r>
+          </w:p>
+        </w:tc>
+      </w:tr>
+    </w:tbl>
+    <w:p/>
+    <w:p>
+      <w:pPr>
+        <w:pStyle w:val="Heading2"/>
+      </w:pPr>
+      <w:r>
+        <w:t>13.3 Switching Between Agents</w:t>
+      </w:r>
+    </w:p>
+    <w:p>
+      <w:r>
+        <w:t>TUI keyboard (inside npm run ui):</w:t>
+      </w:r>
+    </w:p>
+    <w:tbl>
+      <w:tblPr>
+        <w:tblStyle w:val="TableGrid"/>
+        <w:tblW w:type="auto" w:w="0"/>
+        <w:tblLook w:firstColumn="1" w:firstRow="1" w:lastColumn="0" w:lastRow="0" w:noHBand="0" w:noVBand="1" w:val="04A0"/>
+      </w:tblPr>
+      <w:tblGrid>
+        <w:gridCol w:w="4320"/>
+        <w:gridCol w:w="4320"/>
+      </w:tblGrid>
+      <w:tr>
+        <w:tc>
+          <w:tcPr>
+            <w:tcW w:type="dxa" w:w="4320"/>
+          </w:tcPr>
+          <w:p>
+            <w:r>
+              <w:t>Key</w:t>
+            </w:r>
+          </w:p>
+        </w:tc>
+        <w:tc>
+          <w:tcPr>
+            <w:tcW w:type="dxa" w:w="4320"/>
+          </w:tcPr>
+          <w:p>
+            <w:r>
+              <w:t>Action</w:t>
+            </w:r>
+          </w:p>
+        </w:tc>
+      </w:tr>
+      <w:tr>
+        <w:tc>
+          <w:tcPr>
+            <w:tcW w:type="dxa" w:w="4320"/>
+          </w:tcPr>
+          <w:p>
+            <w:r>
+              <w:t>Tab</w:t>
+            </w:r>
+          </w:p>
+        </w:tc>
+        <w:tc>
+          <w:tcPr>
+            <w:tcW w:type="dxa" w:w="4320"/>
+          </w:tcPr>
+          <w:p>
+            <w:r>
+              <w:t>Next agent — T1 → T2 → T3 → T4 → T5 → T1</w:t>
+            </w:r>
+          </w:p>
+        </w:tc>
+      </w:tr>
+      <w:tr>
+        <w:tc>
+          <w:tcPr>
+            <w:tcW w:type="dxa" w:w="4320"/>
+          </w:tcPr>
+          <w:p>
+            <w:r>
+              <w:t>Shift+Tab</w:t>
+            </w:r>
+          </w:p>
+        </w:tc>
+        <w:tc>
+          <w:tcPr>
+            <w:tcW w:type="dxa" w:w="4320"/>
+          </w:tcPr>
+          <w:p>
+            <w:r>
+              <w:t>Previous agent — T1 → T5 → T4 → T3 → T2 → T1</w:t>
+            </w:r>
+          </w:p>
+        </w:tc>
+      </w:tr>
+    </w:tbl>
+    <w:p>
+      <w:r>
+        <w:t>iPhone Volume Buttons:</w:t>
+      </w:r>
+    </w:p>
+    <w:tbl>
+      <w:tblPr>
+        <w:tblStyle w:val="TableGrid"/>
+        <w:tblW w:type="auto" w:w="0"/>
+        <w:tblLook w:firstColumn="1" w:firstRow="1" w:lastColumn="0" w:lastRow="0" w:noHBand="0" w:noVBand="1" w:val="04A0"/>
+      </w:tblPr>
+      <w:tblGrid>
+        <w:gridCol w:w="4320"/>
+        <w:gridCol w:w="4320"/>
+      </w:tblGrid>
+      <w:tr>
+        <w:tc>
+          <w:tcPr>
+            <w:tcW w:type="dxa" w:w="4320"/>
+          </w:tcPr>
+          <w:p>
+            <w:r>
+              <w:t>Button</w:t>
+            </w:r>
+          </w:p>
+        </w:tc>
+        <w:tc>
+          <w:tcPr>
+            <w:tcW w:type="dxa" w:w="4320"/>
+          </w:tcPr>
+          <w:p>
+            <w:r>
+              <w:t>Action</w:t>
+            </w:r>
+          </w:p>
+        </w:tc>
+      </w:tr>
+      <w:tr>
+        <w:tc>
+          <w:tcPr>
+            <w:tcW w:type="dxa" w:w="4320"/>
+          </w:tcPr>
+          <w:p>
+            <w:r>
+              <w:t>Volume DOWN</w:t>
+            </w:r>
+          </w:p>
+        </w:tc>
+        <w:tc>
+          <w:tcPr>
+            <w:tcW w:type="dxa" w:w="4320"/>
+          </w:tcPr>
+          <w:p>
+            <w:r>
+              <w:t>Next agent (T1 → T2 → T3 → T4 → T5 → T1)</w:t>
+            </w:r>
+          </w:p>
+        </w:tc>
+      </w:tr>
+      <w:tr>
+        <w:tc>
+          <w:tcPr>
+            <w:tcW w:type="dxa" w:w="4320"/>
+          </w:tcPr>
+          <w:p>
+            <w:r>
+              <w:t>Volume UP</w:t>
+            </w:r>
+          </w:p>
+        </w:tc>
+        <w:tc>
+          <w:tcPr>
+            <w:tcW w:type="dxa" w:w="4320"/>
+          </w:tcPr>
+          <w:p>
+            <w:r>
+              <w:t>Previous agent (T5 → T4 → T3 → T2 → T1 → T5)</w:t>
+            </w:r>
+          </w:p>
+        </w:tc>
+      </w:tr>
+      <w:tr>
+        <w:tc>
+          <w:tcPr>
+            <w:tcW w:type="dxa" w:w="4320"/>
+          </w:tcPr>
+          <w:p>
+            <w:r>
+              <w:t>Hold either button 2 seconds</w:t>
+            </w:r>
+          </w:p>
+        </w:tc>
+        <w:tc>
+          <w:tcPr>
+            <w:tcW w:type="dxa" w:w="4320"/>
+          </w:tcPr>
+          <w:p>
+            <w:r>
+              <w:t>Toggle Manual ↔ Autonomous Mode</w:t>
+            </w:r>
+          </w:p>
+        </w:tc>
+      </w:tr>
+    </w:tbl>
+    <w:p>
+      <w:r>
+        <w:t>Simulate via curl (for testing or scripting):</w:t>
+      </w:r>
+    </w:p>
+    <w:p>
+      <w:r>
+        <w:rPr>
+          <w:rFonts w:ascii="Courier New" w:hAnsi="Courier New"/>
+          <w:sz w:val="18"/>
+        </w:rPr>
+        <w:t>curl -X POST http://localhost:3333/volume -H "Content-Type: application/json" -d '{"button":"down"}'</w:t>
+      </w:r>
+    </w:p>
+    <w:p>
+      <w:r>
+        <w:rPr>
+          <w:rFonts w:ascii="Courier New" w:hAnsi="Courier New"/>
+          <w:sz w:val="18"/>
+        </w:rPr>
+        <w:t>curl -X POST http://localhost:3333/volume -H "Content-Type: application/json" -d '{"button":"up"}'</w:t>
+      </w:r>
+    </w:p>
+    <w:p>
+      <w:r>
+        <w:rPr>
+          <w:rFonts w:ascii="Courier New" w:hAnsi="Courier New"/>
+          <w:sz w:val="18"/>
+        </w:rPr>
+        <w:t>curl -X POST http://localhost:3333/volume -H "Content-Type: application/json" -d '{"button":"hold"}'</w:t>
+      </w:r>
+    </w:p>
+    <w:p/>
+    <w:p>
+      <w:pPr>
+        <w:pStyle w:val="Heading2"/>
+      </w:pPr>
+      <w:r>
+        <w:t>13.4 TUI Keyboard Controls</w:t>
+      </w:r>
+    </w:p>
+    <w:tbl>
+      <w:tblPr>
+        <w:tblStyle w:val="TableGrid"/>
+        <w:tblW w:type="auto" w:w="0"/>
+        <w:tblLook w:firstColumn="1" w:firstRow="1" w:lastColumn="0" w:lastRow="0" w:noHBand="0" w:noVBand="1" w:val="04A0"/>
+      </w:tblPr>
+      <w:tblGrid>
+        <w:gridCol w:w="4320"/>
+        <w:gridCol w:w="4320"/>
+      </w:tblGrid>
+      <w:tr>
+        <w:tc>
+          <w:tcPr>
+            <w:tcW w:type="dxa" w:w="4320"/>
+          </w:tcPr>
+          <w:p>
+            <w:r>
+              <w:t>Key</w:t>
+            </w:r>
+          </w:p>
+        </w:tc>
+        <w:tc>
+          <w:tcPr>
+            <w:tcW w:type="dxa" w:w="4320"/>
+          </w:tcPr>
+          <w:p>
+            <w:r>
+              <w:t>Action</w:t>
+            </w:r>
+          </w:p>
+        </w:tc>
+      </w:tr>
+      <w:tr>
+        <w:tc>
+          <w:tcPr>
+            <w:tcW w:type="dxa" w:w="4320"/>
+          </w:tcPr>
+          <w:p>
+            <w:r>
+              <w:t>Tab</w:t>
+            </w:r>
+          </w:p>
+        </w:tc>
+        <w:tc>
+          <w:tcPr>
+            <w:tcW w:type="dxa" w:w="4320"/>
+          </w:tcPr>
+          <w:p>
+            <w:r>
+              <w:t>Switch to next agent</w:t>
+            </w:r>
+          </w:p>
+        </w:tc>
+      </w:tr>
+      <w:tr>
+        <w:tc>
+          <w:tcPr>
+            <w:tcW w:type="dxa" w:w="4320"/>
+          </w:tcPr>
+          <w:p>
+            <w:r>
+              <w:t>Shift+Tab</w:t>
+            </w:r>
+          </w:p>
+        </w:tc>
+        <w:tc>
+          <w:tcPr>
+            <w:tcW w:type="dxa" w:w="4320"/>
+          </w:tcPr>
+          <w:p>
+            <w:r>
+              <w:t>Switch to previous agent</w:t>
+            </w:r>
+          </w:p>
+        </w:tc>
+      </w:tr>
+      <w:tr>
+        <w:tc>
+          <w:tcPr>
+            <w:tcW w:type="dxa" w:w="4320"/>
+          </w:tcPr>
+          <w:p>
+            <w:r>
+              <w:t>Enter</w:t>
+            </w:r>
+          </w:p>
+        </w:tc>
+        <w:tc>
+          <w:tcPr>
+            <w:tcW w:type="dxa" w:w="4320"/>
+          </w:tcPr>
+          <w:p>
+            <w:r>
+              <w:t>Submit typed prompt to active agent</w:t>
+            </w:r>
+          </w:p>
+        </w:tc>
+      </w:tr>
+      <w:tr>
+        <w:tc>
+          <w:tcPr>
+            <w:tcW w:type="dxa" w:w="4320"/>
+          </w:tcPr>
+          <w:p>
+            <w:r>
+              <w:t>Space</w:t>
+            </w:r>
+          </w:p>
+        </w:tc>
+        <w:tc>
+          <w:tcPr>
+            <w:tcW w:type="dxa" w:w="4320"/>
+          </w:tcPr>
+          <w:p>
+            <w:r>
+              <w:t>Push-to-talk toggle — starts/stops recording (only when input box is empty; voice pipeline must be running)</w:t>
+            </w:r>
+          </w:p>
+        </w:tc>
+      </w:tr>
+      <w:tr>
+        <w:tc>
+          <w:tcPr>
+            <w:tcW w:type="dxa" w:w="4320"/>
+          </w:tcPr>
+          <w:p>
+            <w:r>
+              <w:t>Ctrl+C</w:t>
+            </w:r>
+          </w:p>
+        </w:tc>
+        <w:tc>
+          <w:tcPr>
+            <w:tcW w:type="dxa" w:w="4320"/>
+          </w:tcPr>
+          <w:p>
+            <w:r>
+              <w:t>Quit TerminalForge cleanly</w:t>
+            </w:r>
+          </w:p>
+        </w:tc>
+      </w:tr>
+    </w:tbl>
+    <w:p/>
+    <w:p>
+      <w:pPr>
+        <w:pStyle w:val="Heading2"/>
+      </w:pPr>
+      <w:r>
+        <w:t>13.5 In-TUI Slash Commands</w:t>
+      </w:r>
+    </w:p>
+    <w:p>
+      <w:r>
+        <w:t>Type these in the active agent input box and press Enter:</w:t>
+      </w:r>
+    </w:p>
+    <w:tbl>
+      <w:tblPr>
+        <w:tblStyle w:val="TableGrid"/>
+        <w:tblW w:type="auto" w:w="0"/>
+        <w:tblLook w:firstColumn="1" w:firstRow="1" w:lastColumn="0" w:lastRow="0" w:noHBand="0" w:noVBand="1" w:val="04A0"/>
+      </w:tblPr>
+      <w:tblGrid>
+        <w:gridCol w:w="4320"/>
+        <w:gridCol w:w="4320"/>
+      </w:tblGrid>
+      <w:tr>
+        <w:tc>
+          <w:tcPr>
+            <w:tcW w:type="dxa" w:w="4320"/>
+          </w:tcPr>
+          <w:p>
+            <w:r>
+              <w:t>Command</w:t>
+            </w:r>
+          </w:p>
+        </w:tc>
+        <w:tc>
+          <w:tcPr>
+            <w:tcW w:type="dxa" w:w="4320"/>
+          </w:tcPr>
+          <w:p>
+            <w:r>
+              <w:t>What It Does</w:t>
+            </w:r>
+          </w:p>
+        </w:tc>
+      </w:tr>
+      <w:tr>
+        <w:tc>
+          <w:tcPr>
+            <w:tcW w:type="dxa" w:w="4320"/>
+          </w:tcPr>
+          <w:p>
+            <w:r>
+              <w:t>/clear</w:t>
+            </w:r>
+          </w:p>
+        </w:tc>
+        <w:tc>
+          <w:tcPr>
+            <w:tcW w:type="dxa" w:w="4320"/>
+          </w:tcPr>
+          <w:p>
+            <w:r>
+              <w:t>Clear conversation history for the active agent</w:t>
+            </w:r>
+          </w:p>
+        </w:tc>
+      </w:tr>
+      <w:tr>
+        <w:tc>
+          <w:tcPr>
+            <w:tcW w:type="dxa" w:w="4320"/>
+          </w:tcPr>
+          <w:p>
+            <w:r>
+              <w:t>/status</w:t>
+            </w:r>
+          </w:p>
+        </w:tc>
+        <w:tc>
+          <w:tcPr>
+            <w:tcW w:type="dxa" w:w="4320"/>
+          </w:tcPr>
+          <w:p>
+            <w:r>
+              <w:t>Show: active terminal number, mode (manual/auto), task status</w:t>
+            </w:r>
+          </w:p>
+        </w:tc>
+      </w:tr>
+      <w:tr>
+        <w:tc>
+          <w:tcPr>
+            <w:tcW w:type="dxa" w:w="4320"/>
+          </w:tcPr>
+          <w:p>
+            <w:r>
+              <w:t>/msg &lt;agentId&gt; &lt;type&gt; &lt;message&gt;</w:t>
+            </w:r>
+          </w:p>
+        </w:tc>
+        <w:tc>
+          <w:tcPr>
+            <w:tcW w:type="dxa" w:w="4320"/>
+          </w:tcPr>
+          <w:p>
+            <w:r>
+              <w:t>Send a message directly to another agent</w:t>
+            </w:r>
+          </w:p>
+        </w:tc>
+      </w:tr>
+      <w:tr>
+        <w:tc>
+          <w:tcPr>
+            <w:tcW w:type="dxa" w:w="4320"/>
+          </w:tcPr>
+          <w:p>
+            <w:r>
+              <w:t>/reply &lt;message&gt;</w:t>
+            </w:r>
+          </w:p>
+        </w:tc>
+        <w:tc>
+          <w:tcPr>
+            <w:tcW w:type="dxa" w:w="4320"/>
+          </w:tcPr>
+          <w:p>
+            <w:r>
+              <w:t>Quick-reply to the last message received from another agent</w:t>
+            </w:r>
+          </w:p>
+        </w:tc>
+      </w:tr>
+    </w:tbl>
+    <w:p>
+      <w:r>
+        <w:t>Examples:</w:t>
+      </w:r>
+    </w:p>
+    <w:p>
+      <w:r>
+        <w:rPr>
+          <w:rFonts w:ascii="Courier New" w:hAnsi="Courier New"/>
+          <w:sz w:val="18"/>
+        </w:rPr>
+        <w:t>/msg senior-dev escalation JWT tokens expire after 60s even with rememberMe=true</w:t>
+      </w:r>
+    </w:p>
+    <w:p>
+      <w:r>
+        <w:rPr>
+          <w:rFonts w:ascii="Courier New" w:hAnsi="Courier New"/>
+          <w:sz w:val="18"/>
+        </w:rPr>
+        <w:t>/msg qa-engineer task Write integration tests for POST /auth/login</w:t>
+      </w:r>
+    </w:p>
+    <w:p>
+      <w:r>
+        <w:rPr>
+          <w:rFonts w:ascii="Courier New" w:hAnsi="Courier New"/>
+          <w:sz w:val="18"/>
+        </w:rPr>
+        <w:t>/reply Approved — looks good, add a timestamp field to the response</w:t>
+      </w:r>
+    </w:p>
+    <w:p/>
+    <w:p>
+      <w:pPr>
+        <w:pStyle w:val="Heading2"/>
+      </w:pPr>
+      <w:r>
+        <w:t>13.6 Standalone Agent REPL Commands  (npm run agent N)</w:t>
+      </w:r>
+    </w:p>
+    <w:tbl>
+      <w:tblPr>
+        <w:tblStyle w:val="TableGrid"/>
+        <w:tblW w:type="auto" w:w="0"/>
+        <w:tblLook w:firstColumn="1" w:firstRow="1" w:lastColumn="0" w:lastRow="0" w:noHBand="0" w:noVBand="1" w:val="04A0"/>
+      </w:tblPr>
+      <w:tblGrid>
+        <w:gridCol w:w="4320"/>
+        <w:gridCol w:w="4320"/>
+      </w:tblGrid>
+      <w:tr>
+        <w:tc>
+          <w:tcPr>
+            <w:tcW w:type="dxa" w:w="4320"/>
+          </w:tcPr>
+          <w:p>
+            <w:r>
+              <w:t>Command</w:t>
+            </w:r>
+          </w:p>
+        </w:tc>
+        <w:tc>
+          <w:tcPr>
+            <w:tcW w:type="dxa" w:w="4320"/>
+          </w:tcPr>
+          <w:p>
+            <w:r>
+              <w:t>What It Does</w:t>
+            </w:r>
+          </w:p>
+        </w:tc>
+      </w:tr>
+      <w:tr>
+        <w:tc>
+          <w:tcPr>
+            <w:tcW w:type="dxa" w:w="4320"/>
+          </w:tcPr>
+          <w:p>
+            <w:r>
+              <w:t>/msg &lt;agentId&gt; &lt;type&gt; &lt;message&gt;</w:t>
+            </w:r>
+          </w:p>
+        </w:tc>
+        <w:tc>
+          <w:tcPr>
+            <w:tcW w:type="dxa" w:w="4320"/>
+          </w:tcPr>
+          <w:p>
+            <w:r>
+              <w:t>Send a message to another agent</w:t>
+            </w:r>
+          </w:p>
+        </w:tc>
+      </w:tr>
+      <w:tr>
+        <w:tc>
+          <w:tcPr>
+            <w:tcW w:type="dxa" w:w="4320"/>
+          </w:tcPr>
+          <w:p>
+            <w:r>
+              <w:t>/reply &lt;message&gt;</w:t>
+            </w:r>
+          </w:p>
+        </w:tc>
+        <w:tc>
+          <w:tcPr>
+            <w:tcW w:type="dxa" w:w="4320"/>
+          </w:tcPr>
+          <w:p>
+            <w:r>
+              <w:t>Reply to the last received message</w:t>
+            </w:r>
+          </w:p>
+        </w:tc>
+      </w:tr>
+      <w:tr>
+        <w:tc>
+          <w:tcPr>
+            <w:tcW w:type="dxa" w:w="4320"/>
+          </w:tcPr>
+          <w:p>
+            <w:r>
+              <w:t>/clear</w:t>
+            </w:r>
+          </w:p>
+        </w:tc>
+        <w:tc>
+          <w:tcPr>
+            <w:tcW w:type="dxa" w:w="4320"/>
+          </w:tcPr>
+          <w:p>
+            <w:r>
+              <w:t>Clear this agent's conversation history</w:t>
+            </w:r>
+          </w:p>
+        </w:tc>
+      </w:tr>
+      <w:tr>
+        <w:tc>
+          <w:tcPr>
+            <w:tcW w:type="dxa" w:w="4320"/>
+          </w:tcPr>
+          <w:p>
+            <w:r>
+              <w:t>/status</w:t>
+            </w:r>
+          </w:p>
+        </w:tc>
+        <w:tc>
+          <w:tcPr>
+            <w:tcW w:type="dxa" w:w="4320"/>
+          </w:tcPr>
+          <w:p>
+            <w:r>
+              <w:t>Show current terminal state from state.json</w:t>
+            </w:r>
+          </w:p>
+        </w:tc>
+      </w:tr>
+      <w:tr>
+        <w:tc>
+          <w:tcPr>
+            <w:tcW w:type="dxa" w:w="4320"/>
+          </w:tcPr>
+          <w:p>
+            <w:r>
+              <w:t>/quit</w:t>
+            </w:r>
+          </w:p>
+        </w:tc>
+        <w:tc>
+          <w:tcPr>
+            <w:tcW w:type="dxa" w:w="4320"/>
+          </w:tcPr>
+          <w:p>
+            <w:r>
+              <w:t>Close this agent REPL</w:t>
+            </w:r>
+          </w:p>
+        </w:tc>
+      </w:tr>
+    </w:tbl>
+    <w:p/>
+    <w:p>
+      <w:pPr>
+        <w:pStyle w:val="Heading2"/>
+      </w:pPr>
+      <w:r>
+        <w:t>13.7 Voice Pipeline Commands</w:t>
+      </w:r>
+    </w:p>
+    <w:tbl>
+      <w:tblPr>
+        <w:tblStyle w:val="TableGrid"/>
+        <w:tblW w:type="auto" w:w="0"/>
+        <w:tblLook w:firstColumn="1" w:firstRow="1" w:lastColumn="0" w:lastRow="0" w:noHBand="0" w:noVBand="1" w:val="04A0"/>
+      </w:tblPr>
+      <w:tblGrid>
+        <w:gridCol w:w="4320"/>
+        <w:gridCol w:w="4320"/>
+      </w:tblGrid>
+      <w:tr>
+        <w:tc>
+          <w:tcPr>
+            <w:tcW w:type="dxa" w:w="4320"/>
+          </w:tcPr>
+          <w:p>
+            <w:r>
+              <w:t>Command</w:t>
+            </w:r>
+          </w:p>
+        </w:tc>
+        <w:tc>
+          <w:tcPr>
+            <w:tcW w:type="dxa" w:w="4320"/>
+          </w:tcPr>
+          <w:p>
+            <w:r>
+              <w:t>What It Does</w:t>
+            </w:r>
+          </w:p>
+        </w:tc>
+      </w:tr>
+      <w:tr>
+        <w:tc>
+          <w:tcPr>
+            <w:tcW w:type="dxa" w:w="4320"/>
+          </w:tcPr>
+          <w:p>
+            <w:r>
+              <w:t>npm run go:voice</w:t>
+            </w:r>
+          </w:p>
+        </w:tc>
+        <w:tc>
+          <w:tcPr>
+            <w:tcW w:type="dxa" w:w="4320"/>
+          </w:tcPr>
+          <w:p>
+            <w:r>
+              <w:t>Start full stack with push-to-talk (recommended)</w:t>
+            </w:r>
+          </w:p>
+        </w:tc>
+      </w:tr>
+      <w:tr>
+        <w:tc>
+          <w:tcPr>
+            <w:tcW w:type="dxa" w:w="4320"/>
+          </w:tcPr>
+          <w:p>
+            <w:r>
+              <w:t>npm run go:auto</w:t>
+            </w:r>
+          </w:p>
+        </w:tc>
+        <w:tc>
+          <w:tcPr>
+            <w:tcW w:type="dxa" w:w="4320"/>
+          </w:tcPr>
+          <w:p>
+            <w:r>
+              <w:t>Start full stack with auto-VAD (always-listening)</w:t>
+            </w:r>
+          </w:p>
+        </w:tc>
+      </w:tr>
+      <w:tr>
+        <w:tc>
+          <w:tcPr>
+            <w:tcW w:type="dxa" w:w="4320"/>
+          </w:tcPr>
+          <w:p>
+            <w:r>
+              <w:t>npm run voice</w:t>
+            </w:r>
+          </w:p>
+        </w:tc>
+        <w:tc>
+          <w:tcPr>
+            <w:tcW w:type="dxa" w:w="4320"/>
+          </w:tcPr>
+          <w:p>
+            <w:r>
+              <w:t>Voice pipeline only — push-to-talk (Space to toggle)</w:t>
+            </w:r>
+          </w:p>
+        </w:tc>
+      </w:tr>
+      <w:tr>
+        <w:tc>
+          <w:tcPr>
+            <w:tcW w:type="dxa" w:w="4320"/>
+          </w:tcPr>
+          <w:p>
+            <w:r>
+              <w:t>npm run voice:auto</w:t>
+            </w:r>
+          </w:p>
+        </w:tc>
+        <w:tc>
+          <w:tcPr>
+            <w:tcW w:type="dxa" w:w="4320"/>
+          </w:tcPr>
+          <w:p>
+            <w:r>
+              <w:t>Voice pipeline only — auto-VAD mode</w:t>
+            </w:r>
+          </w:p>
+        </w:tc>
+      </w:tr>
+      <w:tr>
+        <w:tc>
+          <w:tcPr>
+            <w:tcW w:type="dxa" w:w="4320"/>
+          </w:tcPr>
+          <w:p>
+            <w:r>
+              <w:t>npm run voice:wake</w:t>
+            </w:r>
+          </w:p>
+        </w:tc>
+        <w:tc>
+          <w:tcPr>
+            <w:tcW w:type="dxa" w:w="4320"/>
+          </w:tcPr>
+          <w:p>
+            <w:r>
+              <w:t>Voice pipeline only — wake-word mode ("Hey Forge")</w:t>
+            </w:r>
+          </w:p>
+        </w:tc>
+      </w:tr>
+      <w:tr>
+        <w:tc>
+          <w:tcPr>
+            <w:tcW w:type="dxa" w:w="4320"/>
+          </w:tcPr>
+          <w:p>
+            <w:r>
+              <w:t>npm run voice:hotkey</w:t>
+            </w:r>
+          </w:p>
+        </w:tc>
+        <w:tc>
+          <w:tcPr>
+            <w:tcW w:type="dxa" w:w="4320"/>
+          </w:tcPr>
+          <w:p>
+            <w:r>
+              <w:t>Separate hotkey controller terminal for push-to-talk</w:t>
+            </w:r>
+          </w:p>
+        </w:tc>
+      </w:tr>
+      <w:tr>
+        <w:tc>
+          <w:tcPr>
+            <w:tcW w:type="dxa" w:w="4320"/>
+          </w:tcPr>
+          <w:p>
+            <w:r>
+              <w:t>npm run voice:debug</w:t>
+            </w:r>
+          </w:p>
+        </w:tc>
+        <w:tc>
+          <w:tcPr>
+            <w:tcW w:type="dxa" w:w="4320"/>
+          </w:tcPr>
+          <w:p>
+            <w:r>
+              <w:t>Voice pipeline with verbose debug logging</w:t>
+            </w:r>
+          </w:p>
+        </w:tc>
+      </w:tr>
+      <w:tr>
+        <w:tc>
+          <w:tcPr>
+            <w:tcW w:type="dxa" w:w="4320"/>
+          </w:tcPr>
+          <w:p>
+            <w:r>
+              <w:t>python3 -m voice.pipeline --model small.en</w:t>
+            </w:r>
+          </w:p>
+        </w:tc>
+        <w:tc>
+          <w:tcPr>
+            <w:tcW w:type="dxa" w:w="4320"/>
+          </w:tcPr>
+          <w:p>
+            <w:r>
+              <w:t>Use small.en model for better accuracy</w:t>
+            </w:r>
+          </w:p>
+        </w:tc>
+      </w:tr>
+      <w:tr>
+        <w:tc>
+          <w:tcPr>
+            <w:tcW w:type="dxa" w:w="4320"/>
+          </w:tcPr>
+          <w:p>
+            <w:r>
+              <w:t>python3 -m voice.pipeline --debug</w:t>
+            </w:r>
+          </w:p>
+        </w:tc>
+        <w:tc>
+          <w:tcPr>
+            <w:tcW w:type="dxa" w:w="4320"/>
+          </w:tcPr>
+          <w:p>
+            <w:r>
+              <w:t>Direct invocation with verbose logging</w:t>
+            </w:r>
+          </w:p>
+        </w:tc>
+      </w:tr>
+    </w:tbl>
+    <w:p>
+      <w:r>
+        <w:t>Push-to-talk keyboard controls:</w:t>
+      </w:r>
+    </w:p>
+    <w:tbl>
+      <w:tblPr>
+        <w:tblStyle w:val="TableGrid"/>
+        <w:tblW w:type="auto" w:w="0"/>
+        <w:tblLook w:firstColumn="1" w:firstRow="1" w:lastColumn="0" w:lastRow="0" w:noHBand="0" w:noVBand="1" w:val="04A0"/>
+      </w:tblPr>
+      <w:tblGrid>
+        <w:gridCol w:w="4320"/>
+        <w:gridCol w:w="4320"/>
+      </w:tblGrid>
+      <w:tr>
+        <w:tc>
+          <w:tcPr>
+            <w:tcW w:type="dxa" w:w="4320"/>
+          </w:tcPr>
+          <w:p>
+            <w:r>
+              <w:t>Key</w:t>
+            </w:r>
+          </w:p>
+        </w:tc>
+        <w:tc>
+          <w:tcPr>
+            <w:tcW w:type="dxa" w:w="4320"/>
+          </w:tcPr>
+          <w:p>
+            <w:r>
+              <w:t>Action</w:t>
+            </w:r>
+          </w:p>
+        </w:tc>
+      </w:tr>
+      <w:tr>
+        <w:tc>
+          <w:tcPr>
+            <w:tcW w:type="dxa" w:w="4320"/>
+          </w:tcPr>
+          <w:p>
+            <w:r>
+              <w:t>Space (in TUI)</w:t>
+            </w:r>
+          </w:p>
+        </w:tc>
+        <w:tc>
+          <w:tcPr>
+            <w:tcW w:type="dxa" w:w="4320"/>
+          </w:tcPr>
+          <w:p>
+            <w:r>
+              <w:t>Toggle recording on/off (when input box is empty)</w:t>
+            </w:r>
+          </w:p>
+        </w:tc>
+      </w:tr>
+      <w:tr>
+        <w:tc>
+          <w:tcPr>
+            <w:tcW w:type="dxa" w:w="4320"/>
+          </w:tcPr>
+          <w:p>
+            <w:r>
+              <w:t>Space / R / F5 (in hotkey terminal)</w:t>
+            </w:r>
+          </w:p>
+        </w:tc>
+        <w:tc>
+          <w:tcPr>
+            <w:tcW w:type="dxa" w:w="4320"/>
+          </w:tcPr>
+          <w:p>
+            <w:r>
+              <w:t>Toggle recording on/off</w:t>
+            </w:r>
+          </w:p>
+        </w:tc>
+      </w:tr>
+      <w:tr>
+        <w:tc>
+          <w:tcPr>
+            <w:tcW w:type="dxa" w:w="4320"/>
+          </w:tcPr>
+          <w:p>
+            <w:r>
+              <w:t>ESC (in hotkey terminal)</w:t>
+            </w:r>
+          </w:p>
+        </w:tc>
+        <w:tc>
+          <w:tcPr>
+            <w:tcW w:type="dxa" w:w="4320"/>
+          </w:tcPr>
+          <w:p>
+            <w:r>
+              <w:t>Cancel recording, discard audio</w:t>
+            </w:r>
+          </w:p>
+        </w:tc>
+      </w:tr>
+    </w:tbl>
+    <w:p/>
+    <w:p>
+      <w:pPr>
+        <w:pStyle w:val="Heading2"/>
+      </w:pPr>
+      <w:r>
+        <w:t>13.8 Agent IDs and Message Types</w:t>
+      </w:r>
+    </w:p>
+    <w:p>
+      <w:r>
+        <w:t>Agent IDs (used with /msg):</w:t>
+      </w:r>
+    </w:p>
+    <w:tbl>
+      <w:tblPr>
+        <w:tblStyle w:val="TableGrid"/>
+        <w:tblW w:type="auto" w:w="0"/>
+        <w:tblLook w:firstColumn="1" w:firstRow="1" w:lastColumn="0" w:lastRow="0" w:noHBand="0" w:noVBand="1" w:val="04A0"/>
+      </w:tblPr>
+      <w:tblGrid>
+        <w:gridCol w:w="2880"/>
+        <w:gridCol w:w="2880"/>
+        <w:gridCol w:w="2880"/>
+      </w:tblGrid>
+      <w:tr>
+        <w:tc>
+          <w:tcPr>
+            <w:tcW w:type="dxa" w:w="2880"/>
+          </w:tcPr>
+          <w:p>
+            <w:r>
+              <w:t>ID</w:t>
+            </w:r>
+          </w:p>
+        </w:tc>
+        <w:tc>
+          <w:tcPr>
+            <w:tcW w:type="dxa" w:w="2880"/>
+          </w:tcPr>
+          <w:p>
+            <w:r>
+              <w:t>Terminal</w:t>
+            </w:r>
+          </w:p>
+        </w:tc>
+        <w:tc>
+          <w:tcPr>
+            <w:tcW w:type="dxa" w:w="2880"/>
+          </w:tcPr>
+          <w:p>
+            <w:r>
+              <w:t>Name</w:t>
+            </w:r>
+          </w:p>
+        </w:tc>
+      </w:tr>
+      <w:tr>
+        <w:tc>
+          <w:tcPr>
+            <w:tcW w:type="dxa" w:w="2880"/>
+          </w:tcPr>
+          <w:p>
+            <w:r>
+              <w:t>junior-dev</w:t>
+            </w:r>
+          </w:p>
+        </w:tc>
+        <w:tc>
+          <w:tcPr>
+            <w:tcW w:type="dxa" w:w="2880"/>
+          </w:tcPr>
+          <w:p>
+            <w:r>
+              <w:t>T1</w:t>
+            </w:r>
+          </w:p>
+        </w:tc>
+        <w:tc>
+          <w:tcPr>
+            <w:tcW w:type="dxa" w:w="2880"/>
+          </w:tcPr>
+          <w:p>
+            <w:r>
+              <w:t>Junior Developer</w:t>
+            </w:r>
+          </w:p>
+        </w:tc>
+      </w:tr>
+      <w:tr>
+        <w:tc>
+          <w:tcPr>
+            <w:tcW w:type="dxa" w:w="2880"/>
+          </w:tcPr>
+          <w:p>
+            <w:r>
+              <w:t>senior-dev</w:t>
+            </w:r>
+          </w:p>
+        </w:tc>
+        <w:tc>
+          <w:tcPr>
+            <w:tcW w:type="dxa" w:w="2880"/>
+          </w:tcPr>
+          <w:p>
+            <w:r>
+              <w:t>T2</w:t>
+            </w:r>
+          </w:p>
+        </w:tc>
+        <w:tc>
+          <w:tcPr>
+            <w:tcW w:type="dxa" w:w="2880"/>
+          </w:tcPr>
+          <w:p>
+            <w:r>
+              <w:t>Senior Developer</w:t>
+            </w:r>
+          </w:p>
+        </w:tc>
+      </w:tr>
+      <w:tr>
+        <w:tc>
+          <w:tcPr>
+            <w:tcW w:type="dxa" w:w="2880"/>
+          </w:tcPr>
+          <w:p>
+            <w:r>
+              <w:t>qa-engineer</w:t>
+            </w:r>
+          </w:p>
+        </w:tc>
+        <w:tc>
+          <w:tcPr>
+            <w:tcW w:type="dxa" w:w="2880"/>
+          </w:tcPr>
+          <w:p>
+            <w:r>
+              <w:t>T3</w:t>
+            </w:r>
+          </w:p>
+        </w:tc>
+        <w:tc>
+          <w:tcPr>
+            <w:tcW w:type="dxa" w:w="2880"/>
+          </w:tcPr>
+          <w:p>
+            <w:r>
+              <w:t>QA Engineer</w:t>
+            </w:r>
+          </w:p>
+        </w:tc>
+      </w:tr>
+      <w:tr>
+        <w:tc>
+          <w:tcPr>
+            <w:tcW w:type="dxa" w:w="2880"/>
+          </w:tcPr>
+          <w:p>
+            <w:r>
+              <w:t>devops-engineer</w:t>
+            </w:r>
+          </w:p>
+        </w:tc>
+        <w:tc>
+          <w:tcPr>
+            <w:tcW w:type="dxa" w:w="2880"/>
+          </w:tcPr>
+          <w:p>
+            <w:r>
+              <w:t>T4</w:t>
+            </w:r>
+          </w:p>
+        </w:tc>
+        <w:tc>
+          <w:tcPr>
+            <w:tcW w:type="dxa" w:w="2880"/>
+          </w:tcPr>
+          <w:p>
+            <w:r>
+              <w:t>DevOps Engineer</w:t>
+            </w:r>
+          </w:p>
+        </w:tc>
+      </w:tr>
+      <w:tr>
+        <w:tc>
+          <w:tcPr>
+            <w:tcW w:type="dxa" w:w="2880"/>
+          </w:tcPr>
+          <w:p>
+            <w:r>
+              <w:t>project-manager</w:t>
+            </w:r>
+          </w:p>
+        </w:tc>
+        <w:tc>
+          <w:tcPr>
+            <w:tcW w:type="dxa" w:w="2880"/>
+          </w:tcPr>
+          <w:p>
+            <w:r>
+              <w:t>T5</w:t>
+            </w:r>
+          </w:p>
+        </w:tc>
+        <w:tc>
+          <w:tcPr>
+            <w:tcW w:type="dxa" w:w="2880"/>
+          </w:tcPr>
+          <w:p>
+            <w:r>
+              <w:t>Project Manager</w:t>
+            </w:r>
+          </w:p>
+        </w:tc>
+      </w:tr>
+    </w:tbl>
+    <w:p>
+      <w:r>
+        <w:t>Message types (used with /msg):</w:t>
+      </w:r>
+    </w:p>
+    <w:tbl>
+      <w:tblPr>
+        <w:tblStyle w:val="TableGrid"/>
+        <w:tblW w:type="auto" w:w="0"/>
+        <w:tblLook w:firstColumn="1" w:firstRow="1" w:lastColumn="0" w:lastRow="0" w:noHBand="0" w:noVBand="1" w:val="04A0"/>
+      </w:tblPr>
+      <w:tblGrid>
+        <w:gridCol w:w="4320"/>
+        <w:gridCol w:w="4320"/>
+      </w:tblGrid>
+      <w:tr>
+        <w:tc>
+          <w:tcPr>
+            <w:tcW w:type="dxa" w:w="4320"/>
+          </w:tcPr>
+          <w:p>
+            <w:r>
+              <w:t>Type</w:t>
+            </w:r>
+          </w:p>
+        </w:tc>
+        <w:tc>
+          <w:tcPr>
+            <w:tcW w:type="dxa" w:w="4320"/>
+          </w:tcPr>
+          <w:p>
+            <w:r>
+              <w:t>When to Use</w:t>
+            </w:r>
+          </w:p>
+        </w:tc>
+      </w:tr>
+      <w:tr>
+        <w:tc>
+          <w:tcPr>
+            <w:tcW w:type="dxa" w:w="4320"/>
+          </w:tcPr>
+          <w:p>
+            <w:r>
+              <w:t>task</w:t>
+            </w:r>
+          </w:p>
+        </w:tc>
+        <w:tc>
+          <w:tcPr>
+            <w:tcW w:type="dxa" w:w="4320"/>
+          </w:tcPr>
+          <w:p>
+            <w:r>
+              <w:t>Assign a piece of work to another agent</w:t>
+            </w:r>
+          </w:p>
+        </w:tc>
+      </w:tr>
+      <w:tr>
+        <w:tc>
+          <w:tcPr>
+            <w:tcW w:type="dxa" w:w="4320"/>
+          </w:tcPr>
+          <w:p>
+            <w:r>
+              <w:t>review</w:t>
+            </w:r>
+          </w:p>
+        </w:tc>
+        <w:tc>
+          <w:tcPr>
+            <w:tcW w:type="dxa" w:w="4320"/>
+          </w:tcPr>
+          <w:p>
+            <w:r>
+              <w:t>Request or return a code/design review</w:t>
+            </w:r>
+          </w:p>
+        </w:tc>
+      </w:tr>
+      <w:tr>
+        <w:tc>
+          <w:tcPr>
+            <w:tcW w:type="dxa" w:w="4320"/>
+          </w:tcPr>
+          <w:p>
+            <w:r>
+              <w:t>escalation</w:t>
+            </w:r>
+          </w:p>
+        </w:tc>
+        <w:tc>
+          <w:tcPr>
+            <w:tcW w:type="dxa" w:w="4320"/>
+          </w:tcPr>
+          <w:p>
+            <w:r>
+              <w:t>Escalate a blocker you cannot resolve alone</w:t>
+            </w:r>
+          </w:p>
+        </w:tc>
+      </w:tr>
+      <w:tr>
+        <w:tc>
+          <w:tcPr>
+            <w:tcW w:type="dxa" w:w="4320"/>
+          </w:tcPr>
+          <w:p>
+            <w:r>
+              <w:t>bug-report</w:t>
+            </w:r>
+          </w:p>
+        </w:tc>
+        <w:tc>
+          <w:tcPr>
+            <w:tcW w:type="dxa" w:w="4320"/>
+          </w:tcPr>
+          <w:p>
+            <w:r>
+              <w:t>File a bug with repro steps and severity</w:t>
+            </w:r>
+          </w:p>
+        </w:tc>
+      </w:tr>
+      <w:tr>
+        <w:tc>
+          <w:tcPr>
+            <w:tcW w:type="dxa" w:w="4320"/>
+          </w:tcPr>
+          <w:p>
+            <w:r>
+              <w:t>handoff</w:t>
+            </w:r>
+          </w:p>
+        </w:tc>
+        <w:tc>
+          <w:tcPr>
+            <w:tcW w:type="dxa" w:w="4320"/>
+          </w:tcPr>
+          <w:p>
+            <w:r>
+              <w:t>Pass context and in-progress work to another agent</w:t>
+            </w:r>
+          </w:p>
+        </w:tc>
+      </w:tr>
+      <w:tr>
+        <w:tc>
+          <w:tcPr>
+            <w:tcW w:type="dxa" w:w="4320"/>
+          </w:tcPr>
+          <w:p>
+            <w:r>
+              <w:t>summary</w:t>
+            </w:r>
+          </w:p>
+        </w:tc>
+        <w:tc>
+          <w:tcPr>
+            <w:tcW w:type="dxa" w:w="4320"/>
+          </w:tcPr>
+          <w:p>
+            <w:r>
+              <w:t>Share a progress update or completion summary</w:t>
+            </w:r>
+          </w:p>
+        </w:tc>
+      </w:tr>
+    </w:tbl>
+    <w:p/>
+    <w:p>
+      <w:pPr>
+        <w:pStyle w:val="Heading2"/>
+      </w:pPr>
+      <w:r>
+        <w:t>13.9 Inspecting State and Logs</w:t>
+      </w:r>
+    </w:p>
+    <w:tbl>
+      <w:tblPr>
+        <w:tblStyle w:val="TableGrid"/>
+        <w:tblW w:type="auto" w:w="0"/>
+        <w:tblLook w:firstColumn="1" w:firstRow="1" w:lastColumn="0" w:lastRow="0" w:noHBand="0" w:noVBand="1" w:val="04A0"/>
+      </w:tblPr>
+      <w:tblGrid>
+        <w:gridCol w:w="4320"/>
+        <w:gridCol w:w="4320"/>
+      </w:tblGrid>
+      <w:tr>
+        <w:tc>
+          <w:tcPr>
+            <w:tcW w:type="dxa" w:w="4320"/>
+          </w:tcPr>
+          <w:p>
+            <w:r>
+              <w:t>Command</w:t>
+            </w:r>
+          </w:p>
+        </w:tc>
+        <w:tc>
+          <w:tcPr>
+            <w:tcW w:type="dxa" w:w="4320"/>
+          </w:tcPr>
+          <w:p>
+            <w:r>
+              <w:t>What It Shows</w:t>
+            </w:r>
+          </w:p>
+        </w:tc>
+      </w:tr>
+      <w:tr>
+        <w:tc>
+          <w:tcPr>
+            <w:tcW w:type="dxa" w:w="4320"/>
+          </w:tcPr>
+          <w:p>
+            <w:r>
+              <w:t>cat .terminalforge/state.json</w:t>
+            </w:r>
+          </w:p>
+        </w:tc>
+        <w:tc>
+          <w:tcPr>
+            <w:tcW w:type="dxa" w:w="4320"/>
+          </w:tcPr>
+          <w:p>
+            <w:r>
+              <w:t>Active terminal, mode, all 5 task statuses</w:t>
+            </w:r>
+          </w:p>
+        </w:tc>
+      </w:tr>
+      <w:tr>
+        <w:tc>
+          <w:tcPr>
+            <w:tcW w:type="dxa" w:w="4320"/>
+          </w:tcPr>
+          <w:p>
+            <w:r>
+              <w:t>tail -f .terminalforge/messages.log</w:t>
+            </w:r>
+          </w:p>
+        </w:tc>
+        <w:tc>
+          <w:tcPr>
+            <w:tcW w:type="dxa" w:w="4320"/>
+          </w:tcPr>
+          <w:p>
+            <w:r>
+              <w:t>Live feed of all agent-to-agent messages</w:t>
+            </w:r>
+          </w:p>
+        </w:tc>
+      </w:tr>
+      <w:tr>
+        <w:tc>
+          <w:tcPr>
+            <w:tcW w:type="dxa" w:w="4320"/>
+          </w:tcPr>
+          <w:p>
+            <w:r>
+              <w:t>cat .terminalforge/messages.log</w:t>
+            </w:r>
+          </w:p>
+        </w:tc>
+        <w:tc>
+          <w:tcPr>
+            <w:tcW w:type="dxa" w:w="4320"/>
+          </w:tcPr>
+          <w:p>
+            <w:r>
+              <w:t>Full historical message log</w:t>
+            </w:r>
+          </w:p>
+        </w:tc>
+      </w:tr>
+      <w:tr>
+        <w:tc>
+          <w:tcPr>
+            <w:tcW w:type="dxa" w:w="4320"/>
+          </w:tcPr>
+          <w:p>
+            <w:r>
+              <w:t>cat .terminalforge/voice_state.json</w:t>
+            </w:r>
+          </w:p>
+        </w:tc>
+        <w:tc>
+          <w:tcPr>
+            <w:tcW w:type="dxa" w:w="4320"/>
+          </w:tcPr>
+          <w:p>
+            <w:r>
+              <w:t>Voice pipeline status: idle / recording / transcribing</w:t>
+            </w:r>
+          </w:p>
+        </w:tc>
+      </w:tr>
+      <w:tr>
+        <w:tc>
+          <w:tcPr>
+            <w:tcW w:type="dxa" w:w="4320"/>
+          </w:tcPr>
+          <w:p>
+            <w:r>
+              <w:t>cat .terminalforge/voice_input.json</w:t>
+            </w:r>
+          </w:p>
+        </w:tc>
+        <w:tc>
+          <w:tcPr>
+            <w:tcW w:type="dxa" w:w="4320"/>
+          </w:tcPr>
+          <w:p>
+            <w:r>
+              <w:t>Latest transcription received from the pipeline</w:t>
+            </w:r>
+          </w:p>
+        </w:tc>
+      </w:tr>
+      <w:tr>
+        <w:tc>
+          <w:tcPr>
+            <w:tcW w:type="dxa" w:w="4320"/>
+          </w:tcPr>
+          <w:p>
+            <w:r>
+              <w:t>cat .terminalforge/project.md</w:t>
+            </w:r>
+          </w:p>
+        </w:tc>
+        <w:tc>
+          <w:tcPr>
+            <w:tcW w:type="dxa" w:w="4320"/>
+          </w:tcPr>
+          <w:p>
+            <w:r>
+              <w:t>Current project description (set via PM agent)</w:t>
+            </w:r>
+          </w:p>
+        </w:tc>
+      </w:tr>
+      <w:tr>
+        <w:tc>
+          <w:tcPr>
+            <w:tcW w:type="dxa" w:w="4320"/>
+          </w:tcPr>
+          <w:p>
+            <w:r>
+              <w:t>cat .terminalforge/open_tasks.json</w:t>
+            </w:r>
+          </w:p>
+        </w:tc>
+        <w:tc>
+          <w:tcPr>
+            <w:tcW w:type="dxa" w:w="4320"/>
+          </w:tcPr>
+          <w:p>
+            <w:r>
+              <w:t>Open tasks visible to all agents</w:t>
+            </w:r>
+          </w:p>
+        </w:tc>
+      </w:tr>
+      <w:tr>
+        <w:tc>
+          <w:tcPr>
+            <w:tcW w:type="dxa" w:w="4320"/>
+          </w:tcPr>
+          <w:p>
+            <w:r>
+              <w:t>cat .terminalforge/config.json</w:t>
+            </w:r>
+          </w:p>
+        </w:tc>
+        <w:tc>
+          <w:tcPr>
+            <w:tcW w:type="dxa" w:w="4320"/>
+          </w:tcPr>
+          <w:p>
+            <w:r>
+              <w:t>User config: maxSteps, voiceMode, whisperModel</w:t>
+            </w:r>
+          </w:p>
+        </w:tc>
+      </w:tr>
+      <w:tr>
+        <w:tc>
+          <w:tcPr>
+            <w:tcW w:type="dxa" w:w="4320"/>
+          </w:tcPr>
+          <w:p>
+            <w:r>
+              <w:t>curl http://localhost:3333/health</w:t>
+            </w:r>
+          </w:p>
+        </w:tc>
+        <w:tc>
+          <w:tcPr>
+            <w:tcW w:type="dxa" w:w="4320"/>
+          </w:tcPr>
+          <w:p>
+            <w:r>
+              <w:t>Bridge server health check</w:t>
+            </w:r>
+          </w:p>
+        </w:tc>
+      </w:tr>
+      <w:tr>
+        <w:tc>
+          <w:tcPr>
+            <w:tcW w:type="dxa" w:w="4320"/>
+          </w:tcPr>
+          <w:p>
+            <w:r>
+              <w:t>curl http://localhost:3333/state</w:t>
+            </w:r>
+          </w:p>
+        </w:tc>
+        <w:tc>
+          <w:tcPr>
+            <w:tcW w:type="dxa" w:w="4320"/>
+          </w:tcPr>
+          <w:p>
+            <w:r>
+              <w:t>Bridge — live copy of state.json</w:t>
+            </w:r>
+          </w:p>
+        </w:tc>
+      </w:tr>
+    </w:tbl>
+    <w:p/>
+    <w:p>
+      <w:pPr>
+        <w:pStyle w:val="Heading2"/>
+      </w:pPr>
+      <w:r>
+        <w:t>13.10 Testing and Diagnostics</w:t>
+      </w:r>
+    </w:p>
+    <w:tbl>
+      <w:tblPr>
+        <w:tblStyle w:val="TableGrid"/>
+        <w:tblW w:type="auto" w:w="0"/>
+        <w:tblLook w:firstColumn="1" w:firstRow="1" w:lastColumn="0" w:lastRow="0" w:noHBand="0" w:noVBand="1" w:val="04A0"/>
+      </w:tblPr>
+      <w:tblGrid>
+        <w:gridCol w:w="4320"/>
+        <w:gridCol w:w="4320"/>
+      </w:tblGrid>
+      <w:tr>
+        <w:tc>
+          <w:tcPr>
+            <w:tcW w:type="dxa" w:w="4320"/>
+          </w:tcPr>
+          <w:p>
+            <w:r>
+              <w:t>Command</w:t>
+            </w:r>
+          </w:p>
+        </w:tc>
+        <w:tc>
+          <w:tcPr>
+            <w:tcW w:type="dxa" w:w="4320"/>
+          </w:tcPr>
+          <w:p>
+            <w:r>
+              <w:t>What It Does</w:t>
+            </w:r>
+          </w:p>
+        </w:tc>
+      </w:tr>
+      <w:tr>
+        <w:tc>
+          <w:tcPr>
+            <w:tcW w:type="dxa" w:w="4320"/>
+          </w:tcPr>
+          <w:p>
+            <w:r>
+              <w:t>npm run test:switch</w:t>
+            </w:r>
+          </w:p>
+        </w:tc>
+        <w:tc>
+          <w:tcPr>
+            <w:tcW w:type="dxa" w:w="4320"/>
+          </w:tcPr>
+          <w:p>
+            <w:r>
+              <w:t>Phase 1 — navigation + state + debounce (19 tests)</w:t>
+            </w:r>
+          </w:p>
+        </w:tc>
+      </w:tr>
+      <w:tr>
+        <w:tc>
+          <w:tcPr>
+            <w:tcW w:type="dxa" w:w="4320"/>
+          </w:tcPr>
+          <w:p>
+            <w:r>
+              <w:t>npm run test:agents</w:t>
+            </w:r>
+          </w:p>
+        </w:tc>
+        <w:tc>
+          <w:tcPr>
+            <w:tcW w:type="dxa" w:w="4320"/>
+          </w:tcPr>
+          <w:p>
+            <w:r>
+              <w:t>Phase 2 — agent unit tests (47 tests)</w:t>
+            </w:r>
+          </w:p>
+        </w:tc>
+      </w:tr>
+      <w:tr>
+        <w:tc>
+          <w:tcPr>
+            <w:tcW w:type="dxa" w:w="4320"/>
+          </w:tcPr>
+          <w:p>
+            <w:r>
+              <w:t>npm run test:smoke</w:t>
+            </w:r>
+          </w:p>
+        </w:tc>
+        <w:tc>
+          <w:tcPr>
+            <w:tcW w:type="dxa" w:w="4320"/>
+          </w:tcPr>
+          <w:p>
+            <w:r>
+              <w:t>Phase 2 — live Claude API streaming test (requires .env)</w:t>
+            </w:r>
+          </w:p>
+        </w:tc>
+      </w:tr>
+      <w:tr>
+        <w:tc>
+          <w:tcPr>
+            <w:tcW w:type="dxa" w:w="4320"/>
+          </w:tcPr>
+          <w:p>
+            <w:r>
+              <w:t>npm run lint</w:t>
+            </w:r>
+          </w:p>
+        </w:tc>
+        <w:tc>
+          <w:tcPr>
+            <w:tcW w:type="dxa" w:w="4320"/>
+          </w:tcPr>
+          <w:p>
+            <w:r>
+              <w:t>ESLint check on all JS files</w:t>
+            </w:r>
+          </w:p>
+        </w:tc>
+      </w:tr>
+    </w:tbl>
     <w:sectPr>
       <w:pgSz w:w="12240" w:h="15840"/>
       <w:pgMar w:top="1440" w:right="1800" w:bottom="1440" w:left="1800" w:header="720" w:footer="720" w:gutter="0"/>

</xml_diff>

<commit_message>
Updating all the documents and fixing the voice V1
</commit_message>
<xml_diff>
--- a/docs/TerminalForge_ProjectPlan_v4.docx
+++ b/docs/TerminalForge_ProjectPlan_v4.docx
@@ -7826,6 +7826,1764 @@
         </w:tc>
       </w:tr>
     </w:tbl>
+    <w:p>
+      <w:r>
+        <w:br w:type="page"/>
+      </w:r>
+    </w:p>
+    <w:p>
+      <w:pPr>
+        <w:pStyle w:val="Heading2"/>
+      </w:pPr>
+      <w:r>
+        <w:t>12F. Ollama Support &amp; Mixed Provider Mode — Complete (May 2026)</w:t>
+      </w:r>
+    </w:p>
+    <w:p>
+      <w:r>
+        <w:t>TerminalForge now supports Ollama as a fully offline, zero-cost LLM provider alongside Anthropic Claude. Both providers can run simultaneously with different agents routed to each.</w:t>
+      </w:r>
+    </w:p>
+    <w:p>
+      <w:pPr>
+        <w:pStyle w:val="Heading3"/>
+      </w:pPr>
+      <w:r>
+        <w:t>Provider Architecture</w:t>
+      </w:r>
+    </w:p>
+    <w:p>
+      <w:r>
+        <w:t>core/agent-router.js maintains two independent streaming loops:</w:t>
+      </w:r>
+    </w:p>
+    <w:tbl>
+      <w:tblPr>
+        <w:tblStyle w:val="TableGrid"/>
+        <w:tblW w:type="auto" w:w="0"/>
+        <w:tblLook w:firstColumn="1" w:firstRow="1" w:lastColumn="0" w:lastRow="0" w:noHBand="0" w:noVBand="1" w:val="04A0"/>
+      </w:tblPr>
+      <w:tblGrid>
+        <w:gridCol w:w="2880"/>
+        <w:gridCol w:w="2880"/>
+        <w:gridCol w:w="2880"/>
+      </w:tblGrid>
+      <w:tr>
+        <w:tc>
+          <w:tcPr>
+            <w:tcW w:type="dxa" w:w="2880"/>
+          </w:tcPr>
+          <w:p>
+            <w:r>
+              <w:rPr>
+                <w:b/>
+              </w:rPr>
+              <w:t>Loop</w:t>
+            </w:r>
+          </w:p>
+        </w:tc>
+        <w:tc>
+          <w:tcPr>
+            <w:tcW w:type="dxa" w:w="2880"/>
+          </w:tcPr>
+          <w:p>
+            <w:r>
+              <w:rPr>
+                <w:b/>
+              </w:rPr>
+              <w:t>Format</w:t>
+            </w:r>
+          </w:p>
+        </w:tc>
+        <w:tc>
+          <w:tcPr>
+            <w:tcW w:type="dxa" w:w="2880"/>
+          </w:tcPr>
+          <w:p>
+            <w:r>
+              <w:rPr>
+                <w:b/>
+              </w:rPr>
+              <w:t>Client</w:t>
+            </w:r>
+          </w:p>
+        </w:tc>
+      </w:tr>
+      <w:tr>
+        <w:tc>
+          <w:tcPr>
+            <w:tcW w:type="dxa" w:w="2880"/>
+          </w:tcPr>
+          <w:p>
+            <w:r>
+              <w:t>runWithTools_Anthropic</w:t>
+            </w:r>
+          </w:p>
+        </w:tc>
+        <w:tc>
+          <w:tcPr>
+            <w:tcW w:type="dxa" w:w="2880"/>
+          </w:tcPr>
+          <w:p>
+            <w:r>
+              <w:t>Anthropic content blocks (tool_use / tool_result)</w:t>
+            </w:r>
+          </w:p>
+        </w:tc>
+        <w:tc>
+          <w:tcPr>
+            <w:tcW w:type="dxa" w:w="2880"/>
+          </w:tcPr>
+          <w:p>
+            <w:r>
+              <w:t>@anthropic-ai/sdk</w:t>
+            </w:r>
+          </w:p>
+        </w:tc>
+      </w:tr>
+      <w:tr>
+        <w:tc>
+          <w:tcPr>
+            <w:tcW w:type="dxa" w:w="2880"/>
+          </w:tcPr>
+          <w:p>
+            <w:r>
+              <w:t>runWithTools_Ollama</w:t>
+            </w:r>
+          </w:p>
+        </w:tc>
+        <w:tc>
+          <w:tcPr>
+            <w:tcW w:type="dxa" w:w="2880"/>
+          </w:tcPr>
+          <w:p>
+            <w:r>
+              <w:t>OpenAI function calling (tool_calls / tool role)</w:t>
+            </w:r>
+          </w:p>
+        </w:tc>
+        <w:tc>
+          <w:tcPr>
+            <w:tcW w:type="dxa" w:w="2880"/>
+          </w:tcPr>
+          <w:p>
+            <w:r>
+              <w:t>openai npm package (OpenAI-compatible)</w:t>
+            </w:r>
+          </w:p>
+        </w:tc>
+      </w:tr>
+    </w:tbl>
+    <w:p>
+      <w:r>
+        <w:t>Both loops support the same 8 local file/shell tools. The public routePrompt() API is identical regardless of provider.</w:t>
+      </w:r>
+    </w:p>
+    <w:p>
+      <w:pPr>
+        <w:pStyle w:val="Heading3"/>
+      </w:pPr>
+      <w:r>
+        <w:t>Per-Agent Provider Routing</w:t>
+      </w:r>
+    </w:p>
+    <w:p>
+      <w:r>
+        <w:t>Each terminal can use a different provider via environment variables:</w:t>
+      </w:r>
+    </w:p>
+    <w:p>
+      <w:pPr>
+        <w:ind w:left="360"/>
+      </w:pPr>
+      <w:r>
+        <w:rPr>
+          <w:rFonts w:ascii="Courier New" w:hAnsi="Courier New"/>
+          <w:sz w:val="18"/>
+        </w:rPr>
+        <w:t>LLM_PROVIDER=anthropic      # global default</w:t>
+        <w:br/>
+        <w:br/>
+        <w:t>AGENT_1_PROVIDER=ollama     # Junior Dev  → Ollama</w:t>
+        <w:br/>
+        <w:t>AGENT_2_PROVIDER=anthropic  # Senior Dev  → Claude</w:t>
+        <w:br/>
+        <w:t>AGENT_3_PROVIDER=ollama     # QA Engineer → Ollama</w:t>
+        <w:br/>
+        <w:t>AGENT_4_PROVIDER=ollama     # DevOps      → Ollama</w:t>
+        <w:br/>
+        <w:t>AGENT_5_PROVIDER=anthropic  # PM          → Claude</w:t>
+      </w:r>
+    </w:p>
+    <w:p>
+      <w:r>
+        <w:t>getProviderForTerminal(N) reads AGENT_N_PROVIDER, falling back to LLM_PROVIDER.</w:t>
+      </w:r>
+    </w:p>
+    <w:p>
+      <w:pPr>
+        <w:pStyle w:val="Heading3"/>
+      </w:pPr>
+      <w:r>
+        <w:t>API Client Fix</w:t>
+      </w:r>
+    </w:p>
+    <w:p>
+      <w:r>
+        <w:t>Both clients are always initialised at startup regardless of the global provider setting. This fixes a crash in mixed mode where ollamaClient was null when LLM_PROVIDER=anthropic but per-agent overrides required Ollama.</w:t>
+      </w:r>
+    </w:p>
+    <w:p>
+      <w:pPr>
+        <w:pStyle w:val="Heading3"/>
+      </w:pPr>
+      <w:r>
+        <w:t>start.sh Provider Validation</w:t>
+      </w:r>
+    </w:p>
+    <w:p>
+      <w:r>
+        <w:t>scripts/start.sh now:</w:t>
+      </w:r>
+    </w:p>
+    <w:p>
+      <w:pPr>
+        <w:pStyle w:val="ListBullet"/>
+      </w:pPr>
+      <w:r>
+        <w:t>Parses .env into bash environment at startup (so OLLAMA_MODEL is available)</w:t>
+      </w:r>
+    </w:p>
+    <w:p>
+      <w:pPr>
+        <w:pStyle w:val="ListBullet"/>
+      </w:pPr>
+      <w:r>
+        <w:t>Detects all providers needed (global + all AGENT_N_PROVIDER overrides)</w:t>
+      </w:r>
+    </w:p>
+    <w:p>
+      <w:pPr>
+        <w:pStyle w:val="ListBullet"/>
+      </w:pPr>
+      <w:r>
+        <w:t>Validates both Anthropic API key AND Ollama server reachability if either is needed</w:t>
+      </w:r>
+    </w:p>
+    <w:p>
+      <w:pPr>
+        <w:pStyle w:val="ListBullet"/>
+      </w:pPr>
+      <w:r>
+        <w:t>Shows "Mixed (Claude + Ollama/model-name)" banner when running both</w:t>
+      </w:r>
+    </w:p>
+    <w:p>
+      <w:pPr>
+        <w:pStyle w:val="Heading3"/>
+      </w:pPr>
+      <w:r>
+        <w:t>npm Scripts Added</w:t>
+      </w:r>
+    </w:p>
+    <w:tbl>
+      <w:tblPr>
+        <w:tblStyle w:val="TableGrid"/>
+        <w:tblW w:type="auto" w:w="0"/>
+        <w:tblLook w:firstColumn="1" w:firstRow="1" w:lastColumn="0" w:lastRow="0" w:noHBand="0" w:noVBand="1" w:val="04A0"/>
+      </w:tblPr>
+      <w:tblGrid>
+        <w:gridCol w:w="4320"/>
+        <w:gridCol w:w="4320"/>
+      </w:tblGrid>
+      <w:tr>
+        <w:tc>
+          <w:tcPr>
+            <w:tcW w:type="dxa" w:w="4320"/>
+          </w:tcPr>
+          <w:p>
+            <w:r>
+              <w:rPr>
+                <w:b/>
+              </w:rPr>
+              <w:t>Command</w:t>
+            </w:r>
+          </w:p>
+        </w:tc>
+        <w:tc>
+          <w:tcPr>
+            <w:tcW w:type="dxa" w:w="4320"/>
+          </w:tcPr>
+          <w:p>
+            <w:r>
+              <w:rPr>
+                <w:b/>
+              </w:rPr>
+              <w:t>What It Does</w:t>
+            </w:r>
+          </w:p>
+        </w:tc>
+      </w:tr>
+      <w:tr>
+        <w:tc>
+          <w:tcPr>
+            <w:tcW w:type="dxa" w:w="4320"/>
+          </w:tcPr>
+          <w:p>
+            <w:r>
+              <w:t>npm run go:claude</w:t>
+            </w:r>
+          </w:p>
+        </w:tc>
+        <w:tc>
+          <w:tcPr>
+            <w:tcW w:type="dxa" w:w="4320"/>
+          </w:tcPr>
+          <w:p>
+            <w:r>
+              <w:t>Full stack — force all agents to Claude</w:t>
+            </w:r>
+          </w:p>
+        </w:tc>
+      </w:tr>
+      <w:tr>
+        <w:tc>
+          <w:tcPr>
+            <w:tcW w:type="dxa" w:w="4320"/>
+          </w:tcPr>
+          <w:p>
+            <w:r>
+              <w:t>npm run go:ollama</w:t>
+            </w:r>
+          </w:p>
+        </w:tc>
+        <w:tc>
+          <w:tcPr>
+            <w:tcW w:type="dxa" w:w="4320"/>
+          </w:tcPr>
+          <w:p>
+            <w:r>
+              <w:t>Full stack — force all agents to Ollama</w:t>
+            </w:r>
+          </w:p>
+        </w:tc>
+      </w:tr>
+      <w:tr>
+        <w:tc>
+          <w:tcPr>
+            <w:tcW w:type="dxa" w:w="4320"/>
+          </w:tcPr>
+          <w:p>
+            <w:r>
+              <w:t>npm run ui:claude</w:t>
+            </w:r>
+          </w:p>
+        </w:tc>
+        <w:tc>
+          <w:tcPr>
+            <w:tcW w:type="dxa" w:w="4320"/>
+          </w:tcPr>
+          <w:p>
+            <w:r>
+              <w:t>TUI only — force Claude</w:t>
+            </w:r>
+          </w:p>
+        </w:tc>
+      </w:tr>
+      <w:tr>
+        <w:tc>
+          <w:tcPr>
+            <w:tcW w:type="dxa" w:w="4320"/>
+          </w:tcPr>
+          <w:p>
+            <w:r>
+              <w:t>npm run ui:ollama</w:t>
+            </w:r>
+          </w:p>
+        </w:tc>
+        <w:tc>
+          <w:tcPr>
+            <w:tcW w:type="dxa" w:w="4320"/>
+          </w:tcPr>
+          <w:p>
+            <w:r>
+              <w:t>TUI only — force Ollama</w:t>
+            </w:r>
+          </w:p>
+        </w:tc>
+      </w:tr>
+      <w:tr>
+        <w:tc>
+          <w:tcPr>
+            <w:tcW w:type="dxa" w:w="4320"/>
+          </w:tcPr>
+          <w:p>
+            <w:r>
+              <w:t>npm run ui:claude:debug</w:t>
+            </w:r>
+          </w:p>
+        </w:tc>
+        <w:tc>
+          <w:tcPr>
+            <w:tcW w:type="dxa" w:w="4320"/>
+          </w:tcPr>
+          <w:p>
+            <w:r>
+              <w:t>TUI + Claude + verbose logging</w:t>
+            </w:r>
+          </w:p>
+        </w:tc>
+      </w:tr>
+      <w:tr>
+        <w:tc>
+          <w:tcPr>
+            <w:tcW w:type="dxa" w:w="4320"/>
+          </w:tcPr>
+          <w:p>
+            <w:r>
+              <w:t>npm run ui:ollama:debug</w:t>
+            </w:r>
+          </w:p>
+        </w:tc>
+        <w:tc>
+          <w:tcPr>
+            <w:tcW w:type="dxa" w:w="4320"/>
+          </w:tcPr>
+          <w:p>
+            <w:r>
+              <w:t>TUI + Ollama + verbose logging</w:t>
+            </w:r>
+          </w:p>
+        </w:tc>
+      </w:tr>
+    </w:tbl>
+    <w:p>
+      <w:pPr>
+        <w:pStyle w:val="Heading3"/>
+      </w:pPr>
+      <w:r>
+        <w:t>First-Time Ollama Setup</w:t>
+      </w:r>
+    </w:p>
+    <w:p>
+      <w:pPr>
+        <w:ind w:left="360"/>
+      </w:pPr>
+      <w:r>
+        <w:rPr>
+          <w:rFonts w:ascii="Courier New" w:hAnsi="Courier New"/>
+          <w:sz w:val="18"/>
+        </w:rPr>
+        <w:t>brew install ollama</w:t>
+        <w:br/>
+        <w:t>ollama pull qwen2.5-coder:7b   # 8 GB RAM — recommended for code tasks</w:t>
+        <w:br/>
+        <w:t>npm run go:ollama</w:t>
+      </w:r>
+    </w:p>
+    <w:p>
+      <w:pPr>
+        <w:pStyle w:val="Heading3"/>
+      </w:pPr>
+      <w:r>
+        <w:t>Recommended RAM Guide</w:t>
+      </w:r>
+    </w:p>
+    <w:tbl>
+      <w:tblPr>
+        <w:tblStyle w:val="TableGrid"/>
+        <w:tblW w:type="auto" w:w="0"/>
+        <w:tblLook w:firstColumn="1" w:firstRow="1" w:lastColumn="0" w:lastRow="0" w:noHBand="0" w:noVBand="1" w:val="04A0"/>
+      </w:tblPr>
+      <w:tblGrid>
+        <w:gridCol w:w="2880"/>
+        <w:gridCol w:w="2880"/>
+        <w:gridCol w:w="2880"/>
+      </w:tblGrid>
+      <w:tr>
+        <w:tc>
+          <w:tcPr>
+            <w:tcW w:type="dxa" w:w="2880"/>
+          </w:tcPr>
+          <w:p>
+            <w:r>
+              <w:rPr>
+                <w:b/>
+              </w:rPr>
+              <w:t>Model</w:t>
+            </w:r>
+          </w:p>
+        </w:tc>
+        <w:tc>
+          <w:tcPr>
+            <w:tcW w:type="dxa" w:w="2880"/>
+          </w:tcPr>
+          <w:p>
+            <w:r>
+              <w:rPr>
+                <w:b/>
+              </w:rPr>
+              <w:t>RAM</w:t>
+            </w:r>
+          </w:p>
+        </w:tc>
+        <w:tc>
+          <w:tcPr>
+            <w:tcW w:type="dxa" w:w="2880"/>
+          </w:tcPr>
+          <w:p>
+            <w:r>
+              <w:rPr>
+                <w:b/>
+              </w:rPr>
+              <w:t>Best For</w:t>
+            </w:r>
+          </w:p>
+        </w:tc>
+      </w:tr>
+      <w:tr>
+        <w:tc>
+          <w:tcPr>
+            <w:tcW w:type="dxa" w:w="2880"/>
+          </w:tcPr>
+          <w:p>
+            <w:r>
+              <w:t>llama3.2</w:t>
+            </w:r>
+          </w:p>
+        </w:tc>
+        <w:tc>
+          <w:tcPr>
+            <w:tcW w:type="dxa" w:w="2880"/>
+          </w:tcPr>
+          <w:p>
+            <w:r>
+              <w:t>4 GB</w:t>
+            </w:r>
+          </w:p>
+        </w:tc>
+        <w:tc>
+          <w:tcPr>
+            <w:tcW w:type="dxa" w:w="2880"/>
+          </w:tcPr>
+          <w:p>
+            <w:r>
+              <w:t>General tasks, low-resource machines</w:t>
+            </w:r>
+          </w:p>
+        </w:tc>
+      </w:tr>
+      <w:tr>
+        <w:tc>
+          <w:tcPr>
+            <w:tcW w:type="dxa" w:w="2880"/>
+          </w:tcPr>
+          <w:p>
+            <w:r>
+              <w:t>llama3.1:8b</w:t>
+            </w:r>
+          </w:p>
+        </w:tc>
+        <w:tc>
+          <w:tcPr>
+            <w:tcW w:type="dxa" w:w="2880"/>
+          </w:tcPr>
+          <w:p>
+            <w:r>
+              <w:t>8 GB</w:t>
+            </w:r>
+          </w:p>
+        </w:tc>
+        <w:tc>
+          <w:tcPr>
+            <w:tcW w:type="dxa" w:w="2880"/>
+          </w:tcPr>
+          <w:p>
+            <w:r>
+              <w:t>Balanced general purpose</w:t>
+            </w:r>
+          </w:p>
+        </w:tc>
+      </w:tr>
+      <w:tr>
+        <w:tc>
+          <w:tcPr>
+            <w:tcW w:type="dxa" w:w="2880"/>
+          </w:tcPr>
+          <w:p>
+            <w:r>
+              <w:t>qwen2.5-coder:7b</w:t>
+            </w:r>
+          </w:p>
+        </w:tc>
+        <w:tc>
+          <w:tcPr>
+            <w:tcW w:type="dxa" w:w="2880"/>
+          </w:tcPr>
+          <w:p>
+            <w:r>
+              <w:t>8 GB</w:t>
+            </w:r>
+          </w:p>
+        </w:tc>
+        <w:tc>
+          <w:tcPr>
+            <w:tcW w:type="dxa" w:w="2880"/>
+          </w:tcPr>
+          <w:p>
+            <w:r>
+              <w:t>Code generation and review</w:t>
+            </w:r>
+          </w:p>
+        </w:tc>
+      </w:tr>
+      <w:tr>
+        <w:tc>
+          <w:tcPr>
+            <w:tcW w:type="dxa" w:w="2880"/>
+          </w:tcPr>
+          <w:p>
+            <w:r>
+              <w:t>qwen2.5-coder:14b</w:t>
+            </w:r>
+          </w:p>
+        </w:tc>
+        <w:tc>
+          <w:tcPr>
+            <w:tcW w:type="dxa" w:w="2880"/>
+          </w:tcPr>
+          <w:p>
+            <w:r>
+              <w:t>16 GB</w:t>
+            </w:r>
+          </w:p>
+        </w:tc>
+        <w:tc>
+          <w:tcPr>
+            <w:tcW w:type="dxa" w:w="2880"/>
+          </w:tcPr>
+          <w:p>
+            <w:r>
+              <w:t>Strong code model</w:t>
+            </w:r>
+          </w:p>
+        </w:tc>
+      </w:tr>
+      <w:tr>
+        <w:tc>
+          <w:tcPr>
+            <w:tcW w:type="dxa" w:w="2880"/>
+          </w:tcPr>
+          <w:p>
+            <w:r>
+              <w:t>llama3.1:32b</w:t>
+            </w:r>
+          </w:p>
+        </w:tc>
+        <w:tc>
+          <w:tcPr>
+            <w:tcW w:type="dxa" w:w="2880"/>
+          </w:tcPr>
+          <w:p>
+            <w:r>
+              <w:t>32 GB</w:t>
+            </w:r>
+          </w:p>
+        </w:tc>
+        <w:tc>
+          <w:tcPr>
+            <w:tcW w:type="dxa" w:w="2880"/>
+          </w:tcPr>
+          <w:p>
+            <w:r>
+              <w:t>Very capable, near-Claude quality</w:t>
+            </w:r>
+          </w:p>
+        </w:tc>
+      </w:tr>
+    </w:tbl>
+    <w:p>
+      <w:pPr>
+        <w:pStyle w:val="Heading2"/>
+      </w:pPr>
+      <w:r>
+        <w:t>12G. Voice TTS Output — Complete (May 2026)</w:t>
+      </w:r>
+    </w:p>
+    <w:p>
+      <w:r>
+        <w:t>Agent responses are now spoken aloud automatically using macOS say. No setup required.</w:t>
+      </w:r>
+    </w:p>
+    <w:p>
+      <w:pPr>
+        <w:pStyle w:val="Heading3"/>
+      </w:pPr>
+      <w:r>
+        <w:t>Architecture</w:t>
+      </w:r>
+    </w:p>
+    <w:p>
+      <w:pPr>
+        <w:ind w:left="360"/>
+      </w:pPr>
+      <w:r>
+        <w:rPr>
+          <w:rFonts w:ascii="Courier New" w:hAnsi="Courier New"/>
+          <w:sz w:val="18"/>
+        </w:rPr>
+        <w:t>routePrompt() completes → fullResponse returned</w:t>
+        <w:br/>
+        <w:t xml:space="preserve">  → speak(fullResponse) called from ui/App.jsx</w:t>
+        <w:br/>
+        <w:t xml:space="preserve">  → cleanForSpeech() strips markdown/code blocks/URLs</w:t>
+        <w:br/>
+        <w:t xml:space="preserve">  → truncateAtSentence() cuts at first sentence break near 420 chars</w:t>
+        <w:br/>
+        <w:t xml:space="preserve">  → spawn('say', ['-v', voice, '-r', rate, spoken])  ← non-blocking</w:t>
+      </w:r>
+    </w:p>
+    <w:p>
+      <w:pPr>
+        <w:pStyle w:val="Heading3"/>
+      </w:pPr>
+      <w:r>
+        <w:t>Startup Greeting</w:t>
+      </w:r>
+    </w:p>
+    <w:p>
+      <w:r>
+        <w:t>When the TUI launches (scripts/ui.js), FORGE greets the user:</w:t>
+      </w:r>
+    </w:p>
+    <w:p>
+      <w:r>
+        <w:t>"Hello. My name is FORGE. Your AI development team is online and ready."</w:t>
+      </w:r>
+    </w:p>
+    <w:p>
+      <w:pPr>
+        <w:pStyle w:val="Heading3"/>
+      </w:pPr>
+      <w:r>
+        <w:t>Interruption</w:t>
+      </w:r>
+    </w:p>
+    <w:p>
+      <w:r>
+        <w:t>When the user submits a new prompt, stopSpeaking() is called immediately — the current utterance is killed so FORGE never talks over itself.</w:t>
+      </w:r>
+    </w:p>
+    <w:p>
+      <w:pPr>
+        <w:pStyle w:val="Heading3"/>
+      </w:pPr>
+      <w:r>
+        <w:t>Smart Fallback for Code-Only Responses</w:t>
+      </w:r>
+    </w:p>
+    <w:p>
+      <w:r>
+        <w:t>Ollama coding models often respond with a bare code block and no prose. cleanForSpeech() strips the code block leaving empty text. The fallback logic detects this:</w:t>
+      </w:r>
+    </w:p>
+    <w:p>
+      <w:pPr>
+        <w:pStyle w:val="ListBullet"/>
+      </w:pPr>
+      <w:r>
+        <w:t>Response contained ``` → says: "Here is the code. Check the screen for the full output."</w:t>
+      </w:r>
+    </w:p>
+    <w:p>
+      <w:pPr>
+        <w:pStyle w:val="ListBullet"/>
+      </w:pPr>
+      <w:r>
+        <w:t>Response contained ` → says: "Done. Check the screen for the result."</w:t>
+      </w:r>
+    </w:p>
+    <w:p>
+      <w:pPr>
+        <w:pStyle w:val="Heading3"/>
+      </w:pPr>
+      <w:r>
+        <w:t>Tool-Only Response Summary</w:t>
+      </w:r>
+    </w:p>
+    <w:p>
+      <w:r>
+        <w:t>Ollama agents sometimes use tools without producing final text (e.g. write_file then stop). In that case runWithTools_Ollama generates a spoken summary:</w:t>
+      </w:r>
+    </w:p>
+    <w:p>
+      <w:r>
+        <w:t>"Done. I used write_file, run_command to complete the task. Check the screen for the full output."</w:t>
+      </w:r>
+    </w:p>
+    <w:p>
+      <w:r>
+        <w:t>This text is also emitted as a ✓ line in the TUI.</w:t>
+      </w:r>
+    </w:p>
+    <w:p>
+      <w:pPr>
+        <w:pStyle w:val="Heading3"/>
+      </w:pPr>
+      <w:r>
+        <w:t>New File: core/tts.js</w:t>
+      </w:r>
+    </w:p>
+    <w:tbl>
+      <w:tblPr>
+        <w:tblStyle w:val="TableGrid"/>
+        <w:tblW w:type="auto" w:w="0"/>
+        <w:tblLook w:firstColumn="1" w:firstRow="1" w:lastColumn="0" w:lastRow="0" w:noHBand="0" w:noVBand="1" w:val="04A0"/>
+      </w:tblPr>
+      <w:tblGrid>
+        <w:gridCol w:w="4320"/>
+        <w:gridCol w:w="4320"/>
+      </w:tblGrid>
+      <w:tr>
+        <w:tc>
+          <w:tcPr>
+            <w:tcW w:type="dxa" w:w="4320"/>
+          </w:tcPr>
+          <w:p>
+            <w:r>
+              <w:rPr>
+                <w:b/>
+              </w:rPr>
+              <w:t>Export</w:t>
+            </w:r>
+          </w:p>
+        </w:tc>
+        <w:tc>
+          <w:tcPr>
+            <w:tcW w:type="dxa" w:w="4320"/>
+          </w:tcPr>
+          <w:p>
+            <w:r>
+              <w:rPr>
+                <w:b/>
+              </w:rPr>
+              <w:t>Description</w:t>
+            </w:r>
+          </w:p>
+        </w:tc>
+      </w:tr>
+      <w:tr>
+        <w:tc>
+          <w:tcPr>
+            <w:tcW w:type="dxa" w:w="4320"/>
+          </w:tcPr>
+          <w:p>
+            <w:r>
+              <w:t>speak(text, opts?)</w:t>
+            </w:r>
+          </w:p>
+        </w:tc>
+        <w:tc>
+          <w:tcPr>
+            <w:tcW w:type="dxa" w:w="4320"/>
+          </w:tcPr>
+          <w:p>
+            <w:r>
+              <w:t>Speak text aloud — strips markdown, truncates, non-blocking</w:t>
+            </w:r>
+          </w:p>
+        </w:tc>
+      </w:tr>
+      <w:tr>
+        <w:tc>
+          <w:tcPr>
+            <w:tcW w:type="dxa" w:w="4320"/>
+          </w:tcPr>
+          <w:p>
+            <w:r>
+              <w:t>stopSpeaking()</w:t>
+            </w:r>
+          </w:p>
+        </w:tc>
+        <w:tc>
+          <w:tcPr>
+            <w:tcW w:type="dxa" w:w="4320"/>
+          </w:tcPr>
+          <w:p>
+            <w:r>
+              <w:t>Kill current utterance immediately</w:t>
+            </w:r>
+          </w:p>
+        </w:tc>
+      </w:tr>
+      <w:tr>
+        <w:tc>
+          <w:tcPr>
+            <w:tcW w:type="dxa" w:w="4320"/>
+          </w:tcPr>
+          <w:p>
+            <w:r>
+              <w:t>cleanForSpeech(text)</w:t>
+            </w:r>
+          </w:p>
+        </w:tc>
+        <w:tc>
+          <w:tcPr>
+            <w:tcW w:type="dxa" w:w="4320"/>
+          </w:tcPr>
+          <w:p>
+            <w:r>
+              <w:t>Strip markdown/code/URLs, return clean prose</w:t>
+            </w:r>
+          </w:p>
+        </w:tc>
+      </w:tr>
+    </w:tbl>
+    <w:p>
+      <w:r>
+        <w:t>Config via .env:</w:t>
+      </w:r>
+    </w:p>
+    <w:tbl>
+      <w:tblPr>
+        <w:tblStyle w:val="TableGrid"/>
+        <w:tblW w:type="auto" w:w="0"/>
+        <w:tblLook w:firstColumn="1" w:firstRow="1" w:lastColumn="0" w:lastRow="0" w:noHBand="0" w:noVBand="1" w:val="04A0"/>
+      </w:tblPr>
+      <w:tblGrid>
+        <w:gridCol w:w="2880"/>
+        <w:gridCol w:w="2880"/>
+        <w:gridCol w:w="2880"/>
+      </w:tblGrid>
+      <w:tr>
+        <w:tc>
+          <w:tcPr>
+            <w:tcW w:type="dxa" w:w="2880"/>
+          </w:tcPr>
+          <w:p>
+            <w:r>
+              <w:rPr>
+                <w:b/>
+              </w:rPr>
+              <w:t>Variable</w:t>
+            </w:r>
+          </w:p>
+        </w:tc>
+        <w:tc>
+          <w:tcPr>
+            <w:tcW w:type="dxa" w:w="2880"/>
+          </w:tcPr>
+          <w:p>
+            <w:r>
+              <w:rPr>
+                <w:b/>
+              </w:rPr>
+              <w:t>Default</w:t>
+            </w:r>
+          </w:p>
+        </w:tc>
+        <w:tc>
+          <w:tcPr>
+            <w:tcW w:type="dxa" w:w="2880"/>
+          </w:tcPr>
+          <w:p>
+            <w:r>
+              <w:rPr>
+                <w:b/>
+              </w:rPr>
+              <w:t>Description</w:t>
+            </w:r>
+          </w:p>
+        </w:tc>
+      </w:tr>
+      <w:tr>
+        <w:tc>
+          <w:tcPr>
+            <w:tcW w:type="dxa" w:w="2880"/>
+          </w:tcPr>
+          <w:p>
+            <w:r>
+              <w:t>TTS_PROVIDER</w:t>
+            </w:r>
+          </w:p>
+        </w:tc>
+        <w:tc>
+          <w:tcPr>
+            <w:tcW w:type="dxa" w:w="2880"/>
+          </w:tcPr>
+          <w:p>
+            <w:r>
+              <w:t>say</w:t>
+            </w:r>
+          </w:p>
+        </w:tc>
+        <w:tc>
+          <w:tcPr>
+            <w:tcW w:type="dxa" w:w="2880"/>
+          </w:tcPr>
+          <w:p>
+            <w:r>
+              <w:t>"say" (macOS) or "elevenlabs"</w:t>
+            </w:r>
+          </w:p>
+        </w:tc>
+      </w:tr>
+      <w:tr>
+        <w:tc>
+          <w:tcPr>
+            <w:tcW w:type="dxa" w:w="2880"/>
+          </w:tcPr>
+          <w:p>
+            <w:r>
+              <w:t>TTS_VOICE</w:t>
+            </w:r>
+          </w:p>
+        </w:tc>
+        <w:tc>
+          <w:tcPr>
+            <w:tcW w:type="dxa" w:w="2880"/>
+          </w:tcPr>
+          <w:p>
+            <w:r>
+              <w:t>Alex</w:t>
+            </w:r>
+          </w:p>
+        </w:tc>
+        <w:tc>
+          <w:tcPr>
+            <w:tcW w:type="dxa" w:w="2880"/>
+          </w:tcPr>
+          <w:p>
+            <w:r>
+              <w:t>macOS voice name or ElevenLabs voice ID</w:t>
+            </w:r>
+          </w:p>
+        </w:tc>
+      </w:tr>
+      <w:tr>
+        <w:tc>
+          <w:tcPr>
+            <w:tcW w:type="dxa" w:w="2880"/>
+          </w:tcPr>
+          <w:p>
+            <w:r>
+              <w:t>TTS_RATE</w:t>
+            </w:r>
+          </w:p>
+        </w:tc>
+        <w:tc>
+          <w:tcPr>
+            <w:tcW w:type="dxa" w:w="2880"/>
+          </w:tcPr>
+          <w:p>
+            <w:r>
+              <w:t>185</w:t>
+            </w:r>
+          </w:p>
+        </w:tc>
+        <w:tc>
+          <w:tcPr>
+            <w:tcW w:type="dxa" w:w="2880"/>
+          </w:tcPr>
+          <w:p>
+            <w:r>
+              <w:t>Words per minute (say only)</w:t>
+            </w:r>
+          </w:p>
+        </w:tc>
+      </w:tr>
+      <w:tr>
+        <w:tc>
+          <w:tcPr>
+            <w:tcW w:type="dxa" w:w="2880"/>
+          </w:tcPr>
+          <w:p>
+            <w:r>
+              <w:t>TTS_MAX_CHARS</w:t>
+            </w:r>
+          </w:p>
+        </w:tc>
+        <w:tc>
+          <w:tcPr>
+            <w:tcW w:type="dxa" w:w="2880"/>
+          </w:tcPr>
+          <w:p>
+            <w:r>
+              <w:t>420</w:t>
+            </w:r>
+          </w:p>
+        </w:tc>
+        <w:tc>
+          <w:tcPr>
+            <w:tcW w:type="dxa" w:w="2880"/>
+          </w:tcPr>
+          <w:p>
+            <w:r>
+              <w:t>Max chars spoken per response</w:t>
+            </w:r>
+          </w:p>
+        </w:tc>
+      </w:tr>
+    </w:tbl>
+    <w:p>
+      <w:r>
+        <w:t>Also configurable via .terminalforge/config.json.</w:t>
+      </w:r>
+    </w:p>
+    <w:p>
+      <w:pPr>
+        <w:pStyle w:val="Heading3"/>
+      </w:pPr>
+      <w:r>
+        <w:t>Per-Agent Provider Badges in TUI</w:t>
+      </w:r>
+    </w:p>
+    <w:p>
+      <w:r>
+        <w:t>Each AgentPane header now shows a small badge:</w:t>
+      </w:r>
+    </w:p>
+    <w:p>
+      <w:pPr>
+        <w:pStyle w:val="ListBullet"/>
+      </w:pPr>
+      <w:r>
+        <w:t>[C] (magenta) — agent is using Claude</w:t>
+      </w:r>
+    </w:p>
+    <w:p>
+      <w:pPr>
+        <w:pStyle w:val="ListBullet"/>
+      </w:pPr>
+      <w:r>
+        <w:t>[O] (green) — agent is using Ollama</w:t>
+      </w:r>
+    </w:p>
+    <w:p>
+      <w:r>
+        <w:t>The status bar shows the active terminal's provider badge and updates when switching agents.</w:t>
+      </w:r>
+    </w:p>
+    <w:p>
+      <w:pPr>
+        <w:pStyle w:val="Heading2"/>
+      </w:pPr>
+      <w:r>
+        <w:t>12H. Local File &amp; Shell Tools — Complete (May 2026)</w:t>
+      </w:r>
+    </w:p>
+    <w:p>
+      <w:r>
+        <w:t>All 5 agents (both Claude and Ollama) have access to 8 local file system and shell tools via core/tools.js.</w:t>
+      </w:r>
+    </w:p>
+    <w:p>
+      <w:pPr>
+        <w:pStyle w:val="Heading3"/>
+      </w:pPr>
+      <w:r>
+        <w:t>Tools Available</w:t>
+      </w:r>
+    </w:p>
+    <w:tbl>
+      <w:tblPr>
+        <w:tblStyle w:val="TableGrid"/>
+        <w:tblW w:type="auto" w:w="0"/>
+        <w:tblLook w:firstColumn="1" w:firstRow="1" w:lastColumn="0" w:lastRow="0" w:noHBand="0" w:noVBand="1" w:val="04A0"/>
+      </w:tblPr>
+      <w:tblGrid>
+        <w:gridCol w:w="2880"/>
+        <w:gridCol w:w="2880"/>
+        <w:gridCol w:w="2880"/>
+      </w:tblGrid>
+      <w:tr>
+        <w:tc>
+          <w:tcPr>
+            <w:tcW w:type="dxa" w:w="2880"/>
+          </w:tcPr>
+          <w:p>
+            <w:r>
+              <w:rPr>
+                <w:b/>
+              </w:rPr>
+              <w:t>Tool</w:t>
+            </w:r>
+          </w:p>
+        </w:tc>
+        <w:tc>
+          <w:tcPr>
+            <w:tcW w:type="dxa" w:w="2880"/>
+          </w:tcPr>
+          <w:p>
+            <w:r>
+              <w:rPr>
+                <w:b/>
+              </w:rPr>
+              <w:t>Parameters</w:t>
+            </w:r>
+          </w:p>
+        </w:tc>
+        <w:tc>
+          <w:tcPr>
+            <w:tcW w:type="dxa" w:w="2880"/>
+          </w:tcPr>
+          <w:p>
+            <w:r>
+              <w:rPr>
+                <w:b/>
+              </w:rPr>
+              <w:t>Description</w:t>
+            </w:r>
+          </w:p>
+        </w:tc>
+      </w:tr>
+      <w:tr>
+        <w:tc>
+          <w:tcPr>
+            <w:tcW w:type="dxa" w:w="2880"/>
+          </w:tcPr>
+          <w:p>
+            <w:r>
+              <w:t>read_file</w:t>
+            </w:r>
+          </w:p>
+        </w:tc>
+        <w:tc>
+          <w:tcPr>
+            <w:tcW w:type="dxa" w:w="2880"/>
+          </w:tcPr>
+          <w:p>
+            <w:r>
+              <w:t>path</w:t>
+            </w:r>
+          </w:p>
+        </w:tc>
+        <w:tc>
+          <w:tcPr>
+            <w:tcW w:type="dxa" w:w="2880"/>
+          </w:tcPr>
+          <w:p>
+            <w:r>
+              <w:t>Read a local file (max 150,000 bytes)</w:t>
+            </w:r>
+          </w:p>
+        </w:tc>
+      </w:tr>
+      <w:tr>
+        <w:tc>
+          <w:tcPr>
+            <w:tcW w:type="dxa" w:w="2880"/>
+          </w:tcPr>
+          <w:p>
+            <w:r>
+              <w:t>write_file</w:t>
+            </w:r>
+          </w:p>
+        </w:tc>
+        <w:tc>
+          <w:tcPr>
+            <w:tcW w:type="dxa" w:w="2880"/>
+          </w:tcPr>
+          <w:p>
+            <w:r>
+              <w:t>path, content</w:t>
+            </w:r>
+          </w:p>
+        </w:tc>
+        <w:tc>
+          <w:tcPr>
+            <w:tcW w:type="dxa" w:w="2880"/>
+          </w:tcPr>
+          <w:p>
+            <w:r>
+              <w:t>Create or overwrite a file</w:t>
+            </w:r>
+          </w:p>
+        </w:tc>
+      </w:tr>
+      <w:tr>
+        <w:tc>
+          <w:tcPr>
+            <w:tcW w:type="dxa" w:w="2880"/>
+          </w:tcPr>
+          <w:p>
+            <w:r>
+              <w:t>list_directory</w:t>
+            </w:r>
+          </w:p>
+        </w:tc>
+        <w:tc>
+          <w:tcPr>
+            <w:tcW w:type="dxa" w:w="2880"/>
+          </w:tcPr>
+          <w:p>
+            <w:r>
+              <w:t>path, recursive?</w:t>
+            </w:r>
+          </w:p>
+        </w:tc>
+        <w:tc>
+          <w:tcPr>
+            <w:tcW w:type="dxa" w:w="2880"/>
+          </w:tcPr>
+          <w:p>
+            <w:r>
+              <w:t>List files in a directory</w:t>
+            </w:r>
+          </w:p>
+        </w:tc>
+      </w:tr>
+      <w:tr>
+        <w:tc>
+          <w:tcPr>
+            <w:tcW w:type="dxa" w:w="2880"/>
+          </w:tcPr>
+          <w:p>
+            <w:r>
+              <w:t>run_command</w:t>
+            </w:r>
+          </w:p>
+        </w:tc>
+        <w:tc>
+          <w:tcPr>
+            <w:tcW w:type="dxa" w:w="2880"/>
+          </w:tcPr>
+          <w:p>
+            <w:r>
+              <w:t>command, cwd?</w:t>
+            </w:r>
+          </w:p>
+        </w:tc>
+        <w:tc>
+          <w:tcPr>
+            <w:tcW w:type="dxa" w:w="2880"/>
+          </w:tcPr>
+          <w:p>
+            <w:r>
+              <w:t>Run a shell command (30s timeout, 30,000 char output cap)</w:t>
+            </w:r>
+          </w:p>
+        </w:tc>
+      </w:tr>
+      <w:tr>
+        <w:tc>
+          <w:tcPr>
+            <w:tcW w:type="dxa" w:w="2880"/>
+          </w:tcPr>
+          <w:p>
+            <w:r>
+              <w:t>search_files</w:t>
+            </w:r>
+          </w:p>
+        </w:tc>
+        <w:tc>
+          <w:tcPr>
+            <w:tcW w:type="dxa" w:w="2880"/>
+          </w:tcPr>
+          <w:p>
+            <w:r>
+              <w:t>pattern, directory?, type?</w:t>
+            </w:r>
+          </w:p>
+        </w:tc>
+        <w:tc>
+          <w:tcPr>
+            <w:tcW w:type="dxa" w:w="2880"/>
+          </w:tcPr>
+          <w:p>
+            <w:r>
+              <w:t>Search by filename glob or content string</w:t>
+            </w:r>
+          </w:p>
+        </w:tc>
+      </w:tr>
+      <w:tr>
+        <w:tc>
+          <w:tcPr>
+            <w:tcW w:type="dxa" w:w="2880"/>
+          </w:tcPr>
+          <w:p>
+            <w:r>
+              <w:t>delete_file</w:t>
+            </w:r>
+          </w:p>
+        </w:tc>
+        <w:tc>
+          <w:tcPr>
+            <w:tcW w:type="dxa" w:w="2880"/>
+          </w:tcPr>
+          <w:p>
+            <w:r>
+              <w:t>path</w:t>
+            </w:r>
+          </w:p>
+        </w:tc>
+        <w:tc>
+          <w:tcPr>
+            <w:tcW w:type="dxa" w:w="2880"/>
+          </w:tcPr>
+          <w:p>
+            <w:r>
+              <w:t>Delete a file</w:t>
+            </w:r>
+          </w:p>
+        </w:tc>
+      </w:tr>
+      <w:tr>
+        <w:tc>
+          <w:tcPr>
+            <w:tcW w:type="dxa" w:w="2880"/>
+          </w:tcPr>
+          <w:p>
+            <w:r>
+              <w:t>create_directory</w:t>
+            </w:r>
+          </w:p>
+        </w:tc>
+        <w:tc>
+          <w:tcPr>
+            <w:tcW w:type="dxa" w:w="2880"/>
+          </w:tcPr>
+          <w:p>
+            <w:r>
+              <w:t>path</w:t>
+            </w:r>
+          </w:p>
+        </w:tc>
+        <w:tc>
+          <w:tcPr>
+            <w:tcW w:type="dxa" w:w="2880"/>
+          </w:tcPr>
+          <w:p>
+            <w:r>
+              <w:t>Create directory with parents</w:t>
+            </w:r>
+          </w:p>
+        </w:tc>
+      </w:tr>
+      <w:tr>
+        <w:tc>
+          <w:tcPr>
+            <w:tcW w:type="dxa" w:w="2880"/>
+          </w:tcPr>
+          <w:p>
+            <w:r>
+              <w:t>move_file</w:t>
+            </w:r>
+          </w:p>
+        </w:tc>
+        <w:tc>
+          <w:tcPr>
+            <w:tcW w:type="dxa" w:w="2880"/>
+          </w:tcPr>
+          <w:p>
+            <w:r>
+              <w:t>source, destination</w:t>
+            </w:r>
+          </w:p>
+        </w:tc>
+        <w:tc>
+          <w:tcPr>
+            <w:tcW w:type="dxa" w:w="2880"/>
+          </w:tcPr>
+          <w:p>
+            <w:r>
+              <w:t>Move or rename a file</w:t>
+            </w:r>
+          </w:p>
+        </w:tc>
+      </w:tr>
+    </w:tbl>
+    <w:p>
+      <w:pPr>
+        <w:pStyle w:val="Heading3"/>
+      </w:pPr>
+      <w:r>
+        <w:t>Safety</w:t>
+      </w:r>
+    </w:p>
+    <w:p>
+      <w:pPr>
+        <w:pStyle w:val="ListBullet"/>
+      </w:pPr>
+      <w:r>
+        <w:t>All paths are resolved relative to the project root</w:t>
+      </w:r>
+    </w:p>
+    <w:p>
+      <w:pPr>
+        <w:pStyle w:val="ListBullet"/>
+      </w:pPr>
+      <w:r>
+        <w:t>SKIP_DIRS automatically excludes: node_modules, .git, __pycache__, .next, dist, build, .cache, coverage, .venv</w:t>
+      </w:r>
+    </w:p>
+    <w:p>
+      <w:pPr>
+        <w:pStyle w:val="ListBullet"/>
+      </w:pPr>
+      <w:r>
+        <w:t>Command output capped at 30,000 characters</w:t>
+      </w:r>
+    </w:p>
+    <w:p>
+      <w:pPr>
+        <w:pStyle w:val="ListBullet"/>
+      </w:pPr>
+      <w:r>
+        <w:t>File reads capped at 150,000 bytes</w:t>
+      </w:r>
+    </w:p>
+    <w:p>
+      <w:pPr>
+        <w:pStyle w:val="ListBullet"/>
+      </w:pPr>
+      <w:r>
+        <w:t>Commands have a 30-second timeout</w:t>
+      </w:r>
+    </w:p>
+    <w:p>
+      <w:pPr>
+        <w:pStyle w:val="Heading3"/>
+      </w:pPr>
+      <w:r>
+        <w:t>Tool Format Conversion</w:t>
+      </w:r>
+    </w:p>
+    <w:p>
+      <w:r>
+        <w:t>Anthropic and Ollama use different tool schemas. core/agent-router.js converts at startup:</w:t>
+      </w:r>
+    </w:p>
+    <w:p>
+      <w:pPr>
+        <w:ind w:left="360"/>
+      </w:pPr>
+      <w:r>
+        <w:rPr>
+          <w:rFonts w:ascii="Courier New" w:hAnsi="Courier New"/>
+          <w:sz w:val="18"/>
+        </w:rPr>
+        <w:t>// Anthropic format (TOOL_DEFINITIONS) — used as-is:</w:t>
+        <w:br/>
+        <w:t>{ name, description, input_schema: { type, properties, required } }</w:t>
+        <w:br/>
+        <w:br/>
+        <w:t>// Ollama format (OLLAMA_TOOLS) — converted via toOllamaTools():</w:t>
+        <w:br/>
+        <w:t>{ type: 'function', function: { name, description, parameters } }</w:t>
+      </w:r>
+    </w:p>
+    <w:p>
+      <w:pPr>
+        <w:pStyle w:val="Heading2"/>
+      </w:pPr>
+      <w:r>
+        <w:t>13.11 Provider Switching Commands (Added May 2026)</w:t>
+      </w:r>
+    </w:p>
+    <w:p>
+      <w:pPr>
+        <w:pStyle w:val="Heading3"/>
+      </w:pPr>
+      <w:r>
+        <w:t>Switch All Agents</w:t>
+      </w:r>
+    </w:p>
+    <w:tbl>
+      <w:tblPr>
+        <w:tblStyle w:val="TableGrid"/>
+        <w:tblW w:type="auto" w:w="0"/>
+        <w:tblLook w:firstColumn="1" w:firstRow="1" w:lastColumn="0" w:lastRow="0" w:noHBand="0" w:noVBand="1" w:val="04A0"/>
+      </w:tblPr>
+      <w:tblGrid>
+        <w:gridCol w:w="4320"/>
+        <w:gridCol w:w="4320"/>
+      </w:tblGrid>
+      <w:tr>
+        <w:tc>
+          <w:tcPr>
+            <w:tcW w:type="dxa" w:w="4320"/>
+          </w:tcPr>
+          <w:p>
+            <w:r>
+              <w:rPr>
+                <w:b/>
+              </w:rPr>
+              <w:t>Command</w:t>
+            </w:r>
+          </w:p>
+        </w:tc>
+        <w:tc>
+          <w:tcPr>
+            <w:tcW w:type="dxa" w:w="4320"/>
+          </w:tcPr>
+          <w:p>
+            <w:r>
+              <w:rPr>
+                <w:b/>
+              </w:rPr>
+              <w:t>Effect</w:t>
+            </w:r>
+          </w:p>
+        </w:tc>
+      </w:tr>
+      <w:tr>
+        <w:tc>
+          <w:tcPr>
+            <w:tcW w:type="dxa" w:w="4320"/>
+          </w:tcPr>
+          <w:p>
+            <w:r>
+              <w:t>npm run go:claude</w:t>
+            </w:r>
+          </w:p>
+        </w:tc>
+        <w:tc>
+          <w:tcPr>
+            <w:tcW w:type="dxa" w:w="4320"/>
+          </w:tcPr>
+          <w:p>
+            <w:r>
+              <w:t>All 5 agents → Claude (Anthropic)</w:t>
+            </w:r>
+          </w:p>
+        </w:tc>
+      </w:tr>
+      <w:tr>
+        <w:tc>
+          <w:tcPr>
+            <w:tcW w:type="dxa" w:w="4320"/>
+          </w:tcPr>
+          <w:p>
+            <w:r>
+              <w:t>npm run go:ollama</w:t>
+            </w:r>
+          </w:p>
+        </w:tc>
+        <w:tc>
+          <w:tcPr>
+            <w:tcW w:type="dxa" w:w="4320"/>
+          </w:tcPr>
+          <w:p>
+            <w:r>
+              <w:t>All 5 agents → Ollama (local, offline)</w:t>
+            </w:r>
+          </w:p>
+        </w:tc>
+      </w:tr>
+      <w:tr>
+        <w:tc>
+          <w:tcPr>
+            <w:tcW w:type="dxa" w:w="4320"/>
+          </w:tcPr>
+          <w:p>
+            <w:r>
+              <w:t>npm run ui:claude</w:t>
+            </w:r>
+          </w:p>
+        </w:tc>
+        <w:tc>
+          <w:tcPr>
+            <w:tcW w:type="dxa" w:w="4320"/>
+          </w:tcPr>
+          <w:p>
+            <w:r>
+              <w:t>TUI only → Claude</w:t>
+            </w:r>
+          </w:p>
+        </w:tc>
+      </w:tr>
+      <w:tr>
+        <w:tc>
+          <w:tcPr>
+            <w:tcW w:type="dxa" w:w="4320"/>
+          </w:tcPr>
+          <w:p>
+            <w:r>
+              <w:t>npm run ui:ollama</w:t>
+            </w:r>
+          </w:p>
+        </w:tc>
+        <w:tc>
+          <w:tcPr>
+            <w:tcW w:type="dxa" w:w="4320"/>
+          </w:tcPr>
+          <w:p>
+            <w:r>
+              <w:t>TUI only → Ollama</w:t>
+            </w:r>
+          </w:p>
+        </w:tc>
+      </w:tr>
+    </w:tbl>
+    <w:p>
+      <w:pPr>
+        <w:pStyle w:val="Heading3"/>
+      </w:pPr>
+      <w:r>
+        <w:t>Mixed Mode (Claude + Ollama Simultaneously)</w:t>
+      </w:r>
+    </w:p>
+    <w:p>
+      <w:r>
+        <w:t>Edit .env and uncomment per-agent overrides:</w:t>
+      </w:r>
+    </w:p>
+    <w:p>
+      <w:pPr>
+        <w:ind w:left="360"/>
+      </w:pPr>
+      <w:r>
+        <w:rPr>
+          <w:rFonts w:ascii="Courier New" w:hAnsi="Courier New"/>
+          <w:sz w:val="18"/>
+        </w:rPr>
+        <w:t>AGENT_1_PROVIDER=ollama      # Junior Dev</w:t>
+        <w:br/>
+        <w:t>AGENT_2_PROVIDER=anthropic   # Senior Dev</w:t>
+        <w:br/>
+        <w:t>AGENT_3_PROVIDER=ollama      # QA Engineer</w:t>
+        <w:br/>
+        <w:t>AGENT_4_PROVIDER=ollama      # DevOps</w:t>
+        <w:br/>
+        <w:t>AGENT_5_PROVIDER=anthropic   # Project Manager</w:t>
+      </w:r>
+    </w:p>
+    <w:p>
+      <w:r>
+        <w:t>Then run: npm run go</w:t>
+      </w:r>
+    </w:p>
+    <w:p>
+      <w:r>
+        <w:t>Each pane shows [C] (Claude) or [O] (Ollama) badge. The startup script validates both providers automatically.</w:t>
+      </w:r>
+    </w:p>
+    <w:p>
+      <w:pPr>
+        <w:pStyle w:val="Heading3"/>
+      </w:pPr>
+      <w:r>
+        <w:t>Ollama First-Time Setup</w:t>
+      </w:r>
+    </w:p>
+    <w:p>
+      <w:pPr>
+        <w:ind w:left="360"/>
+      </w:pPr>
+      <w:r>
+        <w:rPr>
+          <w:rFonts w:ascii="Courier New" w:hAnsi="Courier New"/>
+          <w:sz w:val="18"/>
+        </w:rPr>
+        <w:t>brew install ollama</w:t>
+        <w:br/>
+        <w:t>ollama pull qwen2.5-coder:7b   # recommended model</w:t>
+        <w:br/>
+        <w:t>npm run go:ollama</w:t>
+      </w:r>
+    </w:p>
     <w:sectPr>
       <w:pgSz w:w="12240" w:h="15840"/>
       <w:pgMar w:top="1440" w:right="1800" w:bottom="1440" w:left="1800" w:header="720" w:footer="720" w:gutter="0"/>

</xml_diff>